<commit_message>
🚀 Deploy prod build - 1.0.26 (Phase 1)
</commit_message>
<xml_diff>
--- a/public/templates/ΑΡΧΙΚΗ ΣΥΜΒΑΣΗ ΕΡΓΑΖΟΜΕΝΩΝ.docx
+++ b/public/templates/ΑΡΧΙΚΗ ΣΥΜΒΑΣΗ ΕΡΓΑΖΟΜΕΝΩΝ.docx
@@ -2990,7 +2990,38 @@
           <w:sz w:val="18"/>
           <w:szCs w:val="18"/>
         </w:rPr>
-        <w:t>} στα οπουδήποτε στην χώρα ευρισκόμενα υποκαταστήματά ή άλλους τόπους δραστηριότητας της, χωρίς επιπλέον αμοιβή-αποζημίωση τ{_GENIKH_A} {_</w:t>
+        <w:t xml:space="preserve">} στα οπουδήποτε στην χώρα ευρισκόμενα υποκαταστήματά ή άλλους τόπους δραστηριότητας της </w:t>
+      </w:r>
+      <w:r>
+        <w:rPr>
+          <w:rFonts w:eastAsia="Calibri" w:cs="DejaVu Sans Condensed" w:ascii="DejaVu Sans Condensed" w:hAnsi="DejaVu Sans Condensed" w:eastAsiaTheme="minorHAnsi"/>
+          <w:color w:val="auto"/>
+          <w:kern w:val="0"/>
+          <w:sz w:val="18"/>
+          <w:szCs w:val="18"/>
+          <w:lang w:val="el-GR" w:eastAsia="en-US" w:bidi="ar-SA"/>
+        </w:rPr>
+        <w:t>ή</w:t>
+      </w:r>
+      <w:r>
+        <w:rPr>
+          <w:rFonts w:eastAsia="Calibri" w:cs="DejaVu Sans Condensed" w:ascii="DejaVu Sans Condensed" w:hAnsi="DejaVu Sans Condensed" w:eastAsiaTheme="minorHAnsi"/>
+          <w:color w:val="000000"/>
+          <w:kern w:val="0"/>
+          <w:sz w:val="18"/>
+          <w:szCs w:val="18"/>
+          <w:shd w:fill="FFFF00" w:val="clear"/>
+          <w:lang w:val="el-GR" w:eastAsia="en-US" w:bidi="ar-SA"/>
+        </w:rPr>
+        <w:t xml:space="preserve"> συμφερόντων της</w:t>
+      </w:r>
+      <w:r>
+        <w:rPr>
+          <w:rFonts w:cs="DejaVu Sans Condensed" w:ascii="DejaVu Sans Condensed" w:hAnsi="DejaVu Sans Condensed"/>
+          <w:sz w:val="18"/>
+          <w:szCs w:val="18"/>
+        </w:rPr>
+        <w:t>, χωρίς επιπλέον αμοιβή-αποζημίωση τ{_GENIKH_A} {_</w:t>
       </w:r>
       <w:r>
         <w:rPr>
@@ -3274,7 +3305,39 @@
           <w:sz w:val="18"/>
           <w:szCs w:val="18"/>
         </w:rPr>
-        <w:t>}, τα υποκαταστήματα, ή άλλους τόπους δραστηριότητας {_</w:t>
+        <w:t xml:space="preserve">}, τα υποκαταστήματα, ή άλλους τόπους δραστηριότητας </w:t>
+      </w:r>
+      <w:r>
+        <w:rPr>
+          <w:rFonts w:eastAsia="Calibri" w:cs="DejaVu Sans Condensed" w:ascii="DejaVu Sans Condensed" w:hAnsi="DejaVu Sans Condensed" w:eastAsiaTheme="minorHAnsi"/>
+          <w:color w:val="000000"/>
+          <w:kern w:val="0"/>
+          <w:sz w:val="18"/>
+          <w:szCs w:val="18"/>
+          <w:shd w:fill="FFFF00" w:val="clear"/>
+          <w:lang w:val="el-GR" w:eastAsia="en-US" w:bidi="ar-SA"/>
+        </w:rPr>
+        <w:t xml:space="preserve">ή </w:t>
+      </w:r>
+      <w:r>
+        <w:rPr>
+          <w:rFonts w:eastAsia="Calibri" w:cs="DejaVu Sans Condensed" w:ascii="DejaVu Sans Condensed" w:hAnsi="DejaVu Sans Condensed" w:eastAsiaTheme="minorHAnsi"/>
+          <w:color w:val="000000"/>
+          <w:kern w:val="0"/>
+          <w:sz w:val="18"/>
+          <w:szCs w:val="18"/>
+          <w:shd w:fill="FFFF00" w:val="clear"/>
+          <w:lang w:val="el-GR" w:eastAsia="en-US" w:bidi="ar-SA"/>
+        </w:rPr>
+        <w:t>συμφερόντων</w:t>
+      </w:r>
+      <w:r>
+        <w:rPr>
+          <w:rFonts w:cs="DejaVu Sans Condensed" w:ascii="DejaVu Sans Condensed" w:hAnsi="DejaVu Sans Condensed"/>
+          <w:sz w:val="18"/>
+          <w:szCs w:val="18"/>
+        </w:rPr>
+        <w:t xml:space="preserve"> {_</w:t>
       </w:r>
       <w:r>
         <w:rPr>
@@ -4092,7 +4155,34 @@
           <w:sz w:val="18"/>
           <w:szCs w:val="18"/>
         </w:rPr>
-        <w:t>} και η οικογενειακή τ{_GENIKH_A} κατάσταση.</w:t>
+        <w:t xml:space="preserve">} και η οικογενειακή τ{_GENIKH_A} κατάσταση </w:t>
+      </w:r>
+      <w:r>
+        <w:rPr>
+          <w:rFonts w:cs="DejaVu Sans Condensed" w:ascii="DejaVu Sans Condensed" w:hAnsi="DejaVu Sans Condensed"/>
+          <w:sz w:val="18"/>
+          <w:szCs w:val="18"/>
+        </w:rPr>
+        <w:t>και εκπα</w:t>
+      </w:r>
+      <w:r>
+        <w:rPr>
+          <w:rFonts w:eastAsia="Calibri" w:cs="DejaVu Sans Condensed" w:ascii="DejaVu Sans Condensed" w:hAnsi="DejaVu Sans Condensed" w:eastAsiaTheme="minorHAnsi"/>
+          <w:color w:val="auto"/>
+          <w:kern w:val="0"/>
+          <w:sz w:val="18"/>
+          <w:szCs w:val="18"/>
+          <w:lang w:val="el-GR" w:eastAsia="en-US" w:bidi="ar-SA"/>
+        </w:rPr>
+        <w:t>ίδευση</w:t>
+      </w:r>
+      <w:r>
+        <w:rPr>
+          <w:rFonts w:cs="DejaVu Sans Condensed" w:ascii="DejaVu Sans Condensed" w:hAnsi="DejaVu Sans Condensed"/>
+          <w:sz w:val="18"/>
+          <w:szCs w:val="18"/>
+        </w:rPr>
+        <w:t>.</w:t>
       </w:r>
     </w:p>
     <w:p>
@@ -4423,7 +4513,7 @@
           <w:sz w:val="18"/>
           <w:szCs w:val="18"/>
         </w:rPr>
-        <w:t xml:space="preserve">άρθρο 184 ΠΔ 802022 </w:t>
+        <w:t xml:space="preserve">άρθρο 184 ΠΔ 80/2022 </w:t>
       </w:r>
       <w:bookmarkEnd w:id="4"/>
       <w:r>
@@ -4464,7 +4554,7 @@
         </w:rPr>
         <w:t xml:space="preserve"> </w:t>
         <w:tab/>
-        <w:t>Η υπερωριακή απασχόληση λαμβάνουν χώρα ανάλογα με τις ανάγκες της επιχείρησης και αμείβονται κατά τα οριζόμενα στο άρθρο 74, του Ν.3863/2010 και άρθρο 184 ΠΔ 802022.</w:t>
+        <w:t>Η υπερωριακή απασχόληση λαμβάνουν χώρα ανάλογα με τις ανάγκες της επιχείρησης και αμείβονται κατά τα οριζόμενα στο άρθρο 74, του Ν.3863/2010 και άρθρο 184 ΠΔ 80/2022.</w:t>
       </w:r>
     </w:p>
     <w:p>
@@ -4629,7 +4719,61 @@
           <w:sz w:val="18"/>
           <w:szCs w:val="18"/>
         </w:rPr>
-        <w:t>} θα καταβάλλονται την τελευταία ημέρα εκάστου ημερολογιακού μηνός. Σε περίπτωση που αυτή η ημέρα είναι αργία, οι μηνιαίες αποδοχές θα καταβάλλονται την αμέσως επόμενη εργάσιμη ημέρα.</w:t>
+        <w:t xml:space="preserve">} θα καταβάλλονται </w:t>
+      </w:r>
+      <w:r>
+        <w:rPr>
+          <w:rFonts w:cs="DejaVu Sans Condensed" w:ascii="DejaVu Sans Condensed" w:hAnsi="DejaVu Sans Condensed"/>
+          <w:sz w:val="18"/>
+          <w:szCs w:val="18"/>
+        </w:rPr>
+        <w:t>εντ</w:t>
+      </w:r>
+      <w:r>
+        <w:rPr>
+          <w:rFonts w:eastAsia="Calibri" w:cs="DejaVu Sans Condensed" w:ascii="DejaVu Sans Condensed" w:hAnsi="DejaVu Sans Condensed" w:eastAsiaTheme="minorHAnsi"/>
+          <w:color w:val="auto"/>
+          <w:kern w:val="0"/>
+          <w:sz w:val="18"/>
+          <w:szCs w:val="18"/>
+          <w:lang w:val="el-GR" w:eastAsia="en-US" w:bidi="ar-SA"/>
+        </w:rPr>
+        <w:t>ός 20ημέρου</w:t>
+      </w:r>
+      <w:r>
+        <w:rPr>
+          <w:rFonts w:cs="DejaVu Sans Condensed" w:ascii="DejaVu Sans Condensed" w:hAnsi="DejaVu Sans Condensed"/>
+          <w:sz w:val="18"/>
+          <w:szCs w:val="18"/>
+        </w:rPr>
+        <w:t xml:space="preserve"> </w:t>
+      </w:r>
+      <w:r>
+        <w:rPr>
+          <w:rFonts w:cs="DejaVu Sans Condensed" w:ascii="DejaVu Sans Condensed" w:hAnsi="DejaVu Sans Condensed"/>
+          <w:sz w:val="18"/>
+          <w:szCs w:val="18"/>
+        </w:rPr>
+        <w:t>απ</w:t>
+      </w:r>
+      <w:r>
+        <w:rPr>
+          <w:rFonts w:eastAsia="Calibri" w:cs="DejaVu Sans Condensed" w:ascii="DejaVu Sans Condensed" w:hAnsi="DejaVu Sans Condensed" w:eastAsiaTheme="minorHAnsi"/>
+          <w:color w:val="auto"/>
+          <w:kern w:val="0"/>
+          <w:sz w:val="18"/>
+          <w:szCs w:val="18"/>
+          <w:lang w:val="el-GR" w:eastAsia="en-US" w:bidi="ar-SA"/>
+        </w:rPr>
+        <w:t xml:space="preserve">ό το πέρας </w:t>
+      </w:r>
+      <w:r>
+        <w:rPr>
+          <w:rFonts w:cs="DejaVu Sans Condensed" w:ascii="DejaVu Sans Condensed" w:hAnsi="DejaVu Sans Condensed"/>
+          <w:sz w:val="18"/>
+          <w:szCs w:val="18"/>
+        </w:rPr>
+        <w:t>εκάστου ημερολογιακού μηνός. Σε περίπτωση που αυτή η ημέρα είναι αργία, οι μηνιαίες αποδοχές θα καταβάλλονται την αμέσως επόμενη εργάσιμη ημέρα.</w:t>
       </w:r>
     </w:p>
     <w:p>
@@ -5418,7 +5562,17 @@
           <w:sz w:val="18"/>
           <w:szCs w:val="18"/>
         </w:rPr>
-        <w:t>ii</w:t>
+        <w:t>i</w:t>
+      </w:r>
+      <w:r>
+        <w:rPr>
+          <w:rFonts w:cs="DejaVu Sans Condensed" w:ascii="DejaVu Sans Condensed" w:hAnsi="DejaVu Sans Condensed"/>
+          <w:b/>
+          <w:bCs/>
+          <w:sz w:val="18"/>
+          <w:szCs w:val="18"/>
+        </w:rPr>
+        <w:t>v</w:t>
       </w:r>
       <w:r>
         <w:rPr>
@@ -5450,7 +5604,7 @@
           <w:sz w:val="18"/>
           <w:szCs w:val="18"/>
         </w:rPr>
-        <w:t>iii</w:t>
+        <w:t>v</w:t>
       </w:r>
       <w:r>
         <w:rPr>
@@ -7305,7 +7459,39 @@
           <w:sz w:val="18"/>
           <w:szCs w:val="18"/>
         </w:rPr>
-        <w:t>} καθορίζεται σύμφωνα με τα παραπάνω 9.1. – 9.4 ή η αυξημένη αποζημίωση βάσει ΣΣΕ, Κανονισμού Εργασίας, ατομικής σύμβασης εργασίας.</w:t>
+        <w:t xml:space="preserve">} καθορίζεται σύμφωνα με τα παραπάνω </w:t>
+      </w:r>
+      <w:r>
+        <w:rPr>
+          <w:rFonts w:cs="DejaVu Sans Condensed" w:ascii="DejaVu Sans Condensed" w:hAnsi="DejaVu Sans Condensed"/>
+          <w:sz w:val="18"/>
+          <w:szCs w:val="18"/>
+        </w:rPr>
+        <w:t>8</w:t>
+      </w:r>
+      <w:r>
+        <w:rPr>
+          <w:rFonts w:cs="DejaVu Sans Condensed" w:ascii="DejaVu Sans Condensed" w:hAnsi="DejaVu Sans Condensed"/>
+          <w:sz w:val="18"/>
+          <w:szCs w:val="18"/>
+        </w:rPr>
+        <w:t xml:space="preserve">.1. – </w:t>
+      </w:r>
+      <w:r>
+        <w:rPr>
+          <w:rFonts w:cs="DejaVu Sans Condensed" w:ascii="DejaVu Sans Condensed" w:hAnsi="DejaVu Sans Condensed"/>
+          <w:sz w:val="18"/>
+          <w:szCs w:val="18"/>
+        </w:rPr>
+        <w:t>8</w:t>
+      </w:r>
+      <w:r>
+        <w:rPr>
+          <w:rFonts w:cs="DejaVu Sans Condensed" w:ascii="DejaVu Sans Condensed" w:hAnsi="DejaVu Sans Condensed"/>
+          <w:sz w:val="18"/>
+          <w:szCs w:val="18"/>
+        </w:rPr>
+        <w:t>.4 ή η αυξημένη αποζημίωση βάσει ΣΣΕ, Κανονισμού Εργασίας, ατομικής σύμβασης εργασίας.</w:t>
       </w:r>
     </w:p>
     <w:p>
@@ -11158,7 +11344,27 @@
           <w:sz w:val="18"/>
           <w:szCs w:val="18"/>
         </w:rPr>
-        <w:t>}:</w:t>
+        <w:t xml:space="preserve">} – </w:t>
+      </w:r>
+      <w:r>
+        <w:rPr>
+          <w:rFonts w:cs="DejaVu Sans Condensed" w:ascii="DejaVu Sans Condensed" w:hAnsi="DejaVu Sans Condensed"/>
+          <w:b/>
+          <w:bCs/>
+          <w:sz w:val="18"/>
+          <w:szCs w:val="18"/>
+        </w:rPr>
+        <w:t>ΨΗΦΙΑΚΗ ΚΑΡΤΑ ΕΡΓΑΣΙΑΣ</w:t>
+      </w:r>
+      <w:r>
+        <w:rPr>
+          <w:rFonts w:cs="DejaVu Sans Condensed" w:ascii="DejaVu Sans Condensed" w:hAnsi="DejaVu Sans Condensed"/>
+          <w:b/>
+          <w:bCs/>
+          <w:sz w:val="18"/>
+          <w:szCs w:val="18"/>
+        </w:rPr>
+        <w:t>:</w:t>
       </w:r>
     </w:p>
     <w:p>
@@ -13395,7 +13601,87 @@
           <w:sz w:val="18"/>
           <w:szCs w:val="18"/>
         </w:rPr>
-        <w:t>Η παρούσα σύμβαση, πληρούσα και τις προϋποθέσεις του άρθρου 70 του Π.Δ. 80/2022, συντάχθηκε εις διπλούν, διαβάσθηκε, βεβαιώθηκε και υπογράφηκε από τα συμβαλλόμενα μέρη λαμβάνοντας έκαστος των συμβαλλομένων μερών από ένα (1) όμοιο αντίτυπο.</w:t>
+        <w:t>Η παρούσα σύμβαση, πληρούσα και τις προϋποθέσεις τ</w:t>
+      </w:r>
+      <w:r>
+        <w:rPr>
+          <w:rFonts w:cs="DejaVu Sans Condensed" w:ascii="DejaVu Sans Condensed" w:hAnsi="DejaVu Sans Condensed"/>
+          <w:sz w:val="18"/>
+          <w:szCs w:val="18"/>
+        </w:rPr>
+        <w:t>ων</w:t>
+      </w:r>
+      <w:r>
+        <w:rPr>
+          <w:rFonts w:cs="DejaVu Sans Condensed" w:ascii="DejaVu Sans Condensed" w:hAnsi="DejaVu Sans Condensed"/>
+          <w:sz w:val="18"/>
+          <w:szCs w:val="18"/>
+        </w:rPr>
+        <w:t xml:space="preserve"> άρθρ</w:t>
+      </w:r>
+      <w:r>
+        <w:rPr>
+          <w:rFonts w:cs="DejaVu Sans Condensed" w:ascii="DejaVu Sans Condensed" w:hAnsi="DejaVu Sans Condensed"/>
+          <w:sz w:val="18"/>
+          <w:szCs w:val="18"/>
+        </w:rPr>
+        <w:t>ων</w:t>
+      </w:r>
+      <w:r>
+        <w:rPr>
+          <w:rFonts w:cs="DejaVu Sans Condensed" w:ascii="DejaVu Sans Condensed" w:hAnsi="DejaVu Sans Condensed"/>
+          <w:sz w:val="18"/>
+          <w:szCs w:val="18"/>
+        </w:rPr>
+        <w:t xml:space="preserve"> </w:t>
+      </w:r>
+      <w:r>
+        <w:rPr>
+          <w:rFonts w:cs="DejaVu Sans Condensed" w:ascii="DejaVu Sans Condensed" w:hAnsi="DejaVu Sans Condensed"/>
+          <w:sz w:val="18"/>
+          <w:szCs w:val="18"/>
+        </w:rPr>
+        <w:t>69 -</w:t>
+      </w:r>
+      <w:r>
+        <w:rPr>
+          <w:rFonts w:cs="DejaVu Sans Condensed" w:ascii="DejaVu Sans Condensed" w:hAnsi="DejaVu Sans Condensed"/>
+          <w:sz w:val="18"/>
+          <w:szCs w:val="18"/>
+        </w:rPr>
+        <w:t>7</w:t>
+      </w:r>
+      <w:r>
+        <w:rPr>
+          <w:rFonts w:cs="DejaVu Sans Condensed" w:ascii="DejaVu Sans Condensed" w:hAnsi="DejaVu Sans Condensed"/>
+          <w:sz w:val="18"/>
+          <w:szCs w:val="18"/>
+        </w:rPr>
+        <w:t>4</w:t>
+      </w:r>
+      <w:r>
+        <w:rPr>
+          <w:rFonts w:cs="DejaVu Sans Condensed" w:ascii="DejaVu Sans Condensed" w:hAnsi="DejaVu Sans Condensed"/>
+          <w:sz w:val="18"/>
+          <w:szCs w:val="18"/>
+        </w:rPr>
+        <w:t xml:space="preserve"> του Π.Δ. 80/2022, συντάχθηκε εις διπλούν, διαβάσθηκε, βεβαιώθηκε και υπογράφηκε από τα συμβαλλόμενα μέρη λαμβάνοντας έκαστος των συμβαλλομένων μερών από </w:t>
+      </w:r>
+      <w:r>
+        <w:rPr>
+          <w:rFonts w:cs="DejaVu Sans Condensed" w:ascii="DejaVu Sans Condensed" w:hAnsi="DejaVu Sans Condensed"/>
+          <w:sz w:val="18"/>
+          <w:szCs w:val="18"/>
+        </w:rPr>
+        <w:t>1904</w:t>
+      </w:r>
+      <w:r>
+        <w:rPr>
+          <w:rFonts w:cs="DejaVu Sans Condensed" w:ascii="DejaVu Sans Condensed" w:hAnsi="DejaVu Sans Condensed"/>
+          <w:sz w:val="18"/>
+          <w:szCs w:val="18"/>
+        </w:rPr>
+        <w:t>ένα (1) όμοιο αντίτυπο.</w:t>
       </w:r>
     </w:p>
     <w:p>
@@ -13980,8 +14266,8 @@
       <w:tblLook w:val="04a0" w:noHBand="0" w:noVBand="1" w:firstColumn="1" w:lastRow="0" w:lastColumn="0" w:firstRow="1"/>
     </w:tblPr>
     <w:tblGrid>
-      <w:gridCol w:w="9020"/>
-      <w:gridCol w:w="1269"/>
+      <w:gridCol w:w="9021"/>
+      <w:gridCol w:w="1268"/>
     </w:tblGrid>
     <w:tr>
       <w:trPr>
@@ -13989,7 +14275,7 @@
       </w:trPr>
       <w:tc>
         <w:tcPr>
-          <w:tcW w:w="9020" w:type="dxa"/>
+          <w:tcW w:w="9021" w:type="dxa"/>
           <w:tcBorders>
             <w:top w:val="single" w:sz="4" w:space="0" w:color="B2B2B2"/>
             <w:left w:val="nil"/>
@@ -14026,7 +14312,7 @@
       </w:tc>
       <w:tc>
         <w:tcPr>
-          <w:tcW w:w="1269" w:type="dxa"/>
+          <w:tcW w:w="1268" w:type="dxa"/>
           <w:tcBorders>
             <w:top w:val="single" w:sz="4" w:space="0" w:color="B2B2B2"/>
             <w:left w:val="nil"/>
@@ -14064,7 +14350,7 @@
       </w:trPr>
       <w:tc>
         <w:tcPr>
-          <w:tcW w:w="9020" w:type="dxa"/>
+          <w:tcW w:w="9021" w:type="dxa"/>
           <w:tcBorders>
             <w:top w:val="nil"/>
             <w:left w:val="nil"/>
@@ -14197,7 +14483,7 @@
       </w:tc>
       <w:tc>
         <w:tcPr>
-          <w:tcW w:w="1269" w:type="dxa"/>
+          <w:tcW w:w="1268" w:type="dxa"/>
           <w:tcBorders>
             <w:top w:val="nil"/>
             <w:left w:val="nil"/>
@@ -14283,7 +14569,7 @@
               <w:color w:val="808080"/>
               <w:lang w:val="el-GR" w:eastAsia="en-US" w:bidi="ar-SA"/>
             </w:rPr>
-            <w:t>8</w:t>
+            <w:t>7</w:t>
           </w:r>
           <w:r>
             <w:rPr>
@@ -14411,8 +14697,8 @@
       <w:tblLook w:val="04a0" w:noHBand="0" w:noVBand="1" w:firstColumn="1" w:lastRow="0" w:lastColumn="0" w:firstRow="1"/>
     </w:tblPr>
     <w:tblGrid>
-      <w:gridCol w:w="9020"/>
-      <w:gridCol w:w="1269"/>
+      <w:gridCol w:w="9021"/>
+      <w:gridCol w:w="1268"/>
     </w:tblGrid>
     <w:tr>
       <w:trPr>
@@ -14420,7 +14706,7 @@
       </w:trPr>
       <w:tc>
         <w:tcPr>
-          <w:tcW w:w="9020" w:type="dxa"/>
+          <w:tcW w:w="9021" w:type="dxa"/>
           <w:tcBorders>
             <w:top w:val="single" w:sz="4" w:space="0" w:color="B2B2B2"/>
             <w:left w:val="nil"/>
@@ -14457,7 +14743,7 @@
       </w:tc>
       <w:tc>
         <w:tcPr>
-          <w:tcW w:w="1269" w:type="dxa"/>
+          <w:tcW w:w="1268" w:type="dxa"/>
           <w:tcBorders>
             <w:top w:val="single" w:sz="4" w:space="0" w:color="B2B2B2"/>
             <w:left w:val="nil"/>
@@ -14495,7 +14781,7 @@
       </w:trPr>
       <w:tc>
         <w:tcPr>
-          <w:tcW w:w="9020" w:type="dxa"/>
+          <w:tcW w:w="9021" w:type="dxa"/>
           <w:tcBorders>
             <w:top w:val="nil"/>
             <w:left w:val="nil"/>
@@ -14628,7 +14914,7 @@
       </w:tc>
       <w:tc>
         <w:tcPr>
-          <w:tcW w:w="1269" w:type="dxa"/>
+          <w:tcW w:w="1268" w:type="dxa"/>
           <w:tcBorders>
             <w:top w:val="nil"/>
             <w:left w:val="nil"/>
@@ -14714,7 +15000,7 @@
               <w:color w:val="808080"/>
               <w:lang w:val="el-GR" w:eastAsia="en-US" w:bidi="ar-SA"/>
             </w:rPr>
-            <w:t>8</w:t>
+            <w:t>7</w:t>
           </w:r>
           <w:r>
             <w:rPr>

</xml_diff>

<commit_message>
🚀 Deploy prod build - 1.0.27 (Phase 1)
</commit_message>
<xml_diff>
--- a/public/templates/ΑΡΧΙΚΗ ΣΥΜΒΑΣΗ ΕΡΓΑΖΟΜΕΝΩΝ.docx
+++ b/public/templates/ΑΡΧΙΚΗ ΣΥΜΒΑΣΗ ΕΡΓΑΖΟΜΕΝΩΝ.docx
@@ -1735,7 +1735,49 @@
           <w:sz w:val="18"/>
           <w:szCs w:val="18"/>
         </w:rPr>
-        <w:t xml:space="preserve"> {_</w:t>
+        <w:t xml:space="preserve"> </w:t>
+      </w:r>
+      <w:r>
+        <w:rPr>
+          <w:rFonts w:cs="DejaVu Sans Condensed" w:ascii="DejaVu Sans Condensed" w:hAnsi="DejaVu Sans Condensed"/>
+          <w:i w:val="false"/>
+          <w:iCs w:val="false"/>
+          <w:sz w:val="18"/>
+          <w:szCs w:val="18"/>
+        </w:rPr>
+        <w:t>{_</w:t>
+      </w:r>
+      <w:r>
+        <w:rPr>
+          <w:rFonts w:cs="DejaVu Sans Condensed" w:ascii="DejaVu Sans Condensed" w:hAnsi="DejaVu Sans Condensed"/>
+          <w:i w:val="false"/>
+          <w:iCs w:val="false"/>
+          <w:sz w:val="18"/>
+          <w:szCs w:val="18"/>
+          <w:lang w:val="en-US"/>
+        </w:rPr>
+        <w:t>HOTEL_</w:t>
+      </w:r>
+      <w:r>
+        <w:rPr>
+          <w:rFonts w:cs="DejaVu Sans Condensed" w:ascii="DejaVu Sans Condensed" w:hAnsi="DejaVu Sans Condensed"/>
+          <w:i w:val="false"/>
+          <w:iCs w:val="false"/>
+          <w:sz w:val="18"/>
+          <w:szCs w:val="18"/>
+          <w:lang w:val="en-US"/>
+        </w:rPr>
+        <w:t>0001</w:t>
+      </w:r>
+      <w:r>
+        <w:rPr>
+          <w:rFonts w:cs="DejaVu Sans Condensed" w:ascii="DejaVu Sans Condensed" w:hAnsi="DejaVu Sans Condensed"/>
+          <w:i w:val="false"/>
+          <w:iCs w:val="false"/>
+          <w:sz w:val="18"/>
+          <w:szCs w:val="18"/>
+        </w:rPr>
+        <w:t>}</w:t>
       </w:r>
       <w:r>
         <w:rPr>
@@ -1744,19 +1786,8 @@
           <w:iCs/>
           <w:sz w:val="18"/>
           <w:szCs w:val="18"/>
-          <w:lang w:val="en-US"/>
-        </w:rPr>
-        <w:t>HOTEL</w:t>
-      </w:r>
-      <w:r>
-        <w:rPr>
-          <w:rFonts w:cs="DejaVu Sans Condensed" w:ascii="DejaVu Sans Condensed" w:hAnsi="DejaVu Sans Condensed"/>
-          <w:i/>
-          <w:iCs/>
-          <w:sz w:val="18"/>
-          <w:szCs w:val="18"/>
-        </w:rPr>
-        <w:t xml:space="preserve">} </w:t>
+        </w:rPr>
+        <w:t xml:space="preserve"> </w:t>
       </w:r>
     </w:p>
     <w:p>
@@ -2001,7 +2032,35 @@
           <w:sz w:val="18"/>
           <w:szCs w:val="18"/>
         </w:rPr>
-        <w:t>} θα ανέρχονται σε οκτώ (8), επί πενθημέρου ή στις έξι ώρες και σαράντα λεπτά (6:40) επί εξαήμερου κατά περίπτωση, σύμφωνα με ΕΓΣΣΕ και ΠΔ 80/2022 άρθρα181 και 182.</w:t>
+        <w:t>} θα ανέρχονται σε οκτώ (8), επί πενθημέρου ή στις έξι ώρες και σαράντα λεπτά (6:40) επί εξαήμερου</w:t>
+      </w:r>
+      <w:r>
+        <w:rPr>
+          <w:rFonts w:cs="DejaVu Sans Condensed" w:ascii="DejaVu Sans Condensed" w:hAnsi="DejaVu Sans Condensed"/>
+          <w:i/>
+          <w:iCs/>
+          <w:sz w:val="16"/>
+          <w:szCs w:val="16"/>
+        </w:rPr>
+        <w:t>{_HOTEL_0002}</w:t>
+      </w:r>
+      <w:r>
+        <w:rPr>
+          <w:rFonts w:cs="DejaVu Sans Condensed" w:ascii="DejaVu Sans Condensed" w:hAnsi="DejaVu Sans Condensed"/>
+          <w:i/>
+          <w:iCs/>
+          <w:sz w:val="18"/>
+          <w:szCs w:val="18"/>
+        </w:rPr>
+        <w:t xml:space="preserve"> </w:t>
+      </w:r>
+      <w:r>
+        <w:rPr>
+          <w:rFonts w:cs="DejaVu Sans Condensed" w:ascii="DejaVu Sans Condensed" w:hAnsi="DejaVu Sans Condensed"/>
+          <w:sz w:val="18"/>
+          <w:szCs w:val="18"/>
+        </w:rPr>
+        <w:t>κατά περίπτωση, σύμφωνα με ΕΓΣΣΕ και ΠΔ 80/2022 άρθρα 181 και 182.</w:t>
       </w:r>
     </w:p>
     <w:p>
@@ -2074,7 +2133,136 @@
           <w:sz w:val="18"/>
           <w:szCs w:val="18"/>
         </w:rPr>
-        <w:t xml:space="preserve">2.5. </w:t>
+        <w:t>2.5.</w:t>
+      </w:r>
+      <w:r>
+        <w:rPr>
+          <w:rFonts w:cs="DejaVu Sans Condensed" w:ascii="DejaVu Sans Condensed" w:hAnsi="DejaVu Sans Condensed"/>
+          <w:sz w:val="18"/>
+          <w:szCs w:val="18"/>
+        </w:rPr>
+        <w:t xml:space="preserve"> </w:t>
+        <w:tab/>
+      </w:r>
+      <w:r>
+        <w:rPr>
+          <w:rFonts w:cs="DejaVu Sans Condensed" w:ascii="DejaVu Sans Condensed" w:hAnsi="DejaVu Sans Condensed"/>
+          <w:b/>
+          <w:bCs/>
+          <w:i/>
+          <w:iCs/>
+          <w:sz w:val="18"/>
+          <w:szCs w:val="18"/>
+        </w:rPr>
+        <w:t>Εργασ</w:t>
+      </w:r>
+      <w:r>
+        <w:rPr>
+          <w:rFonts w:eastAsia="Calibri" w:cs="DejaVu Sans Condensed" w:ascii="DejaVu Sans Condensed" w:hAnsi="DejaVu Sans Condensed" w:eastAsiaTheme="minorHAnsi"/>
+          <w:b/>
+          <w:bCs/>
+          <w:i/>
+          <w:iCs/>
+          <w:color w:val="auto"/>
+          <w:kern w:val="0"/>
+          <w:sz w:val="18"/>
+          <w:szCs w:val="18"/>
+          <w:lang w:val="el-GR" w:eastAsia="en-US" w:bidi="ar-SA"/>
+        </w:rPr>
+        <w:t>ία 6</w:t>
+      </w:r>
+      <w:r>
+        <w:rPr>
+          <w:rFonts w:eastAsia="Calibri" w:cs="DejaVu Sans Condensed" w:ascii="DejaVu Sans Condensed" w:hAnsi="DejaVu Sans Condensed" w:eastAsiaTheme="minorHAnsi"/>
+          <w:b/>
+          <w:bCs/>
+          <w:i/>
+          <w:iCs/>
+          <w:color w:val="auto"/>
+          <w:kern w:val="0"/>
+          <w:sz w:val="18"/>
+          <w:szCs w:val="18"/>
+          <w:vertAlign w:val="superscript"/>
+          <w:lang w:val="el-GR" w:eastAsia="en-US" w:bidi="ar-SA"/>
+        </w:rPr>
+        <w:t xml:space="preserve">ης </w:t>
+      </w:r>
+      <w:r>
+        <w:rPr>
+          <w:rFonts w:cs="DejaVu Sans Condensed" w:ascii="DejaVu Sans Condensed" w:hAnsi="DejaVu Sans Condensed"/>
+          <w:b/>
+          <w:bCs/>
+          <w:i/>
+          <w:iCs/>
+          <w:sz w:val="18"/>
+          <w:szCs w:val="18"/>
+        </w:rPr>
+        <w:t>ημ</w:t>
+      </w:r>
+      <w:r>
+        <w:rPr>
+          <w:rFonts w:eastAsia="Calibri" w:cs="DejaVu Sans Condensed" w:ascii="DejaVu Sans Condensed" w:hAnsi="DejaVu Sans Condensed" w:eastAsiaTheme="minorHAnsi"/>
+          <w:b/>
+          <w:bCs/>
+          <w:i/>
+          <w:iCs/>
+          <w:color w:val="auto"/>
+          <w:kern w:val="0"/>
+          <w:sz w:val="18"/>
+          <w:szCs w:val="18"/>
+          <w:lang w:val="el-GR" w:eastAsia="en-US" w:bidi="ar-SA"/>
+        </w:rPr>
+        <w:t>έρας</w:t>
+      </w:r>
+      <w:r>
+        <w:rPr>
+          <w:rFonts w:cs="DejaVu Sans Condensed" w:ascii="DejaVu Sans Condensed" w:hAnsi="DejaVu Sans Condensed"/>
+          <w:sz w:val="18"/>
+          <w:szCs w:val="18"/>
+        </w:rPr>
+        <w:t>: {_HOTEL_0003}</w:t>
+      </w:r>
+    </w:p>
+    <w:p>
+      <w:pPr>
+        <w:pStyle w:val="Normal"/>
+        <w:ind w:left="-709" w:right="-1186" w:hanging="0"/>
+        <w:jc w:val="both"/>
+        <w:rPr>
+          <w:rFonts w:ascii="DejaVu Sans Condensed" w:hAnsi="DejaVu Sans Condensed" w:cs="DejaVu Sans Condensed"/>
+          <w:sz w:val="18"/>
+          <w:szCs w:val="18"/>
+        </w:rPr>
+      </w:pPr>
+      <w:r>
+        <w:rPr>
+          <w:rFonts w:cs="DejaVu Sans Condensed" w:ascii="DejaVu Sans Condensed" w:hAnsi="DejaVu Sans Condensed"/>
+          <w:b/>
+          <w:bCs/>
+          <w:sz w:val="18"/>
+          <w:szCs w:val="18"/>
+        </w:rPr>
+        <w:t>2.</w:t>
+      </w:r>
+      <w:r>
+        <w:rPr>
+          <w:rFonts w:cs="DejaVu Sans Condensed" w:ascii="DejaVu Sans Condensed" w:hAnsi="DejaVu Sans Condensed"/>
+          <w:b/>
+          <w:bCs/>
+          <w:sz w:val="18"/>
+          <w:szCs w:val="18"/>
+        </w:rPr>
+        <w:t>6</w:t>
+      </w:r>
+      <w:r>
+        <w:rPr>
+          <w:rFonts w:cs="DejaVu Sans Condensed" w:ascii="DejaVu Sans Condensed" w:hAnsi="DejaVu Sans Condensed"/>
+          <w:b/>
+          <w:bCs/>
+          <w:sz w:val="18"/>
+          <w:szCs w:val="18"/>
+        </w:rPr>
+        <w:t xml:space="preserve">. </w:t>
         <w:tab/>
       </w:r>
       <w:r>
@@ -2378,7 +2566,27 @@
           <w:sz w:val="18"/>
           <w:szCs w:val="18"/>
         </w:rPr>
-        <w:t xml:space="preserve">2.6. </w:t>
+        <w:t>2.</w:t>
+      </w:r>
+      <w:r>
+        <w:rPr>
+          <w:rFonts w:cs="DejaVu Sans Condensed" w:ascii="DejaVu Sans Condensed" w:hAnsi="DejaVu Sans Condensed"/>
+          <w:b/>
+          <w:bCs/>
+          <w:sz w:val="18"/>
+          <w:szCs w:val="18"/>
+        </w:rPr>
+        <w:t>7</w:t>
+      </w:r>
+      <w:r>
+        <w:rPr>
+          <w:rFonts w:cs="DejaVu Sans Condensed" w:ascii="DejaVu Sans Condensed" w:hAnsi="DejaVu Sans Condensed"/>
+          <w:b/>
+          <w:bCs/>
+          <w:sz w:val="18"/>
+          <w:szCs w:val="18"/>
+        </w:rPr>
+        <w:t xml:space="preserve">. </w:t>
         <w:tab/>
       </w:r>
       <w:r>
@@ -2413,7 +2621,27 @@
           <w:sz w:val="18"/>
           <w:szCs w:val="18"/>
         </w:rPr>
-        <w:t>2.6.1.</w:t>
+        <w:t>2.</w:t>
+      </w:r>
+      <w:r>
+        <w:rPr>
+          <w:rFonts w:cs="DejaVu Sans Condensed" w:ascii="DejaVu Sans Condensed" w:hAnsi="DejaVu Sans Condensed"/>
+          <w:b/>
+          <w:bCs/>
+          <w:sz w:val="18"/>
+          <w:szCs w:val="18"/>
+        </w:rPr>
+        <w:t>7</w:t>
+      </w:r>
+      <w:r>
+        <w:rPr>
+          <w:rFonts w:cs="DejaVu Sans Condensed" w:ascii="DejaVu Sans Condensed" w:hAnsi="DejaVu Sans Condensed"/>
+          <w:b/>
+          <w:bCs/>
+          <w:sz w:val="18"/>
+          <w:szCs w:val="18"/>
+        </w:rPr>
+        <w:t>.1.</w:t>
       </w:r>
       <w:r>
         <w:rPr>
@@ -2576,6 +2804,39 @@
           <w:szCs w:val="18"/>
         </w:rPr>
         <w:t xml:space="preserve">}. </w:t>
+      </w:r>
+      <w:r>
+        <w:rPr>
+          <w:rFonts w:cs="DejaVu Sans Condensed" w:ascii="DejaVu Sans Condensed" w:hAnsi="DejaVu Sans Condensed"/>
+          <w:i/>
+          <w:iCs/>
+          <w:sz w:val="16"/>
+          <w:szCs w:val="16"/>
+        </w:rPr>
+        <w:t>[ΣΣ  ΕΚΤΟΣ ΩΡΑΡΙΟΥ: Δεν αποτελε</w:t>
+      </w:r>
+      <w:r>
+        <w:rPr>
+          <w:rFonts w:eastAsia="Calibri" w:cs="DejaVu Sans Condensed" w:ascii="DejaVu Sans Condensed" w:hAnsi="DejaVu Sans Condensed" w:eastAsiaTheme="minorHAnsi"/>
+          <w:i/>
+          <w:iCs/>
+          <w:color w:val="auto"/>
+          <w:kern w:val="0"/>
+          <w:sz w:val="16"/>
+          <w:szCs w:val="16"/>
+          <w:lang w:val="el-GR" w:eastAsia="en-US" w:bidi="ar-SA"/>
+        </w:rPr>
+        <w:t>ί χρόνο εργασίας ήτοι επεκτείνει το ωράριο εργασίας</w:t>
+      </w:r>
+      <w:r>
+        <w:rPr>
+          <w:rFonts w:cs="DejaVu Sans Condensed" w:ascii="DejaVu Sans Condensed" w:hAnsi="DejaVu Sans Condensed"/>
+          <w:i/>
+          <w:iCs/>
+          <w:sz w:val="16"/>
+          <w:szCs w:val="16"/>
+        </w:rPr>
+        <w:t>]</w:t>
       </w:r>
     </w:p>
     <w:p>
@@ -2597,7 +2858,27 @@
           <w:sz w:val="18"/>
           <w:szCs w:val="18"/>
         </w:rPr>
-        <w:t>2.6.2.</w:t>
+        <w:t>2.</w:t>
+      </w:r>
+      <w:r>
+        <w:rPr>
+          <w:rFonts w:cs="DejaVu Sans Condensed" w:ascii="DejaVu Sans Condensed" w:hAnsi="DejaVu Sans Condensed"/>
+          <w:b/>
+          <w:bCs/>
+          <w:sz w:val="18"/>
+          <w:szCs w:val="18"/>
+        </w:rPr>
+        <w:t>7</w:t>
+      </w:r>
+      <w:r>
+        <w:rPr>
+          <w:rFonts w:cs="DejaVu Sans Condensed" w:ascii="DejaVu Sans Condensed" w:hAnsi="DejaVu Sans Condensed"/>
+          <w:b/>
+          <w:bCs/>
+          <w:sz w:val="18"/>
+          <w:szCs w:val="18"/>
+        </w:rPr>
+        <w:t>.2.</w:t>
       </w:r>
       <w:r>
         <w:rPr>
@@ -2683,7 +2964,27 @@
           <w:sz w:val="18"/>
           <w:szCs w:val="18"/>
         </w:rPr>
-        <w:t>2.6.</w:t>
+        <w:t>2.</w:t>
+      </w:r>
+      <w:r>
+        <w:rPr>
+          <w:rFonts w:cs="DejaVu Sans Condensed" w:ascii="DejaVu Sans Condensed" w:hAnsi="DejaVu Sans Condensed"/>
+          <w:b/>
+          <w:bCs/>
+          <w:sz w:val="18"/>
+          <w:szCs w:val="18"/>
+        </w:rPr>
+        <w:t>8</w:t>
+      </w:r>
+      <w:r>
+        <w:rPr>
+          <w:rFonts w:cs="DejaVu Sans Condensed" w:ascii="DejaVu Sans Condensed" w:hAnsi="DejaVu Sans Condensed"/>
+          <w:b/>
+          <w:bCs/>
+          <w:sz w:val="18"/>
+          <w:szCs w:val="18"/>
+        </w:rPr>
+        <w:t>.</w:t>
       </w:r>
       <w:r>
         <w:rPr>
@@ -3317,19 +3618,7 @@
           <w:shd w:fill="FFFF00" w:val="clear"/>
           <w:lang w:val="el-GR" w:eastAsia="en-US" w:bidi="ar-SA"/>
         </w:rPr>
-        <w:t xml:space="preserve">ή </w:t>
-      </w:r>
-      <w:r>
-        <w:rPr>
-          <w:rFonts w:eastAsia="Calibri" w:cs="DejaVu Sans Condensed" w:ascii="DejaVu Sans Condensed" w:hAnsi="DejaVu Sans Condensed" w:eastAsiaTheme="minorHAnsi"/>
-          <w:color w:val="000000"/>
-          <w:kern w:val="0"/>
-          <w:sz w:val="18"/>
-          <w:szCs w:val="18"/>
-          <w:shd w:fill="FFFF00" w:val="clear"/>
-          <w:lang w:val="el-GR" w:eastAsia="en-US" w:bidi="ar-SA"/>
-        </w:rPr>
-        <w:t>συμφερόντων</w:t>
+        <w:t>ή συμφερόντων</w:t>
       </w:r>
       <w:r>
         <w:rPr>
@@ -4155,15 +4444,7 @@
           <w:sz w:val="18"/>
           <w:szCs w:val="18"/>
         </w:rPr>
-        <w:t xml:space="preserve">} και η οικογενειακή τ{_GENIKH_A} κατάσταση </w:t>
-      </w:r>
-      <w:r>
-        <w:rPr>
-          <w:rFonts w:cs="DejaVu Sans Condensed" w:ascii="DejaVu Sans Condensed" w:hAnsi="DejaVu Sans Condensed"/>
-          <w:sz w:val="18"/>
-          <w:szCs w:val="18"/>
-        </w:rPr>
-        <w:t>και εκπα</w:t>
+        <w:t>} και η οικογενειακή τ{_GENIKH_A} κατάσταση και εκπα</w:t>
       </w:r>
       <w:r>
         <w:rPr>
@@ -4719,15 +5000,7 @@
           <w:sz w:val="18"/>
           <w:szCs w:val="18"/>
         </w:rPr>
-        <w:t xml:space="preserve">} θα καταβάλλονται </w:t>
-      </w:r>
-      <w:r>
-        <w:rPr>
-          <w:rFonts w:cs="DejaVu Sans Condensed" w:ascii="DejaVu Sans Condensed" w:hAnsi="DejaVu Sans Condensed"/>
-          <w:sz w:val="18"/>
-          <w:szCs w:val="18"/>
-        </w:rPr>
-        <w:t>εντ</w:t>
+        <w:t>} θα καταβάλλονται εντ</w:t>
       </w:r>
       <w:r>
         <w:rPr>
@@ -4746,15 +5019,7 @@
           <w:sz w:val="18"/>
           <w:szCs w:val="18"/>
         </w:rPr>
-        <w:t xml:space="preserve"> </w:t>
-      </w:r>
-      <w:r>
-        <w:rPr>
-          <w:rFonts w:cs="DejaVu Sans Condensed" w:ascii="DejaVu Sans Condensed" w:hAnsi="DejaVu Sans Condensed"/>
-          <w:sz w:val="18"/>
-          <w:szCs w:val="18"/>
-        </w:rPr>
-        <w:t>απ</w:t>
+        <w:t xml:space="preserve"> απ</w:t>
       </w:r>
       <w:r>
         <w:rPr>
@@ -5562,17 +5827,7 @@
           <w:sz w:val="18"/>
           <w:szCs w:val="18"/>
         </w:rPr>
-        <w:t>i</w:t>
-      </w:r>
-      <w:r>
-        <w:rPr>
-          <w:rFonts w:cs="DejaVu Sans Condensed" w:ascii="DejaVu Sans Condensed" w:hAnsi="DejaVu Sans Condensed"/>
-          <w:b/>
-          <w:bCs/>
-          <w:sz w:val="18"/>
-          <w:szCs w:val="18"/>
-        </w:rPr>
-        <w:t>v</w:t>
+        <w:t>iv</w:t>
       </w:r>
       <w:r>
         <w:rPr>
@@ -7459,39 +7714,7 @@
           <w:sz w:val="18"/>
           <w:szCs w:val="18"/>
         </w:rPr>
-        <w:t xml:space="preserve">} καθορίζεται σύμφωνα με τα παραπάνω </w:t>
-      </w:r>
-      <w:r>
-        <w:rPr>
-          <w:rFonts w:cs="DejaVu Sans Condensed" w:ascii="DejaVu Sans Condensed" w:hAnsi="DejaVu Sans Condensed"/>
-          <w:sz w:val="18"/>
-          <w:szCs w:val="18"/>
-        </w:rPr>
-        <w:t>8</w:t>
-      </w:r>
-      <w:r>
-        <w:rPr>
-          <w:rFonts w:cs="DejaVu Sans Condensed" w:ascii="DejaVu Sans Condensed" w:hAnsi="DejaVu Sans Condensed"/>
-          <w:sz w:val="18"/>
-          <w:szCs w:val="18"/>
-        </w:rPr>
-        <w:t xml:space="preserve">.1. – </w:t>
-      </w:r>
-      <w:r>
-        <w:rPr>
-          <w:rFonts w:cs="DejaVu Sans Condensed" w:ascii="DejaVu Sans Condensed" w:hAnsi="DejaVu Sans Condensed"/>
-          <w:sz w:val="18"/>
-          <w:szCs w:val="18"/>
-        </w:rPr>
-        <w:t>8</w:t>
-      </w:r>
-      <w:r>
-        <w:rPr>
-          <w:rFonts w:cs="DejaVu Sans Condensed" w:ascii="DejaVu Sans Condensed" w:hAnsi="DejaVu Sans Condensed"/>
-          <w:sz w:val="18"/>
-          <w:szCs w:val="18"/>
-        </w:rPr>
-        <w:t>.4 ή η αυξημένη αποζημίωση βάσει ΣΣΕ, Κανονισμού Εργασίας, ατομικής σύμβασης εργασίας.</w:t>
+        <w:t>} καθορίζεται σύμφωνα με τα παραπάνω 8.1. – 8.4 ή η αυξημένη αποζημίωση βάσει ΣΣΕ, Κανονισμού Εργασίας, ατομικής σύμβασης εργασίας.</w:t>
       </w:r>
     </w:p>
     <w:p>
@@ -11344,27 +11567,7 @@
           <w:sz w:val="18"/>
           <w:szCs w:val="18"/>
         </w:rPr>
-        <w:t xml:space="preserve">} – </w:t>
-      </w:r>
-      <w:r>
-        <w:rPr>
-          <w:rFonts w:cs="DejaVu Sans Condensed" w:ascii="DejaVu Sans Condensed" w:hAnsi="DejaVu Sans Condensed"/>
-          <w:b/>
-          <w:bCs/>
-          <w:sz w:val="18"/>
-          <w:szCs w:val="18"/>
-        </w:rPr>
-        <w:t>ΨΗΦΙΑΚΗ ΚΑΡΤΑ ΕΡΓΑΣΙΑΣ</w:t>
-      </w:r>
-      <w:r>
-        <w:rPr>
-          <w:rFonts w:cs="DejaVu Sans Condensed" w:ascii="DejaVu Sans Condensed" w:hAnsi="DejaVu Sans Condensed"/>
-          <w:b/>
-          <w:bCs/>
-          <w:sz w:val="18"/>
-          <w:szCs w:val="18"/>
-        </w:rPr>
-        <w:t>:</w:t>
+        <w:t>} – ΨΗΦΙΑΚΗ ΚΑΡΤΑ ΕΡΓΑΣΙΑΣ:</w:t>
       </w:r>
     </w:p>
     <w:p>
@@ -13601,87 +13804,7 @@
           <w:sz w:val="18"/>
           <w:szCs w:val="18"/>
         </w:rPr>
-        <w:t>Η παρούσα σύμβαση, πληρούσα και τις προϋποθέσεις τ</w:t>
-      </w:r>
-      <w:r>
-        <w:rPr>
-          <w:rFonts w:cs="DejaVu Sans Condensed" w:ascii="DejaVu Sans Condensed" w:hAnsi="DejaVu Sans Condensed"/>
-          <w:sz w:val="18"/>
-          <w:szCs w:val="18"/>
-        </w:rPr>
-        <w:t>ων</w:t>
-      </w:r>
-      <w:r>
-        <w:rPr>
-          <w:rFonts w:cs="DejaVu Sans Condensed" w:ascii="DejaVu Sans Condensed" w:hAnsi="DejaVu Sans Condensed"/>
-          <w:sz w:val="18"/>
-          <w:szCs w:val="18"/>
-        </w:rPr>
-        <w:t xml:space="preserve"> άρθρ</w:t>
-      </w:r>
-      <w:r>
-        <w:rPr>
-          <w:rFonts w:cs="DejaVu Sans Condensed" w:ascii="DejaVu Sans Condensed" w:hAnsi="DejaVu Sans Condensed"/>
-          <w:sz w:val="18"/>
-          <w:szCs w:val="18"/>
-        </w:rPr>
-        <w:t>ων</w:t>
-      </w:r>
-      <w:r>
-        <w:rPr>
-          <w:rFonts w:cs="DejaVu Sans Condensed" w:ascii="DejaVu Sans Condensed" w:hAnsi="DejaVu Sans Condensed"/>
-          <w:sz w:val="18"/>
-          <w:szCs w:val="18"/>
-        </w:rPr>
-        <w:t xml:space="preserve"> </w:t>
-      </w:r>
-      <w:r>
-        <w:rPr>
-          <w:rFonts w:cs="DejaVu Sans Condensed" w:ascii="DejaVu Sans Condensed" w:hAnsi="DejaVu Sans Condensed"/>
-          <w:sz w:val="18"/>
-          <w:szCs w:val="18"/>
-        </w:rPr>
-        <w:t>69 -</w:t>
-      </w:r>
-      <w:r>
-        <w:rPr>
-          <w:rFonts w:cs="DejaVu Sans Condensed" w:ascii="DejaVu Sans Condensed" w:hAnsi="DejaVu Sans Condensed"/>
-          <w:sz w:val="18"/>
-          <w:szCs w:val="18"/>
-        </w:rPr>
-        <w:t>7</w:t>
-      </w:r>
-      <w:r>
-        <w:rPr>
-          <w:rFonts w:cs="DejaVu Sans Condensed" w:ascii="DejaVu Sans Condensed" w:hAnsi="DejaVu Sans Condensed"/>
-          <w:sz w:val="18"/>
-          <w:szCs w:val="18"/>
-        </w:rPr>
-        <w:t>4</w:t>
-      </w:r>
-      <w:r>
-        <w:rPr>
-          <w:rFonts w:cs="DejaVu Sans Condensed" w:ascii="DejaVu Sans Condensed" w:hAnsi="DejaVu Sans Condensed"/>
-          <w:sz w:val="18"/>
-          <w:szCs w:val="18"/>
-        </w:rPr>
-        <w:t xml:space="preserve"> του Π.Δ. 80/2022, συντάχθηκε εις διπλούν, διαβάσθηκε, βεβαιώθηκε και υπογράφηκε από τα συμβαλλόμενα μέρη λαμβάνοντας έκαστος των συμβαλλομένων μερών από </w:t>
-      </w:r>
-      <w:r>
-        <w:rPr>
-          <w:rFonts w:cs="DejaVu Sans Condensed" w:ascii="DejaVu Sans Condensed" w:hAnsi="DejaVu Sans Condensed"/>
-          <w:sz w:val="18"/>
-          <w:szCs w:val="18"/>
-        </w:rPr>
-        <w:t>1904</w:t>
-      </w:r>
-      <w:r>
-        <w:rPr>
-          <w:rFonts w:cs="DejaVu Sans Condensed" w:ascii="DejaVu Sans Condensed" w:hAnsi="DejaVu Sans Condensed"/>
-          <w:sz w:val="18"/>
-          <w:szCs w:val="18"/>
-        </w:rPr>
-        <w:t>ένα (1) όμοιο αντίτυπο.</w:t>
+        <w:t>Η παρούσα σύμβαση, πληρούσα και τις προϋποθέσεις των άρθρων 69 -74 του Π.Δ. 80/2022, συντάχθηκε εις διπλούν, διαβάσθηκε, βεβαιώθηκε και υπογράφηκε από τα συμβαλλόμενα μέρη λαμβάνοντας έκαστος των συμβαλλομένων μερών από 1904ένα (1) όμοιο αντίτυπο.</w:t>
       </w:r>
     </w:p>
     <w:p>
@@ -14266,8 +14389,8 @@
       <w:tblLook w:val="04a0" w:noHBand="0" w:noVBand="1" w:firstColumn="1" w:lastRow="0" w:lastColumn="0" w:firstRow="1"/>
     </w:tblPr>
     <w:tblGrid>
-      <w:gridCol w:w="9021"/>
-      <w:gridCol w:w="1268"/>
+      <w:gridCol w:w="9022"/>
+      <w:gridCol w:w="1267"/>
     </w:tblGrid>
     <w:tr>
       <w:trPr>
@@ -14275,7 +14398,7 @@
       </w:trPr>
       <w:tc>
         <w:tcPr>
-          <w:tcW w:w="9021" w:type="dxa"/>
+          <w:tcW w:w="9022" w:type="dxa"/>
           <w:tcBorders>
             <w:top w:val="single" w:sz="4" w:space="0" w:color="B2B2B2"/>
             <w:left w:val="nil"/>
@@ -14312,7 +14435,7 @@
       </w:tc>
       <w:tc>
         <w:tcPr>
-          <w:tcW w:w="1268" w:type="dxa"/>
+          <w:tcW w:w="1267" w:type="dxa"/>
           <w:tcBorders>
             <w:top w:val="single" w:sz="4" w:space="0" w:color="B2B2B2"/>
             <w:left w:val="nil"/>
@@ -14350,7 +14473,7 @@
       </w:trPr>
       <w:tc>
         <w:tcPr>
-          <w:tcW w:w="9021" w:type="dxa"/>
+          <w:tcW w:w="9022" w:type="dxa"/>
           <w:tcBorders>
             <w:top w:val="nil"/>
             <w:left w:val="nil"/>
@@ -14483,7 +14606,7 @@
       </w:tc>
       <w:tc>
         <w:tcPr>
-          <w:tcW w:w="1268" w:type="dxa"/>
+          <w:tcW w:w="1267" w:type="dxa"/>
           <w:tcBorders>
             <w:top w:val="nil"/>
             <w:left w:val="nil"/>
@@ -14569,7 +14692,7 @@
               <w:color w:val="808080"/>
               <w:lang w:val="el-GR" w:eastAsia="en-US" w:bidi="ar-SA"/>
             </w:rPr>
-            <w:t>7</w:t>
+            <w:t>8</w:t>
           </w:r>
           <w:r>
             <w:rPr>
@@ -14697,8 +14820,8 @@
       <w:tblLook w:val="04a0" w:noHBand="0" w:noVBand="1" w:firstColumn="1" w:lastRow="0" w:lastColumn="0" w:firstRow="1"/>
     </w:tblPr>
     <w:tblGrid>
-      <w:gridCol w:w="9021"/>
-      <w:gridCol w:w="1268"/>
+      <w:gridCol w:w="9022"/>
+      <w:gridCol w:w="1267"/>
     </w:tblGrid>
     <w:tr>
       <w:trPr>
@@ -14706,7 +14829,7 @@
       </w:trPr>
       <w:tc>
         <w:tcPr>
-          <w:tcW w:w="9021" w:type="dxa"/>
+          <w:tcW w:w="9022" w:type="dxa"/>
           <w:tcBorders>
             <w:top w:val="single" w:sz="4" w:space="0" w:color="B2B2B2"/>
             <w:left w:val="nil"/>
@@ -14743,7 +14866,7 @@
       </w:tc>
       <w:tc>
         <w:tcPr>
-          <w:tcW w:w="1268" w:type="dxa"/>
+          <w:tcW w:w="1267" w:type="dxa"/>
           <w:tcBorders>
             <w:top w:val="single" w:sz="4" w:space="0" w:color="B2B2B2"/>
             <w:left w:val="nil"/>
@@ -14781,7 +14904,7 @@
       </w:trPr>
       <w:tc>
         <w:tcPr>
-          <w:tcW w:w="9021" w:type="dxa"/>
+          <w:tcW w:w="9022" w:type="dxa"/>
           <w:tcBorders>
             <w:top w:val="nil"/>
             <w:left w:val="nil"/>
@@ -14914,7 +15037,7 @@
       </w:tc>
       <w:tc>
         <w:tcPr>
-          <w:tcW w:w="1268" w:type="dxa"/>
+          <w:tcW w:w="1267" w:type="dxa"/>
           <w:tcBorders>
             <w:top w:val="nil"/>
             <w:left w:val="nil"/>
@@ -15000,7 +15123,7 @@
               <w:color w:val="808080"/>
               <w:lang w:val="el-GR" w:eastAsia="en-US" w:bidi="ar-SA"/>
             </w:rPr>
-            <w:t>7</w:t>
+            <w:t>8</w:t>
           </w:r>
           <w:r>
             <w:rPr>

</xml_diff>

<commit_message>
🚀 Deploy prod build - 1.0.29 (Phase 1)
</commit_message>
<xml_diff>
--- a/public/templates/ΑΡΧΙΚΗ ΣΥΜΒΑΣΗ ΕΡΓΑΖΟΜΕΝΩΝ.docx
+++ b/public/templates/ΑΡΧΙΚΗ ΣΥΜΒΑΣΗ ΕΡΓΑΖΟΜΕΝΩΝ.docx
@@ -271,11 +271,23 @@
           <w:sz w:val="18"/>
           <w:szCs w:val="18"/>
         </w:rPr>
-        <w:t>», που εδρεύει στο Δ.Δ. {_</w:t>
-      </w:r>
-      <w:r>
-        <w:rPr>
-          <w:rFonts w:cs="DejaVu Sans Condensed" w:ascii="DejaVu Sans Condensed" w:hAnsi="DejaVu Sans Condensed"/>
+        <w:t xml:space="preserve">», που εδρεύει στο Δ.Δ. </w:t>
+      </w:r>
+      <w:r>
+        <w:rPr>
+          <w:rFonts w:cs="DejaVu Sans Condensed" w:ascii="DejaVu Sans Condensed" w:hAnsi="DejaVu Sans Condensed"/>
+          <w:b/>
+          <w:bCs/>
+          <w:sz w:val="18"/>
+          <w:szCs w:val="18"/>
+        </w:rPr>
+        <w:t>{_</w:t>
+      </w:r>
+      <w:r>
+        <w:rPr>
+          <w:rFonts w:cs="DejaVu Sans Condensed" w:ascii="DejaVu Sans Condensed" w:hAnsi="DejaVu Sans Condensed"/>
+          <w:b/>
+          <w:bCs/>
           <w:sz w:val="18"/>
           <w:szCs w:val="18"/>
           <w:lang w:val="en-US"/>
@@ -285,15 +297,27 @@
       <w:r>
         <w:rPr>
           <w:rFonts w:cs="DejaVu Sans Condensed" w:ascii="DejaVu Sans Condensed" w:hAnsi="DejaVu Sans Condensed"/>
-          <w:sz w:val="18"/>
-          <w:szCs w:val="18"/>
-        </w:rPr>
-        <w:t xml:space="preserve">}, (οδός </w:t>
+          <w:b/>
+          <w:bCs/>
+          <w:sz w:val="18"/>
+          <w:szCs w:val="18"/>
+        </w:rPr>
+        <w:t>}</w:t>
+      </w:r>
+      <w:r>
+        <w:rPr>
+          <w:rFonts w:cs="DejaVu Sans Condensed" w:ascii="DejaVu Sans Condensed" w:hAnsi="DejaVu Sans Condensed"/>
+          <w:sz w:val="18"/>
+          <w:szCs w:val="18"/>
+        </w:rPr>
+        <w:t xml:space="preserve">, (οδός </w:t>
       </w:r>
       <w:bookmarkEnd w:id="0"/>
       <w:r>
         <w:rPr>
           <w:rFonts w:cs="DejaVu Sans Condensed" w:ascii="DejaVu Sans Condensed" w:hAnsi="DejaVu Sans Condensed"/>
+          <w:b/>
+          <w:bCs/>
           <w:sz w:val="18"/>
           <w:szCs w:val="18"/>
         </w:rPr>
@@ -302,6 +326,8 @@
       <w:r>
         <w:rPr>
           <w:rFonts w:cs="DejaVu Sans Condensed" w:ascii="DejaVu Sans Condensed" w:hAnsi="DejaVu Sans Condensed"/>
+          <w:b/>
+          <w:bCs/>
           <w:sz w:val="18"/>
           <w:szCs w:val="18"/>
           <w:lang w:val="en-US"/>
@@ -311,14 +337,36 @@
       <w:r>
         <w:rPr>
           <w:rFonts w:cs="DejaVu Sans Condensed" w:ascii="DejaVu Sans Condensed" w:hAnsi="DejaVu Sans Condensed"/>
-          <w:sz w:val="18"/>
-          <w:szCs w:val="18"/>
-        </w:rPr>
-        <w:t>}, αρ. {_</w:t>
-      </w:r>
-      <w:r>
-        <w:rPr>
-          <w:rFonts w:cs="DejaVu Sans Condensed" w:ascii="DejaVu Sans Condensed" w:hAnsi="DejaVu Sans Condensed"/>
+          <w:b/>
+          <w:bCs/>
+          <w:sz w:val="18"/>
+          <w:szCs w:val="18"/>
+        </w:rPr>
+        <w:t>}</w:t>
+      </w:r>
+      <w:r>
+        <w:rPr>
+          <w:rFonts w:cs="DejaVu Sans Condensed" w:ascii="DejaVu Sans Condensed" w:hAnsi="DejaVu Sans Condensed"/>
+          <w:sz w:val="18"/>
+          <w:szCs w:val="18"/>
+        </w:rPr>
+        <w:t xml:space="preserve">, αρ. </w:t>
+      </w:r>
+      <w:r>
+        <w:rPr>
+          <w:rFonts w:cs="DejaVu Sans Condensed" w:ascii="DejaVu Sans Condensed" w:hAnsi="DejaVu Sans Condensed"/>
+          <w:b/>
+          <w:bCs/>
+          <w:sz w:val="18"/>
+          <w:szCs w:val="18"/>
+        </w:rPr>
+        <w:t>{_</w:t>
+      </w:r>
+      <w:r>
+        <w:rPr>
+          <w:rFonts w:cs="DejaVu Sans Condensed" w:ascii="DejaVu Sans Condensed" w:hAnsi="DejaVu Sans Condensed"/>
+          <w:b/>
+          <w:bCs/>
           <w:sz w:val="18"/>
           <w:szCs w:val="18"/>
           <w:lang w:val="en-US"/>
@@ -328,14 +376,381 @@
       <w:r>
         <w:rPr>
           <w:rFonts w:cs="DejaVu Sans Condensed" w:ascii="DejaVu Sans Condensed" w:hAnsi="DejaVu Sans Condensed"/>
-          <w:sz w:val="18"/>
-          <w:szCs w:val="18"/>
-        </w:rPr>
-        <w:t>}), με ΑΦΜ {_</w:t>
-      </w:r>
-      <w:r>
-        <w:rPr>
-          <w:rFonts w:cs="DejaVu Sans Condensed" w:ascii="DejaVu Sans Condensed" w:hAnsi="DejaVu Sans Condensed"/>
+          <w:b/>
+          <w:bCs/>
+          <w:sz w:val="18"/>
+          <w:szCs w:val="18"/>
+        </w:rPr>
+        <w:t>}</w:t>
+      </w:r>
+      <w:r>
+        <w:rPr>
+          <w:rFonts w:cs="DejaVu Sans Condensed" w:ascii="DejaVu Sans Condensed" w:hAnsi="DejaVu Sans Condensed"/>
+          <w:sz w:val="18"/>
+          <w:szCs w:val="18"/>
+        </w:rPr>
+        <w:t xml:space="preserve">), με ΑΦΜ </w:t>
+      </w:r>
+      <w:r>
+        <w:rPr>
+          <w:rFonts w:cs="DejaVu Sans Condensed" w:ascii="DejaVu Sans Condensed" w:hAnsi="DejaVu Sans Condensed"/>
+          <w:b/>
+          <w:bCs/>
+          <w:sz w:val="18"/>
+          <w:szCs w:val="18"/>
+        </w:rPr>
+        <w:t>{_</w:t>
+      </w:r>
+      <w:r>
+        <w:rPr>
+          <w:rFonts w:cs="DejaVu Sans Condensed" w:ascii="DejaVu Sans Condensed" w:hAnsi="DejaVu Sans Condensed"/>
+          <w:b/>
+          <w:bCs/>
+          <w:sz w:val="18"/>
+          <w:szCs w:val="18"/>
+          <w:lang w:val="en-US"/>
+        </w:rPr>
+        <w:t>AFM_ETAIREIAS</w:t>
+      </w:r>
+      <w:r>
+        <w:rPr>
+          <w:rFonts w:cs="DejaVu Sans Condensed" w:ascii="DejaVu Sans Condensed" w:hAnsi="DejaVu Sans Condensed"/>
+          <w:b/>
+          <w:bCs/>
+          <w:sz w:val="18"/>
+          <w:szCs w:val="18"/>
+        </w:rPr>
+        <w:t>}</w:t>
+      </w:r>
+      <w:r>
+        <w:rPr>
+          <w:rFonts w:cs="DejaVu Sans Condensed" w:ascii="DejaVu Sans Condensed" w:hAnsi="DejaVu Sans Condensed"/>
+          <w:sz w:val="18"/>
+          <w:szCs w:val="18"/>
+        </w:rPr>
+        <w:t xml:space="preserve"> (ΔΟΥ </w:t>
+      </w:r>
+      <w:r>
+        <w:rPr>
+          <w:rFonts w:cs="DejaVu Sans Condensed" w:ascii="DejaVu Sans Condensed" w:hAnsi="DejaVu Sans Condensed"/>
+          <w:b/>
+          <w:bCs/>
+          <w:sz w:val="18"/>
+          <w:szCs w:val="18"/>
+        </w:rPr>
+        <w:t>{_</w:t>
+      </w:r>
+      <w:r>
+        <w:rPr>
+          <w:rFonts w:cs="DejaVu Sans Condensed" w:ascii="DejaVu Sans Condensed" w:hAnsi="DejaVu Sans Condensed"/>
+          <w:b/>
+          <w:bCs/>
+          <w:sz w:val="18"/>
+          <w:szCs w:val="18"/>
+          <w:lang w:val="en-US"/>
+        </w:rPr>
+        <w:t>DOY_ETAIREIAS</w:t>
+      </w:r>
+      <w:r>
+        <w:rPr>
+          <w:rFonts w:cs="DejaVu Sans Condensed" w:ascii="DejaVu Sans Condensed" w:hAnsi="DejaVu Sans Condensed"/>
+          <w:b/>
+          <w:bCs/>
+          <w:sz w:val="18"/>
+          <w:szCs w:val="18"/>
+        </w:rPr>
+        <w:t>}</w:t>
+      </w:r>
+      <w:r>
+        <w:rPr>
+          <w:rFonts w:cs="DejaVu Sans Condensed" w:ascii="DejaVu Sans Condensed" w:hAnsi="DejaVu Sans Condensed"/>
+          <w:sz w:val="18"/>
+          <w:szCs w:val="18"/>
+        </w:rPr>
+        <w:t xml:space="preserve">), η οποία εκπροσωπείται νομίμως από τον/την </w:t>
+      </w:r>
+      <w:r>
+        <w:rPr>
+          <w:rFonts w:cs="DejaVu Sans Condensed" w:ascii="DejaVu Sans Condensed" w:hAnsi="DejaVu Sans Condensed"/>
+          <w:b/>
+          <w:bCs/>
+          <w:sz w:val="18"/>
+          <w:szCs w:val="18"/>
+        </w:rPr>
+        <w:t>{_</w:t>
+      </w:r>
+      <w:r>
+        <w:rPr>
+          <w:rFonts w:cs="DejaVu Sans Condensed" w:ascii="DejaVu Sans Condensed" w:hAnsi="DejaVu Sans Condensed"/>
+          <w:b/>
+          <w:bCs/>
+          <w:sz w:val="18"/>
+          <w:szCs w:val="18"/>
+          <w:lang w:val="en-US"/>
+        </w:rPr>
+        <w:t>EPONYMO</w:t>
+      </w:r>
+      <w:r>
+        <w:rPr>
+          <w:rFonts w:cs="DejaVu Sans Condensed" w:ascii="DejaVu Sans Condensed" w:hAnsi="DejaVu Sans Condensed"/>
+          <w:b/>
+          <w:bCs/>
+          <w:sz w:val="18"/>
+          <w:szCs w:val="18"/>
+        </w:rPr>
+        <w:t>_</w:t>
+      </w:r>
+      <w:r>
+        <w:rPr>
+          <w:rFonts w:cs="DejaVu Sans Condensed" w:ascii="DejaVu Sans Condensed" w:hAnsi="DejaVu Sans Condensed"/>
+          <w:b/>
+          <w:bCs/>
+          <w:sz w:val="18"/>
+          <w:szCs w:val="18"/>
+          <w:lang w:val="en-US"/>
+        </w:rPr>
+        <w:t>EKPROSOPOY</w:t>
+      </w:r>
+      <w:r>
+        <w:rPr>
+          <w:rFonts w:cs="DejaVu Sans Condensed" w:ascii="DejaVu Sans Condensed" w:hAnsi="DejaVu Sans Condensed"/>
+          <w:b/>
+          <w:bCs/>
+          <w:sz w:val="18"/>
+          <w:szCs w:val="18"/>
+        </w:rPr>
+        <w:t>}</w:t>
+      </w:r>
+      <w:r>
+        <w:rPr>
+          <w:rFonts w:cs="DejaVu Sans Condensed" w:ascii="DejaVu Sans Condensed" w:hAnsi="DejaVu Sans Condensed"/>
+          <w:sz w:val="18"/>
+          <w:szCs w:val="18"/>
+        </w:rPr>
+        <w:t xml:space="preserve"> </w:t>
+      </w:r>
+      <w:r>
+        <w:rPr>
+          <w:rFonts w:cs="DejaVu Sans Condensed" w:ascii="DejaVu Sans Condensed" w:hAnsi="DejaVu Sans Condensed"/>
+          <w:b/>
+          <w:bCs/>
+          <w:sz w:val="18"/>
+          <w:szCs w:val="18"/>
+        </w:rPr>
+        <w:t>{_</w:t>
+      </w:r>
+      <w:r>
+        <w:rPr>
+          <w:rFonts w:cs="DejaVu Sans Condensed" w:ascii="DejaVu Sans Condensed" w:hAnsi="DejaVu Sans Condensed"/>
+          <w:b/>
+          <w:bCs/>
+          <w:sz w:val="18"/>
+          <w:szCs w:val="18"/>
+          <w:lang w:val="en-US"/>
+        </w:rPr>
+        <w:t>ONOMA</w:t>
+      </w:r>
+      <w:r>
+        <w:rPr>
+          <w:rFonts w:cs="DejaVu Sans Condensed" w:ascii="DejaVu Sans Condensed" w:hAnsi="DejaVu Sans Condensed"/>
+          <w:b/>
+          <w:bCs/>
+          <w:sz w:val="18"/>
+          <w:szCs w:val="18"/>
+        </w:rPr>
+        <w:t>_</w:t>
+      </w:r>
+      <w:r>
+        <w:rPr>
+          <w:rFonts w:cs="DejaVu Sans Condensed" w:ascii="DejaVu Sans Condensed" w:hAnsi="DejaVu Sans Condensed"/>
+          <w:b/>
+          <w:bCs/>
+          <w:sz w:val="18"/>
+          <w:szCs w:val="18"/>
+          <w:lang w:val="en-US"/>
+        </w:rPr>
+        <w:t>EKPROSOPOY</w:t>
+      </w:r>
+      <w:r>
+        <w:rPr>
+          <w:rFonts w:cs="DejaVu Sans Condensed" w:ascii="DejaVu Sans Condensed" w:hAnsi="DejaVu Sans Condensed"/>
+          <w:b/>
+          <w:bCs/>
+          <w:sz w:val="18"/>
+          <w:szCs w:val="18"/>
+        </w:rPr>
+        <w:t>}</w:t>
+      </w:r>
+      <w:r>
+        <w:rPr>
+          <w:rFonts w:cs="DejaVu Sans Condensed" w:ascii="DejaVu Sans Condensed" w:hAnsi="DejaVu Sans Condensed"/>
+          <w:sz w:val="18"/>
+          <w:szCs w:val="18"/>
+        </w:rPr>
+        <w:t xml:space="preserve"> του </w:t>
+      </w:r>
+      <w:r>
+        <w:rPr>
+          <w:rFonts w:cs="DejaVu Sans Condensed" w:ascii="DejaVu Sans Condensed" w:hAnsi="DejaVu Sans Condensed"/>
+          <w:b/>
+          <w:bCs/>
+          <w:sz w:val="18"/>
+          <w:szCs w:val="18"/>
+        </w:rPr>
+        <w:t>{_PATRONYMO_EKPROSOPOY}</w:t>
+      </w:r>
+      <w:r>
+        <w:rPr>
+          <w:rFonts w:cs="DejaVu Sans Condensed" w:ascii="DejaVu Sans Condensed" w:hAnsi="DejaVu Sans Condensed"/>
+          <w:sz w:val="18"/>
+          <w:szCs w:val="18"/>
+        </w:rPr>
+        <w:t xml:space="preserve">, κάτοχο του </w:t>
+      </w:r>
+      <w:r>
+        <w:rPr>
+          <w:rFonts w:cs="DejaVu Sans Condensed" w:ascii="DejaVu Sans Condensed" w:hAnsi="DejaVu Sans Condensed"/>
+          <w:b/>
+          <w:bCs/>
+          <w:sz w:val="18"/>
+          <w:szCs w:val="18"/>
+        </w:rPr>
+        <w:t>{_</w:t>
+      </w:r>
+      <w:r>
+        <w:rPr>
+          <w:rFonts w:cs="DejaVu Sans Condensed" w:ascii="DejaVu Sans Condensed" w:hAnsi="DejaVu Sans Condensed"/>
+          <w:b/>
+          <w:bCs/>
+          <w:sz w:val="18"/>
+          <w:szCs w:val="18"/>
+          <w:lang w:val="en-US"/>
+        </w:rPr>
+        <w:t>DT</w:t>
+      </w:r>
+      <w:r>
+        <w:rPr>
+          <w:rFonts w:cs="DejaVu Sans Condensed" w:ascii="DejaVu Sans Condensed" w:hAnsi="DejaVu Sans Condensed"/>
+          <w:b/>
+          <w:bCs/>
+          <w:sz w:val="18"/>
+          <w:szCs w:val="18"/>
+        </w:rPr>
+        <w:t>_</w:t>
+      </w:r>
+      <w:r>
+        <w:rPr>
+          <w:rFonts w:cs="DejaVu Sans Condensed" w:ascii="DejaVu Sans Condensed" w:hAnsi="DejaVu Sans Condensed"/>
+          <w:b/>
+          <w:bCs/>
+          <w:sz w:val="18"/>
+          <w:szCs w:val="18"/>
+          <w:lang w:val="en-US"/>
+        </w:rPr>
+        <w:t>EKPROSOPOY</w:t>
+      </w:r>
+      <w:r>
+        <w:rPr>
+          <w:rFonts w:cs="DejaVu Sans Condensed" w:ascii="DejaVu Sans Condensed" w:hAnsi="DejaVu Sans Condensed"/>
+          <w:b/>
+          <w:bCs/>
+          <w:sz w:val="18"/>
+          <w:szCs w:val="18"/>
+        </w:rPr>
+        <w:t>}</w:t>
+      </w:r>
+      <w:r>
+        <w:rPr>
+          <w:rFonts w:cs="DejaVu Sans Condensed" w:ascii="DejaVu Sans Condensed" w:hAnsi="DejaVu Sans Condensed"/>
+          <w:sz w:val="18"/>
+          <w:szCs w:val="18"/>
+        </w:rPr>
+        <w:t xml:space="preserve"> με αριθμό </w:t>
+      </w:r>
+      <w:r>
+        <w:rPr>
+          <w:rFonts w:cs="DejaVu Sans Condensed" w:ascii="DejaVu Sans Condensed" w:hAnsi="DejaVu Sans Condensed"/>
+          <w:b/>
+          <w:bCs/>
+          <w:sz w:val="18"/>
+          <w:szCs w:val="18"/>
+        </w:rPr>
+        <w:t>{_</w:t>
+      </w:r>
+      <w:r>
+        <w:rPr>
+          <w:rFonts w:cs="DejaVu Sans Condensed" w:ascii="DejaVu Sans Condensed" w:hAnsi="DejaVu Sans Condensed"/>
+          <w:b/>
+          <w:bCs/>
+          <w:sz w:val="18"/>
+          <w:szCs w:val="18"/>
+          <w:lang w:val="en-US"/>
+        </w:rPr>
+        <w:t>ADT</w:t>
+      </w:r>
+      <w:r>
+        <w:rPr>
+          <w:rFonts w:cs="DejaVu Sans Condensed" w:ascii="DejaVu Sans Condensed" w:hAnsi="DejaVu Sans Condensed"/>
+          <w:b/>
+          <w:bCs/>
+          <w:sz w:val="18"/>
+          <w:szCs w:val="18"/>
+        </w:rPr>
+        <w:t>_</w:t>
+      </w:r>
+      <w:r>
+        <w:rPr>
+          <w:rFonts w:cs="DejaVu Sans Condensed" w:ascii="DejaVu Sans Condensed" w:hAnsi="DejaVu Sans Condensed"/>
+          <w:b/>
+          <w:bCs/>
+          <w:sz w:val="18"/>
+          <w:szCs w:val="18"/>
+          <w:lang w:val="en-US"/>
+        </w:rPr>
+        <w:t>EKPROSOPOY</w:t>
+      </w:r>
+      <w:r>
+        <w:rPr>
+          <w:rFonts w:cs="DejaVu Sans Condensed" w:ascii="DejaVu Sans Condensed" w:hAnsi="DejaVu Sans Condensed"/>
+          <w:b/>
+          <w:bCs/>
+          <w:sz w:val="18"/>
+          <w:szCs w:val="18"/>
+        </w:rPr>
+        <w:t>}</w:t>
+      </w:r>
+      <w:r>
+        <w:rPr>
+          <w:rFonts w:cs="DejaVu Sans Condensed" w:ascii="DejaVu Sans Condensed" w:hAnsi="DejaVu Sans Condensed"/>
+          <w:sz w:val="18"/>
+          <w:szCs w:val="18"/>
+        </w:rPr>
+        <w:t xml:space="preserve">,  </w:t>
+      </w:r>
+      <w:bookmarkStart w:id="1" w:name="_Hlk161056572"/>
+      <w:r>
+        <w:rPr>
+          <w:rFonts w:cs="DejaVu Sans Condensed" w:ascii="DejaVu Sans Condensed" w:hAnsi="DejaVu Sans Condensed"/>
+          <w:sz w:val="18"/>
+          <w:szCs w:val="18"/>
+        </w:rPr>
+        <w:t xml:space="preserve">ΑΦΜ </w:t>
+      </w:r>
+      <w:r>
+        <w:rPr>
+          <w:rFonts w:cs="DejaVu Sans Condensed" w:ascii="DejaVu Sans Condensed" w:hAnsi="DejaVu Sans Condensed"/>
+          <w:b/>
+          <w:bCs/>
+          <w:sz w:val="18"/>
+          <w:szCs w:val="18"/>
+        </w:rPr>
+        <w:t>{_</w:t>
+      </w:r>
+      <w:r>
+        <w:rPr>
+          <w:rFonts w:cs="DejaVu Sans Condensed" w:ascii="DejaVu Sans Condensed" w:hAnsi="DejaVu Sans Condensed"/>
+          <w:b/>
+          <w:bCs/>
           <w:sz w:val="18"/>
           <w:szCs w:val="18"/>
           <w:lang w:val="en-US"/>
@@ -345,48 +760,18 @@
       <w:r>
         <w:rPr>
           <w:rFonts w:cs="DejaVu Sans Condensed" w:ascii="DejaVu Sans Condensed" w:hAnsi="DejaVu Sans Condensed"/>
-          <w:sz w:val="18"/>
-          <w:szCs w:val="18"/>
-        </w:rPr>
-        <w:t>} (ΔΟΥ {_</w:t>
-      </w:r>
-      <w:r>
-        <w:rPr>
-          <w:rFonts w:cs="DejaVu Sans Condensed" w:ascii="DejaVu Sans Condensed" w:hAnsi="DejaVu Sans Condensed"/>
-          <w:sz w:val="18"/>
-          <w:szCs w:val="18"/>
-          <w:lang w:val="en-US"/>
-        </w:rPr>
-        <w:t>DOY</w:t>
-      </w:r>
-      <w:r>
-        <w:rPr>
-          <w:rFonts w:cs="DejaVu Sans Condensed" w:ascii="DejaVu Sans Condensed" w:hAnsi="DejaVu Sans Condensed"/>
-          <w:sz w:val="18"/>
-          <w:szCs w:val="18"/>
-        </w:rPr>
-        <w:t>}), η οποία εκπροσωπείται νομίμως από τον/την {_</w:t>
-      </w:r>
-      <w:r>
-        <w:rPr>
-          <w:rFonts w:cs="DejaVu Sans Condensed" w:ascii="DejaVu Sans Condensed" w:hAnsi="DejaVu Sans Condensed"/>
-          <w:sz w:val="18"/>
-          <w:szCs w:val="18"/>
-          <w:lang w:val="en-US"/>
-        </w:rPr>
-        <w:t>EPONYMO</w:t>
-      </w:r>
-      <w:r>
-        <w:rPr>
-          <w:rFonts w:cs="DejaVu Sans Condensed" w:ascii="DejaVu Sans Condensed" w:hAnsi="DejaVu Sans Condensed"/>
-          <w:sz w:val="18"/>
-          <w:szCs w:val="18"/>
-        </w:rPr>
-        <w:t>_</w:t>
-      </w:r>
-      <w:r>
-        <w:rPr>
-          <w:rFonts w:cs="DejaVu Sans Condensed" w:ascii="DejaVu Sans Condensed" w:hAnsi="DejaVu Sans Condensed"/>
+          <w:b/>
+          <w:bCs/>
+          <w:sz w:val="18"/>
+          <w:szCs w:val="18"/>
+        </w:rPr>
+        <w:t>_</w:t>
+      </w:r>
+      <w:r>
+        <w:rPr>
+          <w:rFonts w:cs="DejaVu Sans Condensed" w:ascii="DejaVu Sans Condensed" w:hAnsi="DejaVu Sans Condensed"/>
+          <w:b/>
+          <w:bCs/>
           <w:sz w:val="18"/>
           <w:szCs w:val="18"/>
           <w:lang w:val="en-US"/>
@@ -396,155 +781,20 @@
       <w:r>
         <w:rPr>
           <w:rFonts w:cs="DejaVu Sans Condensed" w:ascii="DejaVu Sans Condensed" w:hAnsi="DejaVu Sans Condensed"/>
-          <w:sz w:val="18"/>
-          <w:szCs w:val="18"/>
-        </w:rPr>
-        <w:t>} {_</w:t>
-      </w:r>
-      <w:r>
-        <w:rPr>
-          <w:rFonts w:cs="DejaVu Sans Condensed" w:ascii="DejaVu Sans Condensed" w:hAnsi="DejaVu Sans Condensed"/>
-          <w:sz w:val="18"/>
-          <w:szCs w:val="18"/>
-          <w:lang w:val="en-US"/>
-        </w:rPr>
-        <w:t>ONOMA</w:t>
-      </w:r>
-      <w:r>
-        <w:rPr>
-          <w:rFonts w:cs="DejaVu Sans Condensed" w:ascii="DejaVu Sans Condensed" w:hAnsi="DejaVu Sans Condensed"/>
-          <w:sz w:val="18"/>
-          <w:szCs w:val="18"/>
-        </w:rPr>
-        <w:t>_</w:t>
-      </w:r>
-      <w:r>
-        <w:rPr>
-          <w:rFonts w:cs="DejaVu Sans Condensed" w:ascii="DejaVu Sans Condensed" w:hAnsi="DejaVu Sans Condensed"/>
-          <w:sz w:val="18"/>
-          <w:szCs w:val="18"/>
-          <w:lang w:val="en-US"/>
-        </w:rPr>
-        <w:t>EKPROSOPOY</w:t>
-      </w:r>
-      <w:r>
-        <w:rPr>
-          <w:rFonts w:cs="DejaVu Sans Condensed" w:ascii="DejaVu Sans Condensed" w:hAnsi="DejaVu Sans Condensed"/>
-          <w:sz w:val="18"/>
-          <w:szCs w:val="18"/>
-        </w:rPr>
-        <w:t>}, κάτοχο του {_</w:t>
-      </w:r>
-      <w:r>
-        <w:rPr>
-          <w:rFonts w:cs="DejaVu Sans Condensed" w:ascii="DejaVu Sans Condensed" w:hAnsi="DejaVu Sans Condensed"/>
-          <w:sz w:val="18"/>
-          <w:szCs w:val="18"/>
-          <w:lang w:val="en-US"/>
-        </w:rPr>
-        <w:t>DT</w:t>
-      </w:r>
-      <w:r>
-        <w:rPr>
-          <w:rFonts w:cs="DejaVu Sans Condensed" w:ascii="DejaVu Sans Condensed" w:hAnsi="DejaVu Sans Condensed"/>
-          <w:sz w:val="18"/>
-          <w:szCs w:val="18"/>
-        </w:rPr>
-        <w:t>_</w:t>
-      </w:r>
-      <w:r>
-        <w:rPr>
-          <w:rFonts w:cs="DejaVu Sans Condensed" w:ascii="DejaVu Sans Condensed" w:hAnsi="DejaVu Sans Condensed"/>
-          <w:sz w:val="18"/>
-          <w:szCs w:val="18"/>
-          <w:lang w:val="en-US"/>
-        </w:rPr>
-        <w:t>EKPROSOPOY</w:t>
-      </w:r>
-      <w:r>
-        <w:rPr>
-          <w:rFonts w:cs="DejaVu Sans Condensed" w:ascii="DejaVu Sans Condensed" w:hAnsi="DejaVu Sans Condensed"/>
-          <w:sz w:val="18"/>
-          <w:szCs w:val="18"/>
-        </w:rPr>
-        <w:t>} με αριθμό {_</w:t>
-      </w:r>
-      <w:r>
-        <w:rPr>
-          <w:rFonts w:cs="DejaVu Sans Condensed" w:ascii="DejaVu Sans Condensed" w:hAnsi="DejaVu Sans Condensed"/>
-          <w:sz w:val="18"/>
-          <w:szCs w:val="18"/>
-          <w:lang w:val="en-US"/>
-        </w:rPr>
-        <w:t>ADT</w:t>
-      </w:r>
-      <w:r>
-        <w:rPr>
-          <w:rFonts w:cs="DejaVu Sans Condensed" w:ascii="DejaVu Sans Condensed" w:hAnsi="DejaVu Sans Condensed"/>
-          <w:sz w:val="18"/>
-          <w:szCs w:val="18"/>
-        </w:rPr>
-        <w:t>_</w:t>
-      </w:r>
-      <w:r>
-        <w:rPr>
-          <w:rFonts w:cs="DejaVu Sans Condensed" w:ascii="DejaVu Sans Condensed" w:hAnsi="DejaVu Sans Condensed"/>
-          <w:sz w:val="18"/>
-          <w:szCs w:val="18"/>
-          <w:lang w:val="en-US"/>
-        </w:rPr>
-        <w:t>EKPROSOPOY</w:t>
-      </w:r>
-      <w:r>
-        <w:rPr>
-          <w:rFonts w:cs="DejaVu Sans Condensed" w:ascii="DejaVu Sans Condensed" w:hAnsi="DejaVu Sans Condensed"/>
-          <w:sz w:val="18"/>
-          <w:szCs w:val="18"/>
-        </w:rPr>
-        <w:t xml:space="preserve">},  </w:t>
-      </w:r>
-      <w:bookmarkStart w:id="1" w:name="_Hlk161056572"/>
-      <w:r>
-        <w:rPr>
-          <w:rFonts w:cs="DejaVu Sans Condensed" w:ascii="DejaVu Sans Condensed" w:hAnsi="DejaVu Sans Condensed"/>
-          <w:sz w:val="18"/>
-          <w:szCs w:val="18"/>
-        </w:rPr>
-        <w:t>ΑΦΜ {_</w:t>
-      </w:r>
-      <w:r>
-        <w:rPr>
-          <w:rFonts w:cs="DejaVu Sans Condensed" w:ascii="DejaVu Sans Condensed" w:hAnsi="DejaVu Sans Condensed"/>
-          <w:sz w:val="18"/>
-          <w:szCs w:val="18"/>
-          <w:lang w:val="en-US"/>
-        </w:rPr>
-        <w:t>AFM</w:t>
-      </w:r>
-      <w:r>
-        <w:rPr>
-          <w:rFonts w:cs="DejaVu Sans Condensed" w:ascii="DejaVu Sans Condensed" w:hAnsi="DejaVu Sans Condensed"/>
-          <w:sz w:val="18"/>
-          <w:szCs w:val="18"/>
-        </w:rPr>
-        <w:t>_</w:t>
-      </w:r>
-      <w:r>
-        <w:rPr>
-          <w:rFonts w:cs="DejaVu Sans Condensed" w:ascii="DejaVu Sans Condensed" w:hAnsi="DejaVu Sans Condensed"/>
-          <w:sz w:val="18"/>
-          <w:szCs w:val="18"/>
-          <w:lang w:val="en-US"/>
-        </w:rPr>
-        <w:t>EKPROSOPOY</w:t>
-      </w:r>
-      <w:r>
-        <w:rPr>
-          <w:rFonts w:cs="DejaVu Sans Condensed" w:ascii="DejaVu Sans Condensed" w:hAnsi="DejaVu Sans Condensed"/>
-          <w:sz w:val="18"/>
-          <w:szCs w:val="18"/>
-        </w:rPr>
-        <w:t>} τηλ. {_</w:t>
+          <w:b/>
+          <w:bCs/>
+          <w:sz w:val="18"/>
+          <w:szCs w:val="18"/>
+        </w:rPr>
+        <w:t>}</w:t>
+      </w:r>
+      <w:r>
+        <w:rPr>
+          <w:rFonts w:cs="DejaVu Sans Condensed" w:ascii="DejaVu Sans Condensed" w:hAnsi="DejaVu Sans Condensed"/>
+          <w:sz w:val="18"/>
+          <w:szCs w:val="18"/>
+        </w:rPr>
+        <w:t xml:space="preserve"> τηλ. {_</w:t>
       </w:r>
       <w:r>
         <w:rPr>
@@ -801,11 +1051,23 @@
           <w:sz w:val="18"/>
           <w:szCs w:val="18"/>
         </w:rPr>
-        <w:t>}, του {_</w:t>
-      </w:r>
-      <w:r>
-        <w:rPr>
-          <w:rFonts w:cs="DejaVu Sans Condensed" w:ascii="DejaVu Sans Condensed" w:hAnsi="DejaVu Sans Condensed"/>
+        <w:t xml:space="preserve">}, του </w:t>
+      </w:r>
+      <w:r>
+        <w:rPr>
+          <w:rFonts w:cs="DejaVu Sans Condensed" w:ascii="DejaVu Sans Condensed" w:hAnsi="DejaVu Sans Condensed"/>
+          <w:b/>
+          <w:bCs/>
+          <w:sz w:val="18"/>
+          <w:szCs w:val="18"/>
+        </w:rPr>
+        <w:t>{_</w:t>
+      </w:r>
+      <w:r>
+        <w:rPr>
+          <w:rFonts w:cs="DejaVu Sans Condensed" w:ascii="DejaVu Sans Condensed" w:hAnsi="DejaVu Sans Condensed"/>
+          <w:b/>
+          <w:bCs/>
           <w:sz w:val="18"/>
           <w:szCs w:val="18"/>
           <w:lang w:val="en-US"/>
@@ -815,14 +1077,18 @@
       <w:r>
         <w:rPr>
           <w:rFonts w:cs="DejaVu Sans Condensed" w:ascii="DejaVu Sans Condensed" w:hAnsi="DejaVu Sans Condensed"/>
-          <w:sz w:val="18"/>
-          <w:szCs w:val="18"/>
-        </w:rPr>
-        <w:t>_</w:t>
-      </w:r>
-      <w:r>
-        <w:rPr>
-          <w:rFonts w:cs="DejaVu Sans Condensed" w:ascii="DejaVu Sans Condensed" w:hAnsi="DejaVu Sans Condensed"/>
+          <w:b/>
+          <w:bCs/>
+          <w:sz w:val="18"/>
+          <w:szCs w:val="18"/>
+        </w:rPr>
+        <w:t>_</w:t>
+      </w:r>
+      <w:r>
+        <w:rPr>
+          <w:rFonts w:cs="DejaVu Sans Condensed" w:ascii="DejaVu Sans Condensed" w:hAnsi="DejaVu Sans Condensed"/>
+          <w:b/>
+          <w:bCs/>
           <w:sz w:val="18"/>
           <w:szCs w:val="18"/>
           <w:lang w:val="en-US"/>
@@ -832,14 +1098,36 @@
       <w:r>
         <w:rPr>
           <w:rFonts w:cs="DejaVu Sans Condensed" w:ascii="DejaVu Sans Condensed" w:hAnsi="DejaVu Sans Condensed"/>
-          <w:sz w:val="18"/>
-          <w:szCs w:val="18"/>
-        </w:rPr>
-        <w:t>}, κάτοικος Δ.Δ. {_</w:t>
-      </w:r>
-      <w:r>
-        <w:rPr>
-          <w:rFonts w:cs="DejaVu Sans Condensed" w:ascii="DejaVu Sans Condensed" w:hAnsi="DejaVu Sans Condensed"/>
+          <w:b/>
+          <w:bCs/>
+          <w:sz w:val="18"/>
+          <w:szCs w:val="18"/>
+        </w:rPr>
+        <w:t>}</w:t>
+      </w:r>
+      <w:r>
+        <w:rPr>
+          <w:rFonts w:cs="DejaVu Sans Condensed" w:ascii="DejaVu Sans Condensed" w:hAnsi="DejaVu Sans Condensed"/>
+          <w:sz w:val="18"/>
+          <w:szCs w:val="18"/>
+        </w:rPr>
+        <w:t xml:space="preserve">, κάτοικος Δ.Δ. </w:t>
+      </w:r>
+      <w:r>
+        <w:rPr>
+          <w:rFonts w:cs="DejaVu Sans Condensed" w:ascii="DejaVu Sans Condensed" w:hAnsi="DejaVu Sans Condensed"/>
+          <w:b/>
+          <w:bCs/>
+          <w:sz w:val="18"/>
+          <w:szCs w:val="18"/>
+        </w:rPr>
+        <w:t>{_</w:t>
+      </w:r>
+      <w:r>
+        <w:rPr>
+          <w:rFonts w:cs="DejaVu Sans Condensed" w:ascii="DejaVu Sans Condensed" w:hAnsi="DejaVu Sans Condensed"/>
+          <w:b/>
+          <w:bCs/>
           <w:sz w:val="18"/>
           <w:szCs w:val="18"/>
           <w:lang w:val="en-US"/>
@@ -849,14 +1137,18 @@
       <w:r>
         <w:rPr>
           <w:rFonts w:cs="DejaVu Sans Condensed" w:ascii="DejaVu Sans Condensed" w:hAnsi="DejaVu Sans Condensed"/>
-          <w:sz w:val="18"/>
-          <w:szCs w:val="18"/>
-        </w:rPr>
-        <w:t>_</w:t>
-      </w:r>
-      <w:r>
-        <w:rPr>
-          <w:rFonts w:cs="DejaVu Sans Condensed" w:ascii="DejaVu Sans Condensed" w:hAnsi="DejaVu Sans Condensed"/>
+          <w:b/>
+          <w:bCs/>
+          <w:sz w:val="18"/>
+          <w:szCs w:val="18"/>
+        </w:rPr>
+        <w:t>_</w:t>
+      </w:r>
+      <w:r>
+        <w:rPr>
+          <w:rFonts w:cs="DejaVu Sans Condensed" w:ascii="DejaVu Sans Condensed" w:hAnsi="DejaVu Sans Condensed"/>
+          <w:b/>
+          <w:bCs/>
           <w:sz w:val="18"/>
           <w:szCs w:val="18"/>
           <w:lang w:val="en-US"/>
@@ -866,14 +1158,40 @@
       <w:r>
         <w:rPr>
           <w:rFonts w:cs="DejaVu Sans Condensed" w:ascii="DejaVu Sans Condensed" w:hAnsi="DejaVu Sans Condensed"/>
-          <w:sz w:val="18"/>
-          <w:szCs w:val="18"/>
-        </w:rPr>
-        <w:t>} (οδός {_</w:t>
-      </w:r>
-      <w:r>
-        <w:rPr>
-          <w:rFonts w:cs="DejaVu Sans Condensed" w:ascii="DejaVu Sans Condensed" w:hAnsi="DejaVu Sans Condensed"/>
+          <w:b/>
+          <w:bCs/>
+          <w:sz w:val="18"/>
+          <w:szCs w:val="18"/>
+        </w:rPr>
+        <w:t>}</w:t>
+      </w:r>
+      <w:r>
+        <w:rPr>
+          <w:rFonts w:cs="DejaVu Sans Condensed" w:ascii="DejaVu Sans Condensed" w:hAnsi="DejaVu Sans Condensed"/>
+          <w:sz w:val="18"/>
+          <w:szCs w:val="18"/>
+        </w:rPr>
+        <w:t xml:space="preserve"> (οδός </w:t>
+      </w:r>
+      <w:r>
+        <w:rPr>
+          <w:rFonts w:cs="DejaVu Sans Condensed" w:ascii="DejaVu Sans Condensed" w:hAnsi="DejaVu Sans Condensed"/>
+          <w:b/>
+          <w:bCs/>
+          <w:i/>
+          <w:iCs/>
+          <w:sz w:val="18"/>
+          <w:szCs w:val="18"/>
+        </w:rPr>
+        <w:t>{_</w:t>
+      </w:r>
+      <w:r>
+        <w:rPr>
+          <w:rFonts w:cs="DejaVu Sans Condensed" w:ascii="DejaVu Sans Condensed" w:hAnsi="DejaVu Sans Condensed"/>
+          <w:b/>
+          <w:bCs/>
+          <w:i/>
+          <w:iCs/>
           <w:sz w:val="18"/>
           <w:szCs w:val="18"/>
           <w:lang w:val="en-US"/>
@@ -883,14 +1201,22 @@
       <w:r>
         <w:rPr>
           <w:rFonts w:cs="DejaVu Sans Condensed" w:ascii="DejaVu Sans Condensed" w:hAnsi="DejaVu Sans Condensed"/>
-          <w:sz w:val="18"/>
-          <w:szCs w:val="18"/>
-        </w:rPr>
-        <w:t>_</w:t>
-      </w:r>
-      <w:r>
-        <w:rPr>
-          <w:rFonts w:cs="DejaVu Sans Condensed" w:ascii="DejaVu Sans Condensed" w:hAnsi="DejaVu Sans Condensed"/>
+          <w:b/>
+          <w:bCs/>
+          <w:i/>
+          <w:iCs/>
+          <w:sz w:val="18"/>
+          <w:szCs w:val="18"/>
+        </w:rPr>
+        <w:t>_</w:t>
+      </w:r>
+      <w:r>
+        <w:rPr>
+          <w:rFonts w:cs="DejaVu Sans Condensed" w:ascii="DejaVu Sans Condensed" w:hAnsi="DejaVu Sans Condensed"/>
+          <w:b/>
+          <w:bCs/>
+          <w:i/>
+          <w:iCs/>
           <w:sz w:val="18"/>
           <w:szCs w:val="18"/>
           <w:lang w:val="en-US"/>
@@ -900,14 +1226,38 @@
       <w:r>
         <w:rPr>
           <w:rFonts w:cs="DejaVu Sans Condensed" w:ascii="DejaVu Sans Condensed" w:hAnsi="DejaVu Sans Condensed"/>
-          <w:sz w:val="18"/>
-          <w:szCs w:val="18"/>
-        </w:rPr>
-        <w:t>} αρ. {_</w:t>
-      </w:r>
-      <w:r>
-        <w:rPr>
-          <w:rFonts w:cs="DejaVu Sans Condensed" w:ascii="DejaVu Sans Condensed" w:hAnsi="DejaVu Sans Condensed"/>
+          <w:b/>
+          <w:bCs/>
+          <w:i/>
+          <w:iCs/>
+          <w:sz w:val="18"/>
+          <w:szCs w:val="18"/>
+        </w:rPr>
+        <w:t>}</w:t>
+      </w:r>
+      <w:r>
+        <w:rPr>
+          <w:rFonts w:cs="DejaVu Sans Condensed" w:ascii="DejaVu Sans Condensed" w:hAnsi="DejaVu Sans Condensed"/>
+          <w:sz w:val="18"/>
+          <w:szCs w:val="18"/>
+        </w:rPr>
+        <w:t xml:space="preserve"> αρ. </w:t>
+      </w:r>
+      <w:r>
+        <w:rPr>
+          <w:rFonts w:cs="DejaVu Sans Condensed" w:ascii="DejaVu Sans Condensed" w:hAnsi="DejaVu Sans Condensed"/>
+          <w:b/>
+          <w:bCs/>
+          <w:sz w:val="18"/>
+          <w:szCs w:val="18"/>
+        </w:rPr>
+        <w:t>{_</w:t>
+      </w:r>
+      <w:r>
+        <w:rPr>
+          <w:rFonts w:cs="DejaVu Sans Condensed" w:ascii="DejaVu Sans Condensed" w:hAnsi="DejaVu Sans Condensed"/>
+          <w:b/>
+          <w:bCs/>
           <w:sz w:val="18"/>
           <w:szCs w:val="18"/>
           <w:lang w:val="en-US"/>
@@ -917,14 +1267,18 @@
       <w:r>
         <w:rPr>
           <w:rFonts w:cs="DejaVu Sans Condensed" w:ascii="DejaVu Sans Condensed" w:hAnsi="DejaVu Sans Condensed"/>
-          <w:sz w:val="18"/>
-          <w:szCs w:val="18"/>
-        </w:rPr>
-        <w:t>_</w:t>
-      </w:r>
-      <w:r>
-        <w:rPr>
-          <w:rFonts w:cs="DejaVu Sans Condensed" w:ascii="DejaVu Sans Condensed" w:hAnsi="DejaVu Sans Condensed"/>
+          <w:b/>
+          <w:bCs/>
+          <w:sz w:val="18"/>
+          <w:szCs w:val="18"/>
+        </w:rPr>
+        <w:t>_</w:t>
+      </w:r>
+      <w:r>
+        <w:rPr>
+          <w:rFonts w:cs="DejaVu Sans Condensed" w:ascii="DejaVu Sans Condensed" w:hAnsi="DejaVu Sans Condensed"/>
+          <w:b/>
+          <w:bCs/>
           <w:sz w:val="18"/>
           <w:szCs w:val="18"/>
           <w:lang w:val="en-US"/>
@@ -934,14 +1288,36 @@
       <w:r>
         <w:rPr>
           <w:rFonts w:cs="DejaVu Sans Condensed" w:ascii="DejaVu Sans Condensed" w:hAnsi="DejaVu Sans Condensed"/>
-          <w:sz w:val="18"/>
-          <w:szCs w:val="18"/>
-        </w:rPr>
-        <w:t>}, κάτοχος του {_</w:t>
-      </w:r>
-      <w:r>
-        <w:rPr>
-          <w:rFonts w:cs="DejaVu Sans Condensed" w:ascii="DejaVu Sans Condensed" w:hAnsi="DejaVu Sans Condensed"/>
+          <w:b/>
+          <w:bCs/>
+          <w:sz w:val="18"/>
+          <w:szCs w:val="18"/>
+        </w:rPr>
+        <w:t>}</w:t>
+      </w:r>
+      <w:r>
+        <w:rPr>
+          <w:rFonts w:cs="DejaVu Sans Condensed" w:ascii="DejaVu Sans Condensed" w:hAnsi="DejaVu Sans Condensed"/>
+          <w:sz w:val="18"/>
+          <w:szCs w:val="18"/>
+        </w:rPr>
+        <w:t xml:space="preserve">), κάτοχος του </w:t>
+      </w:r>
+      <w:r>
+        <w:rPr>
+          <w:rFonts w:cs="DejaVu Sans Condensed" w:ascii="DejaVu Sans Condensed" w:hAnsi="DejaVu Sans Condensed"/>
+          <w:b/>
+          <w:bCs/>
+          <w:sz w:val="18"/>
+          <w:szCs w:val="18"/>
+        </w:rPr>
+        <w:t>{_</w:t>
+      </w:r>
+      <w:r>
+        <w:rPr>
+          <w:rFonts w:cs="DejaVu Sans Condensed" w:ascii="DejaVu Sans Condensed" w:hAnsi="DejaVu Sans Condensed"/>
+          <w:b/>
+          <w:bCs/>
           <w:sz w:val="18"/>
           <w:szCs w:val="18"/>
           <w:lang w:val="en-US"/>
@@ -951,14 +1327,18 @@
       <w:r>
         <w:rPr>
           <w:rFonts w:cs="DejaVu Sans Condensed" w:ascii="DejaVu Sans Condensed" w:hAnsi="DejaVu Sans Condensed"/>
-          <w:sz w:val="18"/>
-          <w:szCs w:val="18"/>
-        </w:rPr>
-        <w:t>_</w:t>
-      </w:r>
-      <w:r>
-        <w:rPr>
-          <w:rFonts w:cs="DejaVu Sans Condensed" w:ascii="DejaVu Sans Condensed" w:hAnsi="DejaVu Sans Condensed"/>
+          <w:b/>
+          <w:bCs/>
+          <w:sz w:val="18"/>
+          <w:szCs w:val="18"/>
+        </w:rPr>
+        <w:t>_</w:t>
+      </w:r>
+      <w:r>
+        <w:rPr>
+          <w:rFonts w:cs="DejaVu Sans Condensed" w:ascii="DejaVu Sans Condensed" w:hAnsi="DejaVu Sans Condensed"/>
+          <w:b/>
+          <w:bCs/>
           <w:sz w:val="18"/>
           <w:szCs w:val="18"/>
           <w:lang w:val="en-US"/>
@@ -968,14 +1348,36 @@
       <w:r>
         <w:rPr>
           <w:rFonts w:cs="DejaVu Sans Condensed" w:ascii="DejaVu Sans Condensed" w:hAnsi="DejaVu Sans Condensed"/>
-          <w:sz w:val="18"/>
-          <w:szCs w:val="18"/>
-        </w:rPr>
-        <w:t>} με αριθμό {_</w:t>
-      </w:r>
-      <w:r>
-        <w:rPr>
-          <w:rFonts w:cs="DejaVu Sans Condensed" w:ascii="DejaVu Sans Condensed" w:hAnsi="DejaVu Sans Condensed"/>
+          <w:b/>
+          <w:bCs/>
+          <w:sz w:val="18"/>
+          <w:szCs w:val="18"/>
+        </w:rPr>
+        <w:t>}</w:t>
+      </w:r>
+      <w:r>
+        <w:rPr>
+          <w:rFonts w:cs="DejaVu Sans Condensed" w:ascii="DejaVu Sans Condensed" w:hAnsi="DejaVu Sans Condensed"/>
+          <w:sz w:val="18"/>
+          <w:szCs w:val="18"/>
+        </w:rPr>
+        <w:t xml:space="preserve"> με αριθμό </w:t>
+      </w:r>
+      <w:r>
+        <w:rPr>
+          <w:rFonts w:cs="DejaVu Sans Condensed" w:ascii="DejaVu Sans Condensed" w:hAnsi="DejaVu Sans Condensed"/>
+          <w:b/>
+          <w:bCs/>
+          <w:sz w:val="18"/>
+          <w:szCs w:val="18"/>
+        </w:rPr>
+        <w:t>{_</w:t>
+      </w:r>
+      <w:r>
+        <w:rPr>
+          <w:rFonts w:cs="DejaVu Sans Condensed" w:ascii="DejaVu Sans Condensed" w:hAnsi="DejaVu Sans Condensed"/>
+          <w:b/>
+          <w:bCs/>
           <w:sz w:val="18"/>
           <w:szCs w:val="18"/>
           <w:lang w:val="en-US"/>
@@ -985,14 +1387,18 @@
       <w:r>
         <w:rPr>
           <w:rFonts w:cs="DejaVu Sans Condensed" w:ascii="DejaVu Sans Condensed" w:hAnsi="DejaVu Sans Condensed"/>
-          <w:sz w:val="18"/>
-          <w:szCs w:val="18"/>
-        </w:rPr>
-        <w:t>_</w:t>
-      </w:r>
-      <w:r>
-        <w:rPr>
-          <w:rFonts w:cs="DejaVu Sans Condensed" w:ascii="DejaVu Sans Condensed" w:hAnsi="DejaVu Sans Condensed"/>
+          <w:b/>
+          <w:bCs/>
+          <w:sz w:val="18"/>
+          <w:szCs w:val="18"/>
+        </w:rPr>
+        <w:t>_</w:t>
+      </w:r>
+      <w:r>
+        <w:rPr>
+          <w:rFonts w:cs="DejaVu Sans Condensed" w:ascii="DejaVu Sans Condensed" w:hAnsi="DejaVu Sans Condensed"/>
+          <w:b/>
+          <w:bCs/>
           <w:sz w:val="18"/>
           <w:szCs w:val="18"/>
           <w:lang w:val="en-US"/>
@@ -1002,14 +1408,36 @@
       <w:r>
         <w:rPr>
           <w:rFonts w:cs="DejaVu Sans Condensed" w:ascii="DejaVu Sans Condensed" w:hAnsi="DejaVu Sans Condensed"/>
-          <w:sz w:val="18"/>
-          <w:szCs w:val="18"/>
-        </w:rPr>
-        <w:t>}, ΑΦΜ {_</w:t>
-      </w:r>
-      <w:r>
-        <w:rPr>
-          <w:rFonts w:cs="DejaVu Sans Condensed" w:ascii="DejaVu Sans Condensed" w:hAnsi="DejaVu Sans Condensed"/>
+          <w:b/>
+          <w:bCs/>
+          <w:sz w:val="18"/>
+          <w:szCs w:val="18"/>
+        </w:rPr>
+        <w:t>}</w:t>
+      </w:r>
+      <w:r>
+        <w:rPr>
+          <w:rFonts w:cs="DejaVu Sans Condensed" w:ascii="DejaVu Sans Condensed" w:hAnsi="DejaVu Sans Condensed"/>
+          <w:sz w:val="18"/>
+          <w:szCs w:val="18"/>
+        </w:rPr>
+        <w:t xml:space="preserve">, ΑΦΜ </w:t>
+      </w:r>
+      <w:r>
+        <w:rPr>
+          <w:rFonts w:cs="DejaVu Sans Condensed" w:ascii="DejaVu Sans Condensed" w:hAnsi="DejaVu Sans Condensed"/>
+          <w:b/>
+          <w:bCs/>
+          <w:sz w:val="18"/>
+          <w:szCs w:val="18"/>
+        </w:rPr>
+        <w:t>{_</w:t>
+      </w:r>
+      <w:r>
+        <w:rPr>
+          <w:rFonts w:cs="DejaVu Sans Condensed" w:ascii="DejaVu Sans Condensed" w:hAnsi="DejaVu Sans Condensed"/>
+          <w:b/>
+          <w:bCs/>
           <w:sz w:val="18"/>
           <w:szCs w:val="18"/>
           <w:lang w:val="en-US"/>
@@ -1019,14 +1447,18 @@
       <w:r>
         <w:rPr>
           <w:rFonts w:cs="DejaVu Sans Condensed" w:ascii="DejaVu Sans Condensed" w:hAnsi="DejaVu Sans Condensed"/>
-          <w:sz w:val="18"/>
-          <w:szCs w:val="18"/>
-        </w:rPr>
-        <w:t>_</w:t>
-      </w:r>
-      <w:r>
-        <w:rPr>
-          <w:rFonts w:cs="DejaVu Sans Condensed" w:ascii="DejaVu Sans Condensed" w:hAnsi="DejaVu Sans Condensed"/>
+          <w:b/>
+          <w:bCs/>
+          <w:sz w:val="18"/>
+          <w:szCs w:val="18"/>
+        </w:rPr>
+        <w:t>_</w:t>
+      </w:r>
+      <w:r>
+        <w:rPr>
+          <w:rFonts w:cs="DejaVu Sans Condensed" w:ascii="DejaVu Sans Condensed" w:hAnsi="DejaVu Sans Condensed"/>
+          <w:b/>
+          <w:bCs/>
           <w:sz w:val="18"/>
           <w:szCs w:val="18"/>
           <w:lang w:val="en-US"/>
@@ -1036,10 +1468,20 @@
       <w:r>
         <w:rPr>
           <w:rFonts w:cs="DejaVu Sans Condensed" w:ascii="DejaVu Sans Condensed" w:hAnsi="DejaVu Sans Condensed"/>
-          <w:sz w:val="18"/>
-          <w:szCs w:val="18"/>
-        </w:rPr>
-        <w:t xml:space="preserve">} </w:t>
+          <w:b/>
+          <w:bCs/>
+          <w:sz w:val="18"/>
+          <w:szCs w:val="18"/>
+        </w:rPr>
+        <w:t>}</w:t>
+      </w:r>
+      <w:r>
+        <w:rPr>
+          <w:rFonts w:cs="DejaVu Sans Condensed" w:ascii="DejaVu Sans Condensed" w:hAnsi="DejaVu Sans Condensed"/>
+          <w:sz w:val="18"/>
+          <w:szCs w:val="18"/>
+        </w:rPr>
+        <w:t xml:space="preserve"> </w:t>
       </w:r>
       <w:bookmarkStart w:id="2" w:name="_Hlk161056600"/>
       <w:r>
@@ -1220,7 +1662,25 @@
         </w:rPr>
         <w:t>1.</w:t>
         <w:tab/>
-        <w:t xml:space="preserve">ΕΙΔΟΣ ΣΥΜΒΑΣΗΣ - ΔΙΑΡΚΕΙΑ ΣΥΜΒΑΣΗΣ: </w:t>
+      </w:r>
+      <w:r>
+        <w:rPr>
+          <w:rFonts w:cs="DejaVu Sans Condensed" w:ascii="DejaVu Sans Condensed" w:hAnsi="DejaVu Sans Condensed"/>
+          <w:b/>
+          <w:sz w:val="18"/>
+          <w:szCs w:val="18"/>
+          <w:u w:val="single"/>
+        </w:rPr>
+        <w:t>ΕΙΔΟΣ ΣΥΜΒΑΣΗΣ - ΔΙΑΡΚΕΙΑ ΣΥΜΒΑΣΗΣ:</w:t>
+      </w:r>
+      <w:r>
+        <w:rPr>
+          <w:rFonts w:cs="DejaVu Sans Condensed" w:ascii="DejaVu Sans Condensed" w:hAnsi="DejaVu Sans Condensed"/>
+          <w:b/>
+          <w:sz w:val="18"/>
+          <w:szCs w:val="18"/>
+        </w:rPr>
+        <w:t xml:space="preserve"> </w:t>
       </w:r>
     </w:p>
     <w:p>
@@ -1519,7 +1979,16 @@
         </w:rPr>
         <w:t>2.</w:t>
         <w:tab/>
-        <w:t>XΡΟΝΟΣ ΑΠΑΣΧΟΛΗΣΕΩΣ:</w:t>
+      </w:r>
+      <w:r>
+        <w:rPr>
+          <w:rFonts w:cs="DejaVu Sans Condensed" w:ascii="DejaVu Sans Condensed" w:hAnsi="DejaVu Sans Condensed"/>
+          <w:b/>
+          <w:sz w:val="18"/>
+          <w:szCs w:val="18"/>
+          <w:u w:val="single"/>
+        </w:rPr>
+        <w:t>XΡΟΝΟΣ ΑΠΑΣΧΟΛΗΣΗΣ:</w:t>
       </w:r>
     </w:p>
     <w:p>
@@ -1563,6 +2032,7 @@
           <w:iCs/>
           <w:sz w:val="18"/>
           <w:szCs w:val="18"/>
+          <w:u w:val="single"/>
         </w:rPr>
         <w:t>Ημέρες εβδομαδιαίας απασχόλησης</w:t>
       </w:r>
@@ -1571,8 +2041,17 @@
           <w:rFonts w:cs="DejaVu Sans Condensed" w:ascii="DejaVu Sans Condensed" w:hAnsi="DejaVu Sans Condensed"/>
           <w:sz w:val="18"/>
           <w:szCs w:val="18"/>
-        </w:rPr>
-        <w:t>: {_</w:t>
+          <w:u w:val="single"/>
+        </w:rPr>
+        <w:t>:</w:t>
+      </w:r>
+      <w:r>
+        <w:rPr>
+          <w:rFonts w:cs="DejaVu Sans Condensed" w:ascii="DejaVu Sans Condensed" w:hAnsi="DejaVu Sans Condensed"/>
+          <w:sz w:val="18"/>
+          <w:szCs w:val="18"/>
+        </w:rPr>
+        <w:t xml:space="preserve"> {_</w:t>
       </w:r>
       <w:r>
         <w:rPr>
@@ -1657,11 +2136,23 @@
           <w:sz w:val="18"/>
           <w:szCs w:val="18"/>
         </w:rPr>
-        <w:t>} θα παρέχει τις υπηρεσίες τ{_GENIKH_A} απασχολούμεν{_ONOMASTIKH_K} {_</w:t>
-      </w:r>
-      <w:r>
-        <w:rPr>
-          <w:rFonts w:cs="DejaVu Sans Condensed" w:ascii="DejaVu Sans Condensed" w:hAnsi="DejaVu Sans Condensed"/>
+        <w:t xml:space="preserve">} θα παρέχει τις υπηρεσίες τ{_GENIKH_A} απασχολούμεν{_ONOMASTIKH_K} </w:t>
+      </w:r>
+      <w:r>
+        <w:rPr>
+          <w:rFonts w:cs="DejaVu Sans Condensed" w:ascii="DejaVu Sans Condensed" w:hAnsi="DejaVu Sans Condensed"/>
+          <w:b/>
+          <w:bCs/>
+          <w:sz w:val="18"/>
+          <w:szCs w:val="18"/>
+        </w:rPr>
+        <w:t>{_</w:t>
+      </w:r>
+      <w:r>
+        <w:rPr>
+          <w:rFonts w:cs="DejaVu Sans Condensed" w:ascii="DejaVu Sans Condensed" w:hAnsi="DejaVu Sans Condensed"/>
+          <w:b/>
+          <w:bCs/>
           <w:sz w:val="18"/>
           <w:szCs w:val="18"/>
           <w:lang w:val="en-US"/>
@@ -1671,14 +2162,18 @@
       <w:r>
         <w:rPr>
           <w:rFonts w:cs="DejaVu Sans Condensed" w:ascii="DejaVu Sans Condensed" w:hAnsi="DejaVu Sans Condensed"/>
-          <w:sz w:val="18"/>
-          <w:szCs w:val="18"/>
-        </w:rPr>
-        <w:t>_</w:t>
-      </w:r>
-      <w:r>
-        <w:rPr>
-          <w:rFonts w:cs="DejaVu Sans Condensed" w:ascii="DejaVu Sans Condensed" w:hAnsi="DejaVu Sans Condensed"/>
+          <w:b/>
+          <w:bCs/>
+          <w:sz w:val="18"/>
+          <w:szCs w:val="18"/>
+        </w:rPr>
+        <w:t>_</w:t>
+      </w:r>
+      <w:r>
+        <w:rPr>
+          <w:rFonts w:cs="DejaVu Sans Condensed" w:ascii="DejaVu Sans Condensed" w:hAnsi="DejaVu Sans Condensed"/>
+          <w:b/>
+          <w:bCs/>
           <w:sz w:val="18"/>
           <w:szCs w:val="18"/>
           <w:lang w:val="en-US"/>
@@ -1688,14 +2183,36 @@
       <w:r>
         <w:rPr>
           <w:rFonts w:cs="DejaVu Sans Condensed" w:ascii="DejaVu Sans Condensed" w:hAnsi="DejaVu Sans Condensed"/>
-          <w:sz w:val="18"/>
-          <w:szCs w:val="18"/>
-        </w:rPr>
-        <w:t>} ({_</w:t>
-      </w:r>
-      <w:r>
-        <w:rPr>
-          <w:rFonts w:cs="DejaVu Sans Condensed" w:ascii="DejaVu Sans Condensed" w:hAnsi="DejaVu Sans Condensed"/>
+          <w:b/>
+          <w:bCs/>
+          <w:sz w:val="18"/>
+          <w:szCs w:val="18"/>
+        </w:rPr>
+        <w:t>}</w:t>
+      </w:r>
+      <w:r>
+        <w:rPr>
+          <w:rFonts w:cs="DejaVu Sans Condensed" w:ascii="DejaVu Sans Condensed" w:hAnsi="DejaVu Sans Condensed"/>
+          <w:sz w:val="18"/>
+          <w:szCs w:val="18"/>
+        </w:rPr>
+        <w:t xml:space="preserve"> (</w:t>
+      </w:r>
+      <w:r>
+        <w:rPr>
+          <w:rFonts w:cs="DejaVu Sans Condensed" w:ascii="DejaVu Sans Condensed" w:hAnsi="DejaVu Sans Condensed"/>
+          <w:b/>
+          <w:bCs/>
+          <w:sz w:val="18"/>
+          <w:szCs w:val="18"/>
+        </w:rPr>
+        <w:t>{_</w:t>
+      </w:r>
+      <w:r>
+        <w:rPr>
+          <w:rFonts w:cs="DejaVu Sans Condensed" w:ascii="DejaVu Sans Condensed" w:hAnsi="DejaVu Sans Condensed"/>
+          <w:b/>
+          <w:bCs/>
           <w:sz w:val="18"/>
           <w:szCs w:val="18"/>
           <w:lang w:val="en-US"/>
@@ -1705,14 +2222,18 @@
       <w:r>
         <w:rPr>
           <w:rFonts w:cs="DejaVu Sans Condensed" w:ascii="DejaVu Sans Condensed" w:hAnsi="DejaVu Sans Condensed"/>
-          <w:sz w:val="18"/>
-          <w:szCs w:val="18"/>
-        </w:rPr>
-        <w:t>_</w:t>
-      </w:r>
-      <w:r>
-        <w:rPr>
-          <w:rFonts w:cs="DejaVu Sans Condensed" w:ascii="DejaVu Sans Condensed" w:hAnsi="DejaVu Sans Condensed"/>
+          <w:b/>
+          <w:bCs/>
+          <w:sz w:val="18"/>
+          <w:szCs w:val="18"/>
+        </w:rPr>
+        <w:t>_</w:t>
+      </w:r>
+      <w:r>
+        <w:rPr>
+          <w:rFonts w:cs="DejaVu Sans Condensed" w:ascii="DejaVu Sans Condensed" w:hAnsi="DejaVu Sans Condensed"/>
+          <w:b/>
+          <w:bCs/>
           <w:sz w:val="18"/>
           <w:szCs w:val="18"/>
           <w:lang w:val="en-US"/>
@@ -1722,10 +2243,20 @@
       <w:r>
         <w:rPr>
           <w:rFonts w:cs="DejaVu Sans Condensed" w:ascii="DejaVu Sans Condensed" w:hAnsi="DejaVu Sans Condensed"/>
-          <w:sz w:val="18"/>
-          <w:szCs w:val="18"/>
-        </w:rPr>
-        <w:t>}) ημέρες την εβδομάδα, λαμβάνοντας υπόψη τις ρυθμίσεις της ισχύουσας κλαδικής εθνικής ή τοπικής ΣΣΕ.</w:t>
+          <w:b/>
+          <w:bCs/>
+          <w:sz w:val="18"/>
+          <w:szCs w:val="18"/>
+        </w:rPr>
+        <w:t>}</w:t>
+      </w:r>
+      <w:r>
+        <w:rPr>
+          <w:rFonts w:cs="DejaVu Sans Condensed" w:ascii="DejaVu Sans Condensed" w:hAnsi="DejaVu Sans Condensed"/>
+          <w:sz w:val="18"/>
+          <w:szCs w:val="18"/>
+        </w:rPr>
+        <w:t>) ημέρες την εβδομάδα, λαμβάνοντας υπόψη τις ρυθμίσεις της ισχύουσας κλαδικής εθνικής ή τοπικής ΣΣΕ.</w:t>
       </w:r>
       <w:r>
         <w:rPr>
@@ -1756,18 +2287,7 @@
           <w:szCs w:val="18"/>
           <w:lang w:val="en-US"/>
         </w:rPr>
-        <w:t>HOTEL_</w:t>
-      </w:r>
-      <w:r>
-        <w:rPr>
-          <w:rFonts w:cs="DejaVu Sans Condensed" w:ascii="DejaVu Sans Condensed" w:hAnsi="DejaVu Sans Condensed"/>
-          <w:i w:val="false"/>
-          <w:iCs w:val="false"/>
-          <w:sz w:val="18"/>
-          <w:szCs w:val="18"/>
-          <w:lang w:val="en-US"/>
-        </w:rPr>
-        <w:t>0001</w:t>
+        <w:t>HOTEL_0001</w:t>
       </w:r>
       <w:r>
         <w:rPr>
@@ -1828,6 +2348,7 @@
           <w:iCs/>
           <w:sz w:val="18"/>
           <w:szCs w:val="18"/>
+          <w:u w:val="single"/>
         </w:rPr>
         <w:t>Ώρες εβδομαδιαίας απασχόλησης</w:t>
       </w:r>
@@ -1836,8 +2357,17 @@
           <w:rFonts w:cs="DejaVu Sans Condensed" w:ascii="DejaVu Sans Condensed" w:hAnsi="DejaVu Sans Condensed"/>
           <w:sz w:val="18"/>
           <w:szCs w:val="18"/>
-        </w:rPr>
-        <w:t>: Οι ώρες εβδομαδιαίας απασχόλησής τ{_</w:t>
+          <w:u w:val="single"/>
+        </w:rPr>
+        <w:t>:</w:t>
+      </w:r>
+      <w:r>
+        <w:rPr>
+          <w:rFonts w:cs="DejaVu Sans Condensed" w:ascii="DejaVu Sans Condensed" w:hAnsi="DejaVu Sans Condensed"/>
+          <w:sz w:val="18"/>
+          <w:szCs w:val="18"/>
+        </w:rPr>
+        <w:t xml:space="preserve"> Οι ώρες εβδομαδιαίας απασχόλησής τ{_</w:t>
       </w:r>
       <w:r>
         <w:rPr>
@@ -1871,11 +2401,23 @@
           <w:sz w:val="18"/>
           <w:szCs w:val="18"/>
         </w:rPr>
-        <w:t>} θα ανέρχονται σε {_</w:t>
-      </w:r>
-      <w:r>
-        <w:rPr>
-          <w:rFonts w:cs="DejaVu Sans Condensed" w:ascii="DejaVu Sans Condensed" w:hAnsi="DejaVu Sans Condensed"/>
+        <w:t xml:space="preserve">} θα ανέρχονται σε </w:t>
+      </w:r>
+      <w:r>
+        <w:rPr>
+          <w:rFonts w:cs="DejaVu Sans Condensed" w:ascii="DejaVu Sans Condensed" w:hAnsi="DejaVu Sans Condensed"/>
+          <w:b/>
+          <w:bCs/>
+          <w:sz w:val="18"/>
+          <w:szCs w:val="18"/>
+        </w:rPr>
+        <w:t>{_</w:t>
+      </w:r>
+      <w:r>
+        <w:rPr>
+          <w:rFonts w:cs="DejaVu Sans Condensed" w:ascii="DejaVu Sans Condensed" w:hAnsi="DejaVu Sans Condensed"/>
+          <w:b/>
+          <w:bCs/>
           <w:sz w:val="18"/>
           <w:szCs w:val="18"/>
           <w:lang w:val="en-US"/>
@@ -1885,14 +2427,18 @@
       <w:r>
         <w:rPr>
           <w:rFonts w:cs="DejaVu Sans Condensed" w:ascii="DejaVu Sans Condensed" w:hAnsi="DejaVu Sans Condensed"/>
-          <w:sz w:val="18"/>
-          <w:szCs w:val="18"/>
-        </w:rPr>
-        <w:t>_</w:t>
-      </w:r>
-      <w:r>
-        <w:rPr>
-          <w:rFonts w:cs="DejaVu Sans Condensed" w:ascii="DejaVu Sans Condensed" w:hAnsi="DejaVu Sans Condensed"/>
+          <w:b/>
+          <w:bCs/>
+          <w:sz w:val="18"/>
+          <w:szCs w:val="18"/>
+        </w:rPr>
+        <w:t>_</w:t>
+      </w:r>
+      <w:r>
+        <w:rPr>
+          <w:rFonts w:cs="DejaVu Sans Condensed" w:ascii="DejaVu Sans Condensed" w:hAnsi="DejaVu Sans Condensed"/>
+          <w:b/>
+          <w:bCs/>
           <w:sz w:val="18"/>
           <w:szCs w:val="18"/>
           <w:lang w:val="en-US"/>
@@ -1902,14 +2448,36 @@
       <w:r>
         <w:rPr>
           <w:rFonts w:cs="DejaVu Sans Condensed" w:ascii="DejaVu Sans Condensed" w:hAnsi="DejaVu Sans Condensed"/>
-          <w:sz w:val="18"/>
-          <w:szCs w:val="18"/>
-        </w:rPr>
-        <w:t>} ({_</w:t>
-      </w:r>
-      <w:r>
-        <w:rPr>
-          <w:rFonts w:cs="DejaVu Sans Condensed" w:ascii="DejaVu Sans Condensed" w:hAnsi="DejaVu Sans Condensed"/>
+          <w:b/>
+          <w:bCs/>
+          <w:sz w:val="18"/>
+          <w:szCs w:val="18"/>
+        </w:rPr>
+        <w:t>}</w:t>
+      </w:r>
+      <w:r>
+        <w:rPr>
+          <w:rFonts w:cs="DejaVu Sans Condensed" w:ascii="DejaVu Sans Condensed" w:hAnsi="DejaVu Sans Condensed"/>
+          <w:sz w:val="18"/>
+          <w:szCs w:val="18"/>
+        </w:rPr>
+        <w:t xml:space="preserve"> (</w:t>
+      </w:r>
+      <w:r>
+        <w:rPr>
+          <w:rFonts w:cs="DejaVu Sans Condensed" w:ascii="DejaVu Sans Condensed" w:hAnsi="DejaVu Sans Condensed"/>
+          <w:b/>
+          <w:bCs/>
+          <w:sz w:val="18"/>
+          <w:szCs w:val="18"/>
+        </w:rPr>
+        <w:t>{_</w:t>
+      </w:r>
+      <w:r>
+        <w:rPr>
+          <w:rFonts w:cs="DejaVu Sans Condensed" w:ascii="DejaVu Sans Condensed" w:hAnsi="DejaVu Sans Condensed"/>
+          <w:b/>
+          <w:bCs/>
           <w:sz w:val="18"/>
           <w:szCs w:val="18"/>
           <w:lang w:val="en-US"/>
@@ -1919,14 +2487,18 @@
       <w:r>
         <w:rPr>
           <w:rFonts w:cs="DejaVu Sans Condensed" w:ascii="DejaVu Sans Condensed" w:hAnsi="DejaVu Sans Condensed"/>
-          <w:sz w:val="18"/>
-          <w:szCs w:val="18"/>
-        </w:rPr>
-        <w:t>_</w:t>
-      </w:r>
-      <w:r>
-        <w:rPr>
-          <w:rFonts w:cs="DejaVu Sans Condensed" w:ascii="DejaVu Sans Condensed" w:hAnsi="DejaVu Sans Condensed"/>
+          <w:b/>
+          <w:bCs/>
+          <w:sz w:val="18"/>
+          <w:szCs w:val="18"/>
+        </w:rPr>
+        <w:t>_</w:t>
+      </w:r>
+      <w:r>
+        <w:rPr>
+          <w:rFonts w:cs="DejaVu Sans Condensed" w:ascii="DejaVu Sans Condensed" w:hAnsi="DejaVu Sans Condensed"/>
+          <w:b/>
+          <w:bCs/>
           <w:sz w:val="18"/>
           <w:szCs w:val="18"/>
           <w:lang w:val="en-US"/>
@@ -1936,10 +2508,20 @@
       <w:r>
         <w:rPr>
           <w:rFonts w:cs="DejaVu Sans Condensed" w:ascii="DejaVu Sans Condensed" w:hAnsi="DejaVu Sans Condensed"/>
-          <w:sz w:val="18"/>
-          <w:szCs w:val="18"/>
-        </w:rPr>
-        <w:t>}), σύμφωνα με ΕΓΣΣΕ και ΠΔ 80/2022 άρθρο 180</w:t>
+          <w:b/>
+          <w:bCs/>
+          <w:sz w:val="18"/>
+          <w:szCs w:val="18"/>
+        </w:rPr>
+        <w:t>}</w:t>
+      </w:r>
+      <w:r>
+        <w:rPr>
+          <w:rFonts w:cs="DejaVu Sans Condensed" w:ascii="DejaVu Sans Condensed" w:hAnsi="DejaVu Sans Condensed"/>
+          <w:sz w:val="18"/>
+          <w:szCs w:val="18"/>
+        </w:rPr>
+        <w:t>), σύμφωνα με ΕΓΣΣΕ και ΠΔ 80/2022 άρθρο 180</w:t>
       </w:r>
       <w:r>
         <w:rPr>
@@ -1989,6 +2571,7 @@
           <w:iCs/>
           <w:sz w:val="18"/>
           <w:szCs w:val="18"/>
+          <w:u w:val="single"/>
         </w:rPr>
         <w:t>Ώρες ημερήσιας απασχόλησης</w:t>
       </w:r>
@@ -1997,8 +2580,17 @@
           <w:rFonts w:cs="DejaVu Sans Condensed" w:ascii="DejaVu Sans Condensed" w:hAnsi="DejaVu Sans Condensed"/>
           <w:sz w:val="18"/>
           <w:szCs w:val="18"/>
-        </w:rPr>
-        <w:t>: Οι ώρες ημερήσιας απασχόλησής τ{_</w:t>
+          <w:u w:val="single"/>
+        </w:rPr>
+        <w:t>:</w:t>
+      </w:r>
+      <w:r>
+        <w:rPr>
+          <w:rFonts w:cs="DejaVu Sans Condensed" w:ascii="DejaVu Sans Condensed" w:hAnsi="DejaVu Sans Condensed"/>
+          <w:sz w:val="18"/>
+          <w:szCs w:val="18"/>
+        </w:rPr>
+        <w:t xml:space="preserve"> Οι ώρες ημερήσιας απασχόλησής τ{_</w:t>
       </w:r>
       <w:r>
         <w:rPr>
@@ -2102,6 +2694,7 @@
           <w:iCs/>
           <w:sz w:val="18"/>
           <w:szCs w:val="18"/>
+          <w:u w:val="single"/>
         </w:rPr>
         <w:t>Σύστημα Βαρδιών</w:t>
       </w:r>
@@ -2110,8 +2703,17 @@
           <w:rFonts w:cs="DejaVu Sans Condensed" w:ascii="DejaVu Sans Condensed" w:hAnsi="DejaVu Sans Condensed"/>
           <w:sz w:val="18"/>
           <w:szCs w:val="18"/>
-        </w:rPr>
-        <w:t>: Βάσει του κατατεθειμένου προγράμματος στο πληροφοριακό σύστημα ΕΡΓΑΝΗ σύμφωνα με τις διατάξεις του Ν. 2874/1990, Ν. 3385/2005, Ν. 3518/2006 άρθρο 68 της ΕΓΣΣΕ 1975, των Ν. 1892/1990, 2639/1998, 1957/1991, της υπ’ αριθμ. 25/183 απόφασης του ΔΔΔΔ Αθηνών, λαμβάνοντας υπόψη και τις διατάξεις των άρθρων 164, 165,166, 167, 168, 169 και 175 του ΠΔ 80/2022 και την τυχόν σε ισχύ κλαδική εθνική ή τοπική ΣΣΕ.</w:t>
+          <w:u w:val="single"/>
+        </w:rPr>
+        <w:t>:</w:t>
+      </w:r>
+      <w:r>
+        <w:rPr>
+          <w:rFonts w:cs="DejaVu Sans Condensed" w:ascii="DejaVu Sans Condensed" w:hAnsi="DejaVu Sans Condensed"/>
+          <w:sz w:val="18"/>
+          <w:szCs w:val="18"/>
+        </w:rPr>
+        <w:t xml:space="preserve"> Βάσει του κατατεθειμένου προγράμματος στο πληροφοριακό σύστημα ΕΡΓΑΝΗ σύμφωνα με τις διατάξεις του Ν. 2874/1990, Ν. 3385/2005, Ν. 3518/2006 άρθρο 68 της ΕΓΣΣΕ 1975, των Ν. 1892/1990, 2639/1998, 1957/1991, της υπ’ αριθμ. 25/183 απόφασης του ΔΔΔΔ Αθηνών, λαμβάνοντας υπόψη και τις διατάξεις των άρθρων 164, 165,166, 167, 168, 169 και 175 του ΠΔ 80/2022 και την τυχόν σε ισχύ κλαδική εθνική ή τοπική ΣΣΕ.</w:t>
       </w:r>
     </w:p>
     <w:p>
@@ -2153,6 +2755,7 @@
           <w:iCs/>
           <w:sz w:val="18"/>
           <w:szCs w:val="18"/>
+          <w:u w:val="single"/>
         </w:rPr>
         <w:t>Εργασ</w:t>
       </w:r>
@@ -2167,6 +2770,7 @@
           <w:kern w:val="0"/>
           <w:sz w:val="18"/>
           <w:szCs w:val="18"/>
+          <w:u w:val="single"/>
           <w:lang w:val="el-GR" w:eastAsia="en-US" w:bidi="ar-SA"/>
         </w:rPr>
         <w:t>ία 6</w:t>
@@ -2182,6 +2786,7 @@
           <w:kern w:val="0"/>
           <w:sz w:val="18"/>
           <w:szCs w:val="18"/>
+          <w:u w:val="single"/>
           <w:vertAlign w:val="superscript"/>
           <w:lang w:val="el-GR" w:eastAsia="en-US" w:bidi="ar-SA"/>
         </w:rPr>
@@ -2196,6 +2801,7 @@
           <w:iCs/>
           <w:sz w:val="18"/>
           <w:szCs w:val="18"/>
+          <w:u w:val="single"/>
         </w:rPr>
         <w:t>ημ</w:t>
       </w:r>
@@ -2210,6 +2816,7 @@
           <w:kern w:val="0"/>
           <w:sz w:val="18"/>
           <w:szCs w:val="18"/>
+          <w:u w:val="single"/>
           <w:lang w:val="el-GR" w:eastAsia="en-US" w:bidi="ar-SA"/>
         </w:rPr>
         <w:t>έρας</w:t>
@@ -2219,8 +2826,17 @@
           <w:rFonts w:cs="DejaVu Sans Condensed" w:ascii="DejaVu Sans Condensed" w:hAnsi="DejaVu Sans Condensed"/>
           <w:sz w:val="18"/>
           <w:szCs w:val="18"/>
-        </w:rPr>
-        <w:t>: {_HOTEL_0003}</w:t>
+          <w:u w:val="single"/>
+        </w:rPr>
+        <w:t>:</w:t>
+      </w:r>
+      <w:r>
+        <w:rPr>
+          <w:rFonts w:cs="DejaVu Sans Condensed" w:ascii="DejaVu Sans Condensed" w:hAnsi="DejaVu Sans Condensed"/>
+          <w:sz w:val="18"/>
+          <w:szCs w:val="18"/>
+        </w:rPr>
+        <w:t xml:space="preserve"> {_HOTEL_0003}</w:t>
       </w:r>
     </w:p>
     <w:p>
@@ -2242,27 +2858,7 @@
           <w:sz w:val="18"/>
           <w:szCs w:val="18"/>
         </w:rPr>
-        <w:t>2.</w:t>
-      </w:r>
-      <w:r>
-        <w:rPr>
-          <w:rFonts w:cs="DejaVu Sans Condensed" w:ascii="DejaVu Sans Condensed" w:hAnsi="DejaVu Sans Condensed"/>
-          <w:b/>
-          <w:bCs/>
-          <w:sz w:val="18"/>
-          <w:szCs w:val="18"/>
-        </w:rPr>
-        <w:t>6</w:t>
-      </w:r>
-      <w:r>
-        <w:rPr>
-          <w:rFonts w:cs="DejaVu Sans Condensed" w:ascii="DejaVu Sans Condensed" w:hAnsi="DejaVu Sans Condensed"/>
-          <w:b/>
-          <w:bCs/>
-          <w:sz w:val="18"/>
-          <w:szCs w:val="18"/>
-        </w:rPr>
-        <w:t xml:space="preserve">. </w:t>
+        <w:t xml:space="preserve">2.6. </w:t>
         <w:tab/>
       </w:r>
       <w:r>
@@ -2274,6 +2870,7 @@
           <w:iCs/>
           <w:sz w:val="18"/>
           <w:szCs w:val="18"/>
+          <w:u w:val="single"/>
         </w:rPr>
         <w:t>Συνεχές ή σε διακεκομμένο</w:t>
       </w:r>
@@ -2284,8 +2881,19 @@
           <w:iCs/>
           <w:sz w:val="18"/>
           <w:szCs w:val="18"/>
-        </w:rPr>
-        <w:t xml:space="preserve">: </w:t>
+          <w:u w:val="single"/>
+        </w:rPr>
+        <w:t>:</w:t>
+      </w:r>
+      <w:r>
+        <w:rPr>
+          <w:rFonts w:cs="DejaVu Sans Condensed" w:ascii="DejaVu Sans Condensed" w:hAnsi="DejaVu Sans Condensed"/>
+          <w:i/>
+          <w:iCs/>
+          <w:sz w:val="18"/>
+          <w:szCs w:val="18"/>
+        </w:rPr>
+        <w:t xml:space="preserve"> </w:t>
       </w:r>
       <w:r>
         <w:rPr>
@@ -2566,27 +3174,7 @@
           <w:sz w:val="18"/>
           <w:szCs w:val="18"/>
         </w:rPr>
-        <w:t>2.</w:t>
-      </w:r>
-      <w:r>
-        <w:rPr>
-          <w:rFonts w:cs="DejaVu Sans Condensed" w:ascii="DejaVu Sans Condensed" w:hAnsi="DejaVu Sans Condensed"/>
-          <w:b/>
-          <w:bCs/>
-          <w:sz w:val="18"/>
-          <w:szCs w:val="18"/>
-        </w:rPr>
-        <w:t>7</w:t>
-      </w:r>
-      <w:r>
-        <w:rPr>
-          <w:rFonts w:cs="DejaVu Sans Condensed" w:ascii="DejaVu Sans Condensed" w:hAnsi="DejaVu Sans Condensed"/>
-          <w:b/>
-          <w:bCs/>
-          <w:sz w:val="18"/>
-          <w:szCs w:val="18"/>
-        </w:rPr>
-        <w:t xml:space="preserve">. </w:t>
+        <w:t xml:space="preserve">2.7. </w:t>
         <w:tab/>
       </w:r>
       <w:r>
@@ -2598,6 +3186,7 @@
           <w:iCs/>
           <w:sz w:val="18"/>
           <w:szCs w:val="18"/>
+          <w:u w:val="single"/>
         </w:rPr>
         <w:t>Διάλειμμα – Ευέλικτη προσέλευση</w:t>
       </w:r>
@@ -2621,27 +3210,7 @@
           <w:sz w:val="18"/>
           <w:szCs w:val="18"/>
         </w:rPr>
-        <w:t>2.</w:t>
-      </w:r>
-      <w:r>
-        <w:rPr>
-          <w:rFonts w:cs="DejaVu Sans Condensed" w:ascii="DejaVu Sans Condensed" w:hAnsi="DejaVu Sans Condensed"/>
-          <w:b/>
-          <w:bCs/>
-          <w:sz w:val="18"/>
-          <w:szCs w:val="18"/>
-        </w:rPr>
-        <w:t>7</w:t>
-      </w:r>
-      <w:r>
-        <w:rPr>
-          <w:rFonts w:cs="DejaVu Sans Condensed" w:ascii="DejaVu Sans Condensed" w:hAnsi="DejaVu Sans Condensed"/>
-          <w:b/>
-          <w:bCs/>
-          <w:sz w:val="18"/>
-          <w:szCs w:val="18"/>
-        </w:rPr>
-        <w:t>.1.</w:t>
+        <w:t>2.7.1.</w:t>
       </w:r>
       <w:r>
         <w:rPr>
@@ -2701,11 +3270,23 @@
           <w:sz w:val="18"/>
           <w:szCs w:val="18"/>
         </w:rPr>
-        <w:t>σε {_</w:t>
-      </w:r>
-      <w:r>
-        <w:rPr>
-          <w:rFonts w:cs="DejaVu Sans Condensed" w:ascii="DejaVu Sans Condensed" w:hAnsi="DejaVu Sans Condensed"/>
+        <w:t xml:space="preserve">σε </w:t>
+      </w:r>
+      <w:r>
+        <w:rPr>
+          <w:rFonts w:cs="DejaVu Sans Condensed" w:ascii="DejaVu Sans Condensed" w:hAnsi="DejaVu Sans Condensed"/>
+          <w:b/>
+          <w:bCs/>
+          <w:sz w:val="18"/>
+          <w:szCs w:val="18"/>
+        </w:rPr>
+        <w:t>{_</w:t>
+      </w:r>
+      <w:r>
+        <w:rPr>
+          <w:rFonts w:cs="DejaVu Sans Condensed" w:ascii="DejaVu Sans Condensed" w:hAnsi="DejaVu Sans Condensed"/>
+          <w:b/>
+          <w:bCs/>
           <w:sz w:val="18"/>
           <w:szCs w:val="18"/>
           <w:lang w:val="en-US"/>
@@ -2715,14 +3296,18 @@
       <w:r>
         <w:rPr>
           <w:rFonts w:cs="DejaVu Sans Condensed" w:ascii="DejaVu Sans Condensed" w:hAnsi="DejaVu Sans Condensed"/>
-          <w:sz w:val="18"/>
-          <w:szCs w:val="18"/>
-        </w:rPr>
-        <w:t>_</w:t>
-      </w:r>
-      <w:r>
-        <w:rPr>
-          <w:rFonts w:cs="DejaVu Sans Condensed" w:ascii="DejaVu Sans Condensed" w:hAnsi="DejaVu Sans Condensed"/>
+          <w:b/>
+          <w:bCs/>
+          <w:sz w:val="18"/>
+          <w:szCs w:val="18"/>
+        </w:rPr>
+        <w:t>_</w:t>
+      </w:r>
+      <w:r>
+        <w:rPr>
+          <w:rFonts w:cs="DejaVu Sans Condensed" w:ascii="DejaVu Sans Condensed" w:hAnsi="DejaVu Sans Condensed"/>
+          <w:b/>
+          <w:bCs/>
           <w:sz w:val="18"/>
           <w:szCs w:val="18"/>
           <w:lang w:val="en-US"/>
@@ -2732,14 +3317,36 @@
       <w:r>
         <w:rPr>
           <w:rFonts w:cs="DejaVu Sans Condensed" w:ascii="DejaVu Sans Condensed" w:hAnsi="DejaVu Sans Condensed"/>
-          <w:sz w:val="18"/>
-          <w:szCs w:val="18"/>
-        </w:rPr>
-        <w:t>} ({_</w:t>
-      </w:r>
-      <w:r>
-        <w:rPr>
-          <w:rFonts w:cs="DejaVu Sans Condensed" w:ascii="DejaVu Sans Condensed" w:hAnsi="DejaVu Sans Condensed"/>
+          <w:b/>
+          <w:bCs/>
+          <w:sz w:val="18"/>
+          <w:szCs w:val="18"/>
+        </w:rPr>
+        <w:t>}</w:t>
+      </w:r>
+      <w:r>
+        <w:rPr>
+          <w:rFonts w:cs="DejaVu Sans Condensed" w:ascii="DejaVu Sans Condensed" w:hAnsi="DejaVu Sans Condensed"/>
+          <w:sz w:val="18"/>
+          <w:szCs w:val="18"/>
+        </w:rPr>
+        <w:t xml:space="preserve"> (</w:t>
+      </w:r>
+      <w:r>
+        <w:rPr>
+          <w:rFonts w:cs="DejaVu Sans Condensed" w:ascii="DejaVu Sans Condensed" w:hAnsi="DejaVu Sans Condensed"/>
+          <w:b/>
+          <w:bCs/>
+          <w:sz w:val="18"/>
+          <w:szCs w:val="18"/>
+        </w:rPr>
+        <w:t>{_</w:t>
+      </w:r>
+      <w:r>
+        <w:rPr>
+          <w:rFonts w:cs="DejaVu Sans Condensed" w:ascii="DejaVu Sans Condensed" w:hAnsi="DejaVu Sans Condensed"/>
+          <w:b/>
+          <w:bCs/>
           <w:sz w:val="18"/>
           <w:szCs w:val="18"/>
           <w:lang w:val="en-US"/>
@@ -2749,14 +3356,36 @@
       <w:r>
         <w:rPr>
           <w:rFonts w:cs="DejaVu Sans Condensed" w:ascii="DejaVu Sans Condensed" w:hAnsi="DejaVu Sans Condensed"/>
-          <w:sz w:val="18"/>
-          <w:szCs w:val="18"/>
-        </w:rPr>
-        <w:t>}) λεπτά και {_</w:t>
-      </w:r>
-      <w:r>
-        <w:rPr>
-          <w:rFonts w:cs="DejaVu Sans Condensed" w:ascii="DejaVu Sans Condensed" w:hAnsi="DejaVu Sans Condensed"/>
+          <w:b/>
+          <w:bCs/>
+          <w:sz w:val="18"/>
+          <w:szCs w:val="18"/>
+        </w:rPr>
+        <w:t>}</w:t>
+      </w:r>
+      <w:r>
+        <w:rPr>
+          <w:rFonts w:cs="DejaVu Sans Condensed" w:ascii="DejaVu Sans Condensed" w:hAnsi="DejaVu Sans Condensed"/>
+          <w:sz w:val="18"/>
+          <w:szCs w:val="18"/>
+        </w:rPr>
+        <w:t xml:space="preserve">) λεπτά και </w:t>
+      </w:r>
+      <w:r>
+        <w:rPr>
+          <w:rFonts w:cs="DejaVu Sans Condensed" w:ascii="DejaVu Sans Condensed" w:hAnsi="DejaVu Sans Condensed"/>
+          <w:b/>
+          <w:bCs/>
+          <w:sz w:val="18"/>
+          <w:szCs w:val="18"/>
+        </w:rPr>
+        <w:t>{_</w:t>
+      </w:r>
+      <w:r>
+        <w:rPr>
+          <w:rFonts w:cs="DejaVu Sans Condensed" w:ascii="DejaVu Sans Condensed" w:hAnsi="DejaVu Sans Condensed"/>
+          <w:b/>
+          <w:bCs/>
           <w:sz w:val="18"/>
           <w:szCs w:val="18"/>
           <w:lang w:val="en-US"/>
@@ -2766,14 +3395,18 @@
       <w:r>
         <w:rPr>
           <w:rFonts w:cs="DejaVu Sans Condensed" w:ascii="DejaVu Sans Condensed" w:hAnsi="DejaVu Sans Condensed"/>
-          <w:sz w:val="18"/>
-          <w:szCs w:val="18"/>
-        </w:rPr>
-        <w:t>_</w:t>
-      </w:r>
-      <w:r>
-        <w:rPr>
-          <w:rFonts w:cs="DejaVu Sans Condensed" w:ascii="DejaVu Sans Condensed" w:hAnsi="DejaVu Sans Condensed"/>
+          <w:b/>
+          <w:bCs/>
+          <w:sz w:val="18"/>
+          <w:szCs w:val="18"/>
+        </w:rPr>
+        <w:t>_</w:t>
+      </w:r>
+      <w:r>
+        <w:rPr>
+          <w:rFonts w:cs="DejaVu Sans Condensed" w:ascii="DejaVu Sans Condensed" w:hAnsi="DejaVu Sans Condensed"/>
+          <w:b/>
+          <w:bCs/>
           <w:sz w:val="18"/>
           <w:szCs w:val="18"/>
           <w:lang w:val="en-US"/>
@@ -2783,14 +3416,18 @@
       <w:r>
         <w:rPr>
           <w:rFonts w:cs="DejaVu Sans Condensed" w:ascii="DejaVu Sans Condensed" w:hAnsi="DejaVu Sans Condensed"/>
-          <w:sz w:val="18"/>
-          <w:szCs w:val="18"/>
-        </w:rPr>
-        <w:t>_</w:t>
-      </w:r>
-      <w:r>
-        <w:rPr>
-          <w:rFonts w:cs="DejaVu Sans Condensed" w:ascii="DejaVu Sans Condensed" w:hAnsi="DejaVu Sans Condensed"/>
+          <w:b/>
+          <w:bCs/>
+          <w:sz w:val="18"/>
+          <w:szCs w:val="18"/>
+        </w:rPr>
+        <w:t>_</w:t>
+      </w:r>
+      <w:r>
+        <w:rPr>
+          <w:rFonts w:cs="DejaVu Sans Condensed" w:ascii="DejaVu Sans Condensed" w:hAnsi="DejaVu Sans Condensed"/>
+          <w:b/>
+          <w:bCs/>
           <w:sz w:val="18"/>
           <w:szCs w:val="18"/>
           <w:lang w:val="en-US"/>
@@ -2800,10 +3437,20 @@
       <w:r>
         <w:rPr>
           <w:rFonts w:cs="DejaVu Sans Condensed" w:ascii="DejaVu Sans Condensed" w:hAnsi="DejaVu Sans Condensed"/>
-          <w:sz w:val="18"/>
-          <w:szCs w:val="18"/>
-        </w:rPr>
-        <w:t xml:space="preserve">}. </w:t>
+          <w:b/>
+          <w:bCs/>
+          <w:sz w:val="18"/>
+          <w:szCs w:val="18"/>
+        </w:rPr>
+        <w:t>}</w:t>
+      </w:r>
+      <w:r>
+        <w:rPr>
+          <w:rFonts w:cs="DejaVu Sans Condensed" w:ascii="DejaVu Sans Condensed" w:hAnsi="DejaVu Sans Condensed"/>
+          <w:sz w:val="18"/>
+          <w:szCs w:val="18"/>
+        </w:rPr>
+        <w:t xml:space="preserve"> </w:t>
       </w:r>
       <w:r>
         <w:rPr>
@@ -2813,30 +3460,7 @@
           <w:sz w:val="16"/>
           <w:szCs w:val="16"/>
         </w:rPr>
-        <w:t>[ΣΣ  ΕΚΤΟΣ ΩΡΑΡΙΟΥ: Δεν αποτελε</w:t>
-      </w:r>
-      <w:r>
-        <w:rPr>
-          <w:rFonts w:eastAsia="Calibri" w:cs="DejaVu Sans Condensed" w:ascii="DejaVu Sans Condensed" w:hAnsi="DejaVu Sans Condensed" w:eastAsiaTheme="minorHAnsi"/>
-          <w:i/>
-          <w:iCs/>
-          <w:color w:val="auto"/>
-          <w:kern w:val="0"/>
-          <w:sz w:val="16"/>
-          <w:szCs w:val="16"/>
-          <w:lang w:val="el-GR" w:eastAsia="en-US" w:bidi="ar-SA"/>
-        </w:rPr>
-        <w:t>ί χρόνο εργασίας ήτοι επεκτείνει το ωράριο εργασίας</w:t>
-      </w:r>
-      <w:r>
-        <w:rPr>
-          <w:rFonts w:cs="DejaVu Sans Condensed" w:ascii="DejaVu Sans Condensed" w:hAnsi="DejaVu Sans Condensed"/>
-          <w:i/>
-          <w:iCs/>
-          <w:sz w:val="16"/>
-          <w:szCs w:val="16"/>
-        </w:rPr>
-        <w:t>]</w:t>
+        <w:t>{_HOTEL_0005}{_HOTEL_0006}</w:t>
       </w:r>
     </w:p>
     <w:p>
@@ -2858,27 +3482,7 @@
           <w:sz w:val="18"/>
           <w:szCs w:val="18"/>
         </w:rPr>
-        <w:t>2.</w:t>
-      </w:r>
-      <w:r>
-        <w:rPr>
-          <w:rFonts w:cs="DejaVu Sans Condensed" w:ascii="DejaVu Sans Condensed" w:hAnsi="DejaVu Sans Condensed"/>
-          <w:b/>
-          <w:bCs/>
-          <w:sz w:val="18"/>
-          <w:szCs w:val="18"/>
-        </w:rPr>
-        <w:t>7</w:t>
-      </w:r>
-      <w:r>
-        <w:rPr>
-          <w:rFonts w:cs="DejaVu Sans Condensed" w:ascii="DejaVu Sans Condensed" w:hAnsi="DejaVu Sans Condensed"/>
-          <w:b/>
-          <w:bCs/>
-          <w:sz w:val="18"/>
-          <w:szCs w:val="18"/>
-        </w:rPr>
-        <w:t>.2.</w:t>
+        <w:t>2.7.2.</w:t>
       </w:r>
       <w:r>
         <w:rPr>
@@ -2908,11 +3512,23 @@
           <w:sz w:val="18"/>
           <w:szCs w:val="18"/>
         </w:rPr>
-        <w:t xml:space="preserve"> ορίζεται σε {_</w:t>
-      </w:r>
-      <w:r>
-        <w:rPr>
-          <w:rFonts w:cs="DejaVu Sans Condensed" w:ascii="DejaVu Sans Condensed" w:hAnsi="DejaVu Sans Condensed"/>
+        <w:t xml:space="preserve"> ορίζεται σε </w:t>
+      </w:r>
+      <w:r>
+        <w:rPr>
+          <w:rFonts w:cs="DejaVu Sans Condensed" w:ascii="DejaVu Sans Condensed" w:hAnsi="DejaVu Sans Condensed"/>
+          <w:b/>
+          <w:bCs/>
+          <w:sz w:val="18"/>
+          <w:szCs w:val="18"/>
+        </w:rPr>
+        <w:t>{_</w:t>
+      </w:r>
+      <w:r>
+        <w:rPr>
+          <w:rFonts w:cs="DejaVu Sans Condensed" w:ascii="DejaVu Sans Condensed" w:hAnsi="DejaVu Sans Condensed"/>
+          <w:b/>
+          <w:bCs/>
           <w:sz w:val="18"/>
           <w:szCs w:val="18"/>
           <w:lang w:val="en-US"/>
@@ -2922,14 +3538,18 @@
       <w:r>
         <w:rPr>
           <w:rFonts w:cs="DejaVu Sans Condensed" w:ascii="DejaVu Sans Condensed" w:hAnsi="DejaVu Sans Condensed"/>
-          <w:sz w:val="18"/>
-          <w:szCs w:val="18"/>
-        </w:rPr>
-        <w:t>_</w:t>
-      </w:r>
-      <w:r>
-        <w:rPr>
-          <w:rFonts w:cs="DejaVu Sans Condensed" w:ascii="DejaVu Sans Condensed" w:hAnsi="DejaVu Sans Condensed"/>
+          <w:b/>
+          <w:bCs/>
+          <w:sz w:val="18"/>
+          <w:szCs w:val="18"/>
+        </w:rPr>
+        <w:t>_</w:t>
+      </w:r>
+      <w:r>
+        <w:rPr>
+          <w:rFonts w:cs="DejaVu Sans Condensed" w:ascii="DejaVu Sans Condensed" w:hAnsi="DejaVu Sans Condensed"/>
+          <w:b/>
+          <w:bCs/>
           <w:sz w:val="18"/>
           <w:szCs w:val="18"/>
           <w:lang w:val="en-US"/>
@@ -2939,10 +3559,20 @@
       <w:r>
         <w:rPr>
           <w:rFonts w:cs="DejaVu Sans Condensed" w:ascii="DejaVu Sans Condensed" w:hAnsi="DejaVu Sans Condensed"/>
-          <w:sz w:val="18"/>
-          <w:szCs w:val="18"/>
-        </w:rPr>
-        <w:t>} λεπτά</w:t>
+          <w:b/>
+          <w:bCs/>
+          <w:sz w:val="18"/>
+          <w:szCs w:val="18"/>
+        </w:rPr>
+        <w:t>}</w:t>
+      </w:r>
+      <w:r>
+        <w:rPr>
+          <w:rFonts w:cs="DejaVu Sans Condensed" w:ascii="DejaVu Sans Condensed" w:hAnsi="DejaVu Sans Condensed"/>
+          <w:sz w:val="18"/>
+          <w:szCs w:val="18"/>
+        </w:rPr>
+        <w:t xml:space="preserve"> λεπτά</w:t>
       </w:r>
     </w:p>
     <w:p>
@@ -2964,27 +3594,7 @@
           <w:sz w:val="18"/>
           <w:szCs w:val="18"/>
         </w:rPr>
-        <w:t>2.</w:t>
-      </w:r>
-      <w:r>
-        <w:rPr>
-          <w:rFonts w:cs="DejaVu Sans Condensed" w:ascii="DejaVu Sans Condensed" w:hAnsi="DejaVu Sans Condensed"/>
-          <w:b/>
-          <w:bCs/>
-          <w:sz w:val="18"/>
-          <w:szCs w:val="18"/>
-        </w:rPr>
-        <w:t>8</w:t>
-      </w:r>
-      <w:r>
-        <w:rPr>
-          <w:rFonts w:cs="DejaVu Sans Condensed" w:ascii="DejaVu Sans Condensed" w:hAnsi="DejaVu Sans Condensed"/>
-          <w:b/>
-          <w:bCs/>
-          <w:sz w:val="18"/>
-          <w:szCs w:val="18"/>
-        </w:rPr>
-        <w:t>.</w:t>
+        <w:t>2.8.</w:t>
       </w:r>
       <w:r>
         <w:rPr>
@@ -3041,7 +3651,17 @@
         </w:rPr>
         <w:t>3.</w:t>
         <w:tab/>
-        <w:t>ΤΟΠΟΣ ΠΑΡΟΧΗΣ ΕΡΓΑΣΙΑΣ:</w:t>
+        <w:t>Τ</w:t>
+      </w:r>
+      <w:r>
+        <w:rPr>
+          <w:rFonts w:cs="DejaVu Sans Condensed" w:ascii="DejaVu Sans Condensed" w:hAnsi="DejaVu Sans Condensed"/>
+          <w:b/>
+          <w:sz w:val="18"/>
+          <w:szCs w:val="18"/>
+          <w:u w:val="single"/>
+        </w:rPr>
+        <w:t>ΟΠΟΣ ΠΑΡΟΧΗΣ ΕΡΓΑΣΙΑΣ:</w:t>
       </w:r>
     </w:p>
     <w:p>
@@ -3174,7 +3794,72 @@
           <w:sz w:val="18"/>
           <w:szCs w:val="18"/>
         </w:rPr>
-        <w:t xml:space="preserve">}  διατηρεί ή θα διατηρεί στο μέλλον εγκαταστάσεις. </w:t>
+        <w:t xml:space="preserve">}  διατηρεί ή θα διατηρεί στο μέλλον εγκαταστάσεις.  </w:t>
+      </w:r>
+    </w:p>
+    <w:tbl>
+      <w:tblPr>
+        <w:tblW w:w="5000" w:type="pct"/>
+        <w:jc w:val="left"/>
+        <w:tblInd w:w="-5" w:type="dxa"/>
+        <w:tblLayout w:type="fixed"/>
+        <w:tblCellMar>
+          <w:top w:w="55" w:type="dxa"/>
+          <w:left w:w="55" w:type="dxa"/>
+          <w:bottom w:w="55" w:type="dxa"/>
+          <w:right w:w="55" w:type="dxa"/>
+        </w:tblCellMar>
+      </w:tblPr>
+      <w:tblGrid>
+        <w:gridCol w:w="8312"/>
+      </w:tblGrid>
+      <w:tr>
+        <w:trPr/>
+        <w:tc>
+          <w:tcPr>
+            <w:tcW w:w="8312" w:type="dxa"/>
+            <w:tcBorders>
+              <w:top w:val="single" w:sz="4" w:space="0" w:color="000000"/>
+              <w:left w:val="single" w:sz="4" w:space="0" w:color="000000"/>
+              <w:bottom w:val="single" w:sz="4" w:space="0" w:color="000000"/>
+              <w:right w:val="single" w:sz="4" w:space="0" w:color="000000"/>
+            </w:tcBorders>
+          </w:tcPr>
+          <w:p>
+            <w:pPr>
+              <w:pStyle w:val="TableContents"/>
+              <w:spacing w:before="0" w:after="160"/>
+              <w:rPr>
+                <w:rFonts w:ascii="DejaVu Sans Mono" w:hAnsi="DejaVu Sans Mono"/>
+                <w:sz w:val="16"/>
+                <w:szCs w:val="16"/>
+              </w:rPr>
+            </w:pPr>
+            <w:r>
+              <w:rPr>
+                <w:rFonts w:ascii="DejaVu Sans Mono" w:hAnsi="DejaVu Sans Mono"/>
+                <w:sz w:val="16"/>
+                <w:szCs w:val="16"/>
+              </w:rPr>
+              <w:t>{_HOTEL_0004}</w:t>
+            </w:r>
+          </w:p>
+        </w:tc>
+      </w:tr>
+    </w:tbl>
+    <w:p>
+      <w:pPr>
+        <w:pStyle w:val="Normal"/>
+        <w:ind w:left="-709" w:right="-1186" w:hanging="0"/>
+        <w:jc w:val="both"/>
+        <w:rPr>
+          <w:rFonts w:ascii="DejaVu Sans Condensed" w:hAnsi="DejaVu Sans Condensed" w:cs="DejaVu Sans Condensed"/>
+          <w:sz w:val="18"/>
+          <w:szCs w:val="18"/>
+        </w:rPr>
+      </w:pPr>
+      <w:r>
+        <w:rPr/>
       </w:r>
     </w:p>
     <w:p>
@@ -3311,7 +3996,7 @@
           <w:kern w:val="0"/>
           <w:sz w:val="18"/>
           <w:szCs w:val="18"/>
-          <w:shd w:fill="FFFF00" w:val="clear"/>
+          <w:shd w:fill="auto" w:val="clear"/>
           <w:lang w:val="el-GR" w:eastAsia="en-US" w:bidi="ar-SA"/>
         </w:rPr>
         <w:t xml:space="preserve"> συμφερόντων της</w:t>
@@ -3615,7 +4300,7 @@
           <w:kern w:val="0"/>
           <w:sz w:val="18"/>
           <w:szCs w:val="18"/>
-          <w:shd w:fill="FFFF00" w:val="clear"/>
+          <w:shd w:fill="auto" w:val="clear"/>
           <w:lang w:val="el-GR" w:eastAsia="en-US" w:bidi="ar-SA"/>
         </w:rPr>
         <w:t>ή συμφερόντων</w:t>
@@ -14389,8 +15074,8 @@
       <w:tblLook w:val="04a0" w:noHBand="0" w:noVBand="1" w:firstColumn="1" w:lastRow="0" w:lastColumn="0" w:firstRow="1"/>
     </w:tblPr>
     <w:tblGrid>
-      <w:gridCol w:w="9022"/>
-      <w:gridCol w:w="1267"/>
+      <w:gridCol w:w="9026"/>
+      <w:gridCol w:w="1263"/>
     </w:tblGrid>
     <w:tr>
       <w:trPr>
@@ -14398,7 +15083,7 @@
       </w:trPr>
       <w:tc>
         <w:tcPr>
-          <w:tcW w:w="9022" w:type="dxa"/>
+          <w:tcW w:w="9026" w:type="dxa"/>
           <w:tcBorders>
             <w:top w:val="single" w:sz="4" w:space="0" w:color="B2B2B2"/>
             <w:left w:val="nil"/>
@@ -14435,7 +15120,7 @@
       </w:tc>
       <w:tc>
         <w:tcPr>
-          <w:tcW w:w="1267" w:type="dxa"/>
+          <w:tcW w:w="1263" w:type="dxa"/>
           <w:tcBorders>
             <w:top w:val="single" w:sz="4" w:space="0" w:color="B2B2B2"/>
             <w:left w:val="nil"/>
@@ -14473,7 +15158,7 @@
       </w:trPr>
       <w:tc>
         <w:tcPr>
-          <w:tcW w:w="9022" w:type="dxa"/>
+          <w:tcW w:w="9026" w:type="dxa"/>
           <w:tcBorders>
             <w:top w:val="nil"/>
             <w:left w:val="nil"/>
@@ -14606,7 +15291,7 @@
       </w:tc>
       <w:tc>
         <w:tcPr>
-          <w:tcW w:w="1267" w:type="dxa"/>
+          <w:tcW w:w="1263" w:type="dxa"/>
           <w:tcBorders>
             <w:top w:val="nil"/>
             <w:left w:val="nil"/>
@@ -14692,7 +15377,7 @@
               <w:color w:val="808080"/>
               <w:lang w:val="el-GR" w:eastAsia="en-US" w:bidi="ar-SA"/>
             </w:rPr>
-            <w:t>8</w:t>
+            <w:t>9</w:t>
           </w:r>
           <w:r>
             <w:rPr>
@@ -14758,7 +15443,7 @@
               <w:color w:val="808080"/>
               <w:lang w:val="el-GR" w:eastAsia="en-US" w:bidi="ar-SA"/>
             </w:rPr>
-            <w:t>8</w:t>
+            <w:t>9</w:t>
           </w:r>
           <w:r>
             <w:rPr>
@@ -14820,8 +15505,8 @@
       <w:tblLook w:val="04a0" w:noHBand="0" w:noVBand="1" w:firstColumn="1" w:lastRow="0" w:lastColumn="0" w:firstRow="1"/>
     </w:tblPr>
     <w:tblGrid>
-      <w:gridCol w:w="9022"/>
-      <w:gridCol w:w="1267"/>
+      <w:gridCol w:w="9026"/>
+      <w:gridCol w:w="1263"/>
     </w:tblGrid>
     <w:tr>
       <w:trPr>
@@ -14829,7 +15514,7 @@
       </w:trPr>
       <w:tc>
         <w:tcPr>
-          <w:tcW w:w="9022" w:type="dxa"/>
+          <w:tcW w:w="9026" w:type="dxa"/>
           <w:tcBorders>
             <w:top w:val="single" w:sz="4" w:space="0" w:color="B2B2B2"/>
             <w:left w:val="nil"/>
@@ -14866,7 +15551,7 @@
       </w:tc>
       <w:tc>
         <w:tcPr>
-          <w:tcW w:w="1267" w:type="dxa"/>
+          <w:tcW w:w="1263" w:type="dxa"/>
           <w:tcBorders>
             <w:top w:val="single" w:sz="4" w:space="0" w:color="B2B2B2"/>
             <w:left w:val="nil"/>
@@ -14904,7 +15589,7 @@
       </w:trPr>
       <w:tc>
         <w:tcPr>
-          <w:tcW w:w="9022" w:type="dxa"/>
+          <w:tcW w:w="9026" w:type="dxa"/>
           <w:tcBorders>
             <w:top w:val="nil"/>
             <w:left w:val="nil"/>
@@ -15037,7 +15722,7 @@
       </w:tc>
       <w:tc>
         <w:tcPr>
-          <w:tcW w:w="1267" w:type="dxa"/>
+          <w:tcW w:w="1263" w:type="dxa"/>
           <w:tcBorders>
             <w:top w:val="nil"/>
             <w:left w:val="nil"/>
@@ -15123,7 +15808,7 @@
               <w:color w:val="808080"/>
               <w:lang w:val="el-GR" w:eastAsia="en-US" w:bidi="ar-SA"/>
             </w:rPr>
-            <w:t>8</w:t>
+            <w:t>9</w:t>
           </w:r>
           <w:r>
             <w:rPr>
@@ -15189,7 +15874,7 @@
               <w:color w:val="808080"/>
               <w:lang w:val="el-GR" w:eastAsia="en-US" w:bidi="ar-SA"/>
             </w:rPr>
-            <w:t>8</w:t>
+            <w:t>9</w:t>
           </w:r>
           <w:r>
             <w:rPr>
@@ -16458,6 +17143,13 @@
     </w:pPr>
     <w:rPr/>
   </w:style>
+  <w:style w:type="paragraph" w:styleId="FrameContents">
+    <w:name w:val="Frame Contents"/>
+    <w:basedOn w:val="Normal"/>
+    <w:qFormat/>
+    <w:pPr/>
+    <w:rPr/>
+  </w:style>
   <w:style w:type="numbering" w:styleId="NoList" w:default="1">
     <w:name w:val="No List"/>
     <w:uiPriority w:val="99"/>

</xml_diff>

<commit_message>
🚀 Deploy prod build - 1.0.31 (Phase 1)
</commit_message>
<xml_diff>
--- a/public/templates/ΑΡΧΙΚΗ ΣΥΜΒΑΣΗ ΕΡΓΑΖΟΜΕΝΩΝ.docx
+++ b/public/templates/ΑΡΧΙΚΗ ΣΥΜΒΑΣΗ ΕΡΓΑΖΟΜΕΝΩΝ.docx
@@ -3795,175 +3795,37 @@
           <w:sz w:val="18"/>
           <w:szCs w:val="18"/>
         </w:rPr>
-        <w:t>}  διατηρεί ή θα διατηρεί στο μέλλον εγκαταστάσεις.  {_HOTEL_0007}</w:t>
+        <w:t>}  διατηρεί ή θα διατηρεί στο μέλλον εγκαταστάσεις. {_HOTEL_0007}</w:t>
       </w:r>
     </w:p>
-    <w:tbl>
-      <w:tblPr>
-        <w:tblW w:w="10244" w:type="dxa"/>
-        <w:jc w:val="left"/>
-        <w:tblInd w:w="-747" w:type="dxa"/>
-        <w:tblLayout w:type="fixed"/>
-        <w:tblCellMar>
-          <w:top w:w="55" w:type="dxa"/>
-          <w:left w:w="55" w:type="dxa"/>
-          <w:bottom w:w="55" w:type="dxa"/>
-          <w:right w:w="55" w:type="dxa"/>
-        </w:tblCellMar>
-      </w:tblPr>
-      <w:tblGrid>
-        <w:gridCol w:w="5314"/>
-        <w:gridCol w:w="1811"/>
-        <w:gridCol w:w="1136"/>
-        <w:gridCol w:w="1983"/>
-      </w:tblGrid>
-      <w:tr>
-        <w:trPr/>
-        <w:tc>
-          <w:tcPr>
-            <w:tcW w:w="5314" w:type="dxa"/>
-            <w:tcBorders/>
-          </w:tcPr>
-          <w:p>
-            <w:pPr>
-              <w:pStyle w:val="TableContents"/>
-              <w:spacing w:before="0" w:after="160"/>
-              <w:rPr>
-                <w:rFonts w:ascii="DejaVu Sans Condensed" w:hAnsi="DejaVu Sans Condensed" w:eastAsia="Calibri" w:cs="DejaVu Sans Condensed" w:eastAsiaTheme="minorHAnsi"/>
-                <w:color w:val="auto"/>
-                <w:kern w:val="0"/>
-                <w:sz w:val="16"/>
-                <w:szCs w:val="16"/>
-                <w:lang w:val="el-GR" w:eastAsia="en-US" w:bidi="ar-SA"/>
-              </w:rPr>
-            </w:pPr>
-            <w:r>
-              <w:rPr>
-                <w:rFonts w:eastAsia="Calibri" w:cs="DejaVu Sans Condensed" w:eastAsiaTheme="minorHAnsi" w:ascii="DejaVu Sans Condensed" w:hAnsi="DejaVu Sans Condensed"/>
-                <w:color w:val="auto"/>
-                <w:kern w:val="0"/>
-                <w:sz w:val="16"/>
-                <w:szCs w:val="16"/>
-                <w:lang w:val="el-GR" w:eastAsia="en-US" w:bidi="ar-SA"/>
-              </w:rPr>
-              <w:t>{_HOTEL_0004_COL1}</w:t>
-            </w:r>
-          </w:p>
-        </w:tc>
-        <w:tc>
-          <w:tcPr>
-            <w:tcW w:w="1811" w:type="dxa"/>
-            <w:tcBorders/>
-          </w:tcPr>
-          <w:p>
-            <w:pPr>
-              <w:pStyle w:val="TableContents"/>
-              <w:spacing w:before="0" w:after="160"/>
-              <w:rPr>
-                <w:rFonts w:ascii="DejaVu Sans Condensed" w:hAnsi="DejaVu Sans Condensed" w:eastAsia="Calibri" w:cs="DejaVu Sans Condensed" w:eastAsiaTheme="minorHAnsi"/>
-                <w:color w:val="auto"/>
-                <w:kern w:val="0"/>
-                <w:sz w:val="16"/>
-                <w:szCs w:val="16"/>
-                <w:lang w:val="el-GR" w:eastAsia="en-US" w:bidi="ar-SA"/>
-              </w:rPr>
-            </w:pPr>
-            <w:r>
-              <w:rPr>
-                <w:rFonts w:eastAsia="Calibri" w:cs="DejaVu Sans Condensed" w:eastAsiaTheme="minorHAnsi" w:ascii="DejaVu Sans Condensed" w:hAnsi="DejaVu Sans Condensed"/>
-                <w:color w:val="auto"/>
-                <w:kern w:val="0"/>
-                <w:sz w:val="16"/>
-                <w:szCs w:val="16"/>
-                <w:lang w:val="el-GR" w:eastAsia="en-US" w:bidi="ar-SA"/>
-              </w:rPr>
-              <w:t>{_HOTEL_0004_COL2}</w:t>
-            </w:r>
-          </w:p>
-        </w:tc>
-        <w:tc>
-          <w:tcPr>
-            <w:tcW w:w="1136" w:type="dxa"/>
-            <w:tcBorders/>
-          </w:tcPr>
-          <w:p>
-            <w:pPr>
-              <w:pStyle w:val="TableContents"/>
-              <w:spacing w:before="0" w:after="160"/>
-              <w:jc w:val="center"/>
-              <w:rPr>
-                <w:rFonts w:ascii="DejaVu Sans Condensed" w:hAnsi="DejaVu Sans Condensed" w:eastAsia="Calibri" w:cs="DejaVu Sans Condensed" w:eastAsiaTheme="minorHAnsi"/>
-                <w:color w:val="auto"/>
-                <w:kern w:val="0"/>
-                <w:sz w:val="16"/>
-                <w:szCs w:val="16"/>
-                <w:lang w:val="el-GR" w:eastAsia="en-US" w:bidi="ar-SA"/>
-              </w:rPr>
-            </w:pPr>
-            <w:r>
-              <w:rPr>
-                <w:rFonts w:eastAsia="Calibri" w:cs="DejaVu Sans Condensed" w:eastAsiaTheme="minorHAnsi" w:ascii="DejaVu Sans Condensed" w:hAnsi="DejaVu Sans Condensed"/>
-                <w:color w:val="auto"/>
-                <w:kern w:val="0"/>
-                <w:sz w:val="16"/>
-                <w:szCs w:val="16"/>
-                <w:lang w:val="el-GR" w:eastAsia="en-US" w:bidi="ar-SA"/>
-              </w:rPr>
-              <w:t>{_HOTEL_0004_COL3}</w:t>
-            </w:r>
-          </w:p>
-        </w:tc>
-        <w:tc>
-          <w:tcPr>
-            <w:tcW w:w="1983" w:type="dxa"/>
-            <w:tcBorders/>
-          </w:tcPr>
-          <w:p>
-            <w:pPr>
-              <w:pStyle w:val="TableContents"/>
-              <w:spacing w:before="0" w:after="160"/>
-              <w:jc w:val="right"/>
-              <w:rPr>
-                <w:rFonts w:ascii="DejaVu Sans Condensed" w:hAnsi="DejaVu Sans Condensed" w:eastAsia="Calibri" w:cs="DejaVu Sans Condensed" w:eastAsiaTheme="minorHAnsi"/>
-                <w:color w:val="auto"/>
-                <w:kern w:val="0"/>
-                <w:sz w:val="16"/>
-                <w:szCs w:val="16"/>
-                <w:lang w:val="el-GR" w:eastAsia="en-US" w:bidi="ar-SA"/>
-              </w:rPr>
-            </w:pPr>
-            <w:r>
-              <w:rPr>
-                <w:rFonts w:eastAsia="Calibri" w:cs="DejaVu Sans Condensed" w:eastAsiaTheme="minorHAnsi" w:ascii="DejaVu Sans Condensed" w:hAnsi="DejaVu Sans Condensed"/>
-                <w:color w:val="auto"/>
-                <w:kern w:val="0"/>
-                <w:sz w:val="16"/>
-                <w:szCs w:val="16"/>
-                <w:lang w:val="el-GR" w:eastAsia="en-US" w:bidi="ar-SA"/>
-              </w:rPr>
-              <w:t>{_HOTEL_0004_COL4}</w:t>
-            </w:r>
-          </w:p>
-        </w:tc>
-      </w:tr>
-    </w:tbl>
     <w:p>
       <w:pPr>
         <w:pStyle w:val="Normal"/>
+        <w:tabs>
+          <w:tab w:val="clear" w:pos="720"/>
+          <w:tab w:val="left" w:pos="4535" w:leader="none"/>
+          <w:tab w:val="left" w:pos="6236" w:leader="none"/>
+          <w:tab w:val="left" w:pos="7370" w:leader="none"/>
+        </w:tabs>
         <w:ind w:left="-709" w:right="-1186" w:hanging="0"/>
-        <w:jc w:val="both"/>
-        <w:rPr>
-          <w:rFonts w:ascii="DejaVu Sans Condensed" w:hAnsi="DejaVu Sans Condensed" w:cs="DejaVu Sans Condensed"/>
-          <w:sz w:val="18"/>
-          <w:szCs w:val="18"/>
-        </w:rPr>
+        <w:jc w:val="left"/>
+        <w:rPr/>
       </w:pPr>
       <w:r>
         <w:rPr>
-          <w:rFonts w:cs="DejaVu Sans Condensed" w:ascii="DejaVu Sans Condensed" w:hAnsi="DejaVu Sans Condensed"/>
-          <w:sz w:val="18"/>
-          <w:szCs w:val="18"/>
-        </w:rPr>
+          <w:rStyle w:val="SourceText"/>
+          <w:rFonts w:ascii="DejaVu Sans Mono" w:hAnsi="DejaVu Sans Mono"/>
+          <w:b w:val="false"/>
+          <w:i w:val="false"/>
+          <w:caps w:val="false"/>
+          <w:smallCaps w:val="false"/>
+          <w:color w:val="1F2328"/>
+          <w:spacing w:val="0"/>
+          <w:sz w:val="16"/>
+          <w:szCs w:val="16"/>
+          <w:u w:val="none"/>
+        </w:rPr>
+        <w:t>{_HOTEL_0004_TABLE}</w:t>
       </w:r>
     </w:p>
     <w:p>
@@ -14439,7 +14301,7 @@
           <w:szCs w:val="18"/>
           <w:lang w:val="el-GR" w:eastAsia="en-US" w:bidi="ar-SA"/>
         </w:rPr>
-        <w:t xml:space="preserve">Απαγορεύεται ρητά στ{_AITIATIKH_A} (_TYPOS_ERG_AITIATIKH} η παραβίαση των όρων χρήσης της ψηφιακής κάρτας εργασίας, όπως η ανακριβής και αναληθής καταχώρηση ώρας έναρξης ή λήξης του χρόνου διάρκειας της ημερήσιας εργασίας, η διάθεση αυτής (της κάρτας) σε τρίτα πρόσωπα, καθώς και συμμετοχή (σύμπραξή) τ{_GENIKH_A} σε ανάλογη ενέργεια άλλου εργαζομένου -συναδέλφου τ{_GENIKH_A}. </w:t>
+        <w:t xml:space="preserve">Απαγορεύεται ρητά στ{_AITIATIKH_A} {_TYPOS_ERG_AITIATIKH} η παραβίαση των όρων χρήσης της ψηφιακής κάρτας εργασίας, όπως η ανακριβής και αναληθής καταχώρηση ώρας έναρξης ή λήξης του χρόνου διάρκειας της ημερήσιας εργασίας, η διάθεση αυτής (της κάρτας) σε τρίτα πρόσωπα, καθώς και συμμετοχή (σύμπραξή) τ{_GENIKH_A} σε ανάλογη ενέργεια άλλου εργαζομένου -συναδέλφου τ{_GENIKH_A}. </w:t>
       </w:r>
     </w:p>
     <w:p>
@@ -15618,7 +15480,7 @@
           <w:sz w:val="18"/>
           <w:szCs w:val="18"/>
         </w:rPr>
-        <w:t>Η παρούσα σύμβαση, πληρούσα και τις προϋποθέσεις των άρθρων 69 -74 του Π.Δ. 80/2022, συντάχθηκε εις διπλούν, διαβάσθηκε, βεβαιώθηκε και υπογράφηκε από τα συμβαλλόμενα μέρη λαμβάνοντας έκαστος των συμβαλλομένων μερών από 1904ένα (1) όμοιο αντίτυπο.</w:t>
+        <w:t>Η παρούσα σύμβαση, πληρούσα και τις προϋποθέσεις των άρθρων 69 -74 του Π.Δ. 80/2022, συντάχθηκε εις διπλούν, διαβάσθηκε, βεβαιώθηκε και υπογράφηκε από τα συμβαλλόμενα μέρη λαμβάνοντας έκαστος των συμβαλλομένων μερών από ένα (1) όμοιο αντίτυπο.</w:t>
       </w:r>
     </w:p>
     <w:p>
@@ -16506,7 +16368,7 @@
               <w:color w:val="808080"/>
               <w:lang w:val="el-GR" w:eastAsia="en-US" w:bidi="ar-SA"/>
             </w:rPr>
-            <w:t>10</w:t>
+            <w:t>8</w:t>
           </w:r>
           <w:r>
             <w:rPr>
@@ -16937,7 +16799,7 @@
               <w:color w:val="808080"/>
               <w:lang w:val="el-GR" w:eastAsia="en-US" w:bidi="ar-SA"/>
             </w:rPr>
-            <w:t>10</w:t>
+            <w:t>8</w:t>
           </w:r>
           <w:r>
             <w:rPr>
@@ -18110,6 +17972,22 @@
       <w:u w:val="single"/>
     </w:rPr>
   </w:style>
+  <w:style w:type="character" w:styleId="SourceText">
+    <w:name w:val="Source Text"/>
+    <w:qFormat/>
+    <w:rPr>
+      <w:rFonts w:ascii="Liberation Mono" w:hAnsi="Liberation Mono" w:eastAsia="Liberation Mono" w:cs="Liberation Mono"/>
+    </w:rPr>
+  </w:style>
+  <w:style w:type="character" w:styleId="NumberingSymbols">
+    <w:name w:val="Numbering Symbols"/>
+    <w:qFormat/>
+    <w:rPr>
+      <w:rFonts w:ascii="DejaVu Sans Mono" w:hAnsi="DejaVu Sans Mono"/>
+      <w:sz w:val="18"/>
+      <w:szCs w:val="18"/>
+    </w:rPr>
+  </w:style>
   <w:style w:type="paragraph" w:styleId="Heading">
     <w:name w:val="Heading"/>
     <w:basedOn w:val="Normal"/>
@@ -18279,11 +18157,28 @@
     <w:pPr/>
     <w:rPr/>
   </w:style>
+  <w:style w:type="paragraph" w:styleId="PreformattedText">
+    <w:name w:val="Preformatted Text"/>
+    <w:basedOn w:val="Normal"/>
+    <w:qFormat/>
+    <w:pPr>
+      <w:spacing w:before="0" w:after="0"/>
+    </w:pPr>
+    <w:rPr>
+      <w:rFonts w:ascii="Liberation Mono" w:hAnsi="Liberation Mono" w:eastAsia="Liberation Mono" w:cs="Liberation Mono"/>
+      <w:sz w:val="20"/>
+      <w:szCs w:val="20"/>
+    </w:rPr>
+  </w:style>
   <w:style w:type="numbering" w:styleId="NoList" w:default="1">
     <w:name w:val="No List"/>
     <w:uiPriority w:val="99"/>
     <w:semiHidden/>
     <w:unhideWhenUsed/>
+    <w:qFormat/>
+  </w:style>
+  <w:style w:type="numbering" w:styleId="Bullet">
+    <w:name w:val="Bullet •"/>
     <w:qFormat/>
   </w:style>
   <w:style w:type="table" w:default="1" w:styleId="a1">

</xml_diff>

<commit_message>
🚀 Deploy prod build - 1.0.32 (Phase 1)
</commit_message>
<xml_diff>
--- a/public/templates/ΑΡΧΙΚΗ ΣΥΜΒΑΣΗ ΕΡΓΑΖΟΜΕΝΩΝ.docx
+++ b/public/templates/ΑΡΧΙΚΗ ΣΥΜΒΑΣΗ ΕΡΓΑΖΟΜΕΝΩΝ.docx
@@ -2836,15 +2836,7 @@
           <w:sz w:val="18"/>
           <w:szCs w:val="18"/>
         </w:rPr>
-        <w:t xml:space="preserve"> {_HOTEL_0003}</w:t>
-      </w:r>
-      <w:r>
-        <w:rPr>
-          <w:rFonts w:cs="DejaVu Sans Condensed" w:ascii="DejaVu Sans Condensed" w:hAnsi="DejaVu Sans Condensed"/>
-          <w:sz w:val="18"/>
-          <w:szCs w:val="18"/>
-        </w:rPr>
-        <w:t>{_GENIKOI_OROI_0025}</w:t>
+        <w:t xml:space="preserve"> {_HOTEL_0003}{_GENIKOI_OROI_0025}</w:t>
       </w:r>
     </w:p>
     <w:p>
@@ -6167,23 +6159,7 @@
           <w:sz w:val="18"/>
           <w:szCs w:val="18"/>
         </w:rPr>
-        <w:t>{_ERGODOTHS_</w:t>
-      </w:r>
-      <w:r>
-        <w:rPr>
-          <w:rFonts w:cs="DejaVu Sans Condensed" w:ascii="DejaVu Sans Condensed" w:hAnsi="DejaVu Sans Condensed"/>
-          <w:sz w:val="18"/>
-          <w:szCs w:val="18"/>
-        </w:rPr>
-        <w:t>CAPITAL_A</w:t>
-      </w:r>
-      <w:r>
-        <w:rPr>
-          <w:rFonts w:cs="DejaVu Sans Condensed" w:ascii="DejaVu Sans Condensed" w:hAnsi="DejaVu Sans Condensed"/>
-          <w:sz w:val="18"/>
-          <w:szCs w:val="18"/>
-        </w:rPr>
-        <w:t xml:space="preserve">} επιφυλάσσεται ρητώς τού δικαιώματος μονομερούς ανάκλησης των παροχών αυτών, σε χρήμα ή είδος ή επιδόματος που έχουν χορηγηθεί υπό την αίρεση της άρσης χορήγησης του κατά την κρίση {_ERGODOTHS_GENIKH}. </w:t>
+        <w:t xml:space="preserve">{_ERGODOTHS_CAPITAL_A} επιφυλάσσεται ρητώς τού δικαιώματος μονομερούς ανάκλησης των παροχών αυτών, σε χρήμα ή είδος ή επιδόματος που έχουν χορηγηθεί υπό την αίρεση της άρσης χορήγησης του κατά την κρίση {_ERGODOTHS_GENIKH}. </w:t>
       </w:r>
     </w:p>
     <w:p>
@@ -7840,7 +7816,29 @@
           <w:szCs w:val="18"/>
           <w:lang w:val="el-GR" w:eastAsia="en-US" w:bidi="ar-SA"/>
         </w:rPr>
-        <w:t>ά σύστημα ή/και με σόλιο τροπο καταστρατήγηση του συστήματος της ψηφιακής κάρτας.</w:t>
+        <w:t xml:space="preserve">ά σύστημα ή/και με </w:t>
+      </w:r>
+      <w:r>
+        <w:rPr>
+          <w:rFonts w:eastAsia="Calibri" w:cs="DejaVu Sans Condensed" w:ascii="DejaVu Sans Condensed" w:hAnsi="DejaVu Sans Condensed" w:eastAsiaTheme="minorHAnsi"/>
+          <w:color w:val="auto"/>
+          <w:kern w:val="0"/>
+          <w:sz w:val="18"/>
+          <w:szCs w:val="18"/>
+          <w:lang w:val="el-GR" w:eastAsia="en-US" w:bidi="ar-SA"/>
+        </w:rPr>
+        <w:t>δ</w:t>
+      </w:r>
+      <w:r>
+        <w:rPr>
+          <w:rFonts w:eastAsia="Calibri" w:cs="DejaVu Sans Condensed" w:ascii="DejaVu Sans Condensed" w:hAnsi="DejaVu Sans Condensed" w:eastAsiaTheme="minorHAnsi"/>
+          <w:color w:val="auto"/>
+          <w:kern w:val="0"/>
+          <w:sz w:val="18"/>
+          <w:szCs w:val="18"/>
+          <w:lang w:val="el-GR" w:eastAsia="en-US" w:bidi="ar-SA"/>
+        </w:rPr>
+        <w:t>όλιο τρόπο καταστρατήγηση του συστήματος της ψηφιακής κάρτας.</w:t>
       </w:r>
     </w:p>
     <w:p>
@@ -10782,25 +10780,17 @@
           <w:sz w:val="18"/>
           <w:szCs w:val="18"/>
         </w:rPr>
-        <w:t>{_HOTEL_1021} {_ERGODOTHS_CAPITAL_A} {</w:t>
-      </w:r>
-      <w:r>
-        <w:rPr>
-          <w:rFonts w:cs="DejaVu Sans Condensed" w:ascii="DejaVu Sans Condensed" w:hAnsi="DejaVu Sans Condensed"/>
-          <w:b/>
-          <w:bCs/>
-          <w:sz w:val="18"/>
-          <w:szCs w:val="18"/>
-        </w:rPr>
-        <w:t>_HOTEL_1022</w:t>
-      </w:r>
-      <w:r>
-        <w:rPr>
-          <w:rFonts w:cs="DejaVu Sans Condensed" w:ascii="DejaVu Sans Condensed" w:hAnsi="DejaVu Sans Condensed"/>
-          <w:sz w:val="18"/>
-          <w:szCs w:val="18"/>
-        </w:rPr>
-        <w:t>}</w:t>
+        <w:t xml:space="preserve">{_HOTEL_1021} {_ERGODOTHS_CAPITAL_A} </w:t>
+      </w:r>
+      <w:r>
+        <w:rPr>
+          <w:rFonts w:cs="DejaVu Sans Condensed" w:ascii="DejaVu Sans Condensed" w:hAnsi="DejaVu Sans Condensed"/>
+          <w:b/>
+          <w:bCs/>
+          <w:sz w:val="18"/>
+          <w:szCs w:val="18"/>
+        </w:rPr>
+        <w:t>{_HOTEL_1022}</w:t>
       </w:r>
     </w:p>
     <w:p>
@@ -13127,18 +13117,7 @@
           <w:szCs w:val="18"/>
           <w:lang w:val="el-GR" w:eastAsia="en-US" w:bidi="ar-SA"/>
         </w:rPr>
-        <w:t xml:space="preserve"> έλαβε γνώση του κανονισμού εργασίας </w:t>
-      </w:r>
-      <w:r>
-        <w:rPr>
-          <w:rFonts w:eastAsia="Calibri" w:cs="DejaVu Sans Condensed" w:ascii="DejaVu Sans Condensed" w:hAnsi="DejaVu Sans Condensed" w:eastAsiaTheme="minorHAnsi"/>
-          <w:color w:val="auto"/>
-          <w:kern w:val="0"/>
-          <w:sz w:val="18"/>
-          <w:szCs w:val="18"/>
-          <w:lang w:val="el-GR" w:eastAsia="en-US" w:bidi="ar-SA"/>
-        </w:rPr>
-        <w:t xml:space="preserve">και </w:t>
+        <w:t xml:space="preserve"> έλαβε γνώση του κανονισμού εργασίας και </w:t>
       </w:r>
       <w:r>
         <w:rPr>

</xml_diff>

<commit_message>
🚀 Deploy prod build - 1.0.60 (Phase 1)
</commit_message>
<xml_diff>
--- a/public/templates/ΑΡΧΙΚΗ ΣΥΜΒΑΣΗ ΕΡΓΑΖΟΜΕΝΩΝ.docx
+++ b/public/templates/ΑΡΧΙΚΗ ΣΥΜΒΑΣΗ ΕΡΓΑΖΟΜΕΝΩΝ.docx
@@ -3813,7 +3813,7 @@
       </w:pPr>
       <w:r>
         <w:rPr>
-          <w:rStyle w:val="SourceText"/>
+          <w:rStyle w:val="Style16"/>
           <w:rFonts w:ascii="DejaVu Sans Mono" w:hAnsi="DejaVu Sans Mono"/>
           <w:b w:val="false"/>
           <w:i w:val="false"/>
@@ -7816,29 +7816,7 @@
           <w:szCs w:val="18"/>
           <w:lang w:val="el-GR" w:eastAsia="en-US" w:bidi="ar-SA"/>
         </w:rPr>
-        <w:t xml:space="preserve">ά σύστημα ή/και με </w:t>
-      </w:r>
-      <w:r>
-        <w:rPr>
-          <w:rFonts w:eastAsia="Calibri" w:cs="DejaVu Sans Condensed" w:ascii="DejaVu Sans Condensed" w:hAnsi="DejaVu Sans Condensed" w:eastAsiaTheme="minorHAnsi"/>
-          <w:color w:val="auto"/>
-          <w:kern w:val="0"/>
-          <w:sz w:val="18"/>
-          <w:szCs w:val="18"/>
-          <w:lang w:val="el-GR" w:eastAsia="en-US" w:bidi="ar-SA"/>
-        </w:rPr>
-        <w:t>δ</w:t>
-      </w:r>
-      <w:r>
-        <w:rPr>
-          <w:rFonts w:eastAsia="Calibri" w:cs="DejaVu Sans Condensed" w:ascii="DejaVu Sans Condensed" w:hAnsi="DejaVu Sans Condensed" w:eastAsiaTheme="minorHAnsi"/>
-          <w:color w:val="auto"/>
-          <w:kern w:val="0"/>
-          <w:sz w:val="18"/>
-          <w:szCs w:val="18"/>
-          <w:lang w:val="el-GR" w:eastAsia="en-US" w:bidi="ar-SA"/>
-        </w:rPr>
-        <w:t>όλιο τρόπο καταστρατήγηση του συστήματος της ψηφιακής κάρτας.</w:t>
+        <w:t>ά σύστημα ή/και με δόλιο τρόπο καταστρατήγηση του συστήματος της ψηφιακής κάρτας.</w:t>
       </w:r>
     </w:p>
     <w:p>
@@ -16043,7 +16021,7 @@
 <w:ftr xmlns:o="urn:schemas-microsoft-com:office:office" xmlns:r="http://schemas.openxmlformats.org/officeDocument/2006/relationships" xmlns:v="urn:schemas-microsoft-com:vml" xmlns:w="http://schemas.openxmlformats.org/wordprocessingml/2006/main" xmlns:w10="urn:schemas-microsoft-com:office:word" xmlns:wp="http://schemas.openxmlformats.org/drawingml/2006/wordprocessingDrawing" xmlns:wps="http://schemas.microsoft.com/office/word/2010/wordprocessingShape" xmlns:wpg="http://schemas.microsoft.com/office/word/2010/wordprocessingGroup" xmlns:mc="http://schemas.openxmlformats.org/markup-compatibility/2006" xmlns:wp14="http://schemas.microsoft.com/office/word/2010/wordprocessingDrawing" xmlns:w14="http://schemas.microsoft.com/office/word/2010/wordml" xmlns:w15="http://schemas.microsoft.com/office/word/2012/wordml" mc:Ignorable="w14 wp14 w15">
   <w:p>
     <w:pPr>
-      <w:pStyle w:val="Footer"/>
+      <w:pStyle w:val="Style25"/>
       <w:rPr/>
     </w:pPr>
     <w:r>
@@ -16090,7 +16068,7 @@
         </w:tcPr>
         <w:p>
           <w:pPr>
-            <w:pStyle w:val="Footer"/>
+            <w:pStyle w:val="Style25"/>
             <w:widowControl w:val="false"/>
             <w:suppressAutoHyphens w:val="true"/>
             <w:spacing w:before="0" w:after="0"/>
@@ -16127,7 +16105,7 @@
         </w:tcPr>
         <w:p>
           <w:pPr>
-            <w:pStyle w:val="Footer"/>
+            <w:pStyle w:val="Style25"/>
             <w:widowControl w:val="false"/>
             <w:suppressAutoHyphens w:val="true"/>
             <w:spacing w:before="0" w:after="0"/>
@@ -16165,7 +16143,7 @@
         </w:tcPr>
         <w:p>
           <w:pPr>
-            <w:pStyle w:val="Footer"/>
+            <w:pStyle w:val="Style25"/>
             <w:widowControl w:val="false"/>
             <w:suppressAutoHyphens w:val="true"/>
             <w:spacing w:before="0" w:after="0"/>
@@ -16298,7 +16276,7 @@
         </w:tcPr>
         <w:p>
           <w:pPr>
-            <w:pStyle w:val="Footer"/>
+            <w:pStyle w:val="Style25"/>
             <w:widowControl w:val="false"/>
             <w:suppressAutoHyphens w:val="true"/>
             <w:spacing w:before="0" w:after="0"/>
@@ -16459,7 +16437,7 @@
   </w:tbl>
   <w:p>
     <w:pPr>
-      <w:pStyle w:val="Footer"/>
+      <w:pStyle w:val="Style25"/>
       <w:rPr>
         <w:color w:val="5B9BD5" w:themeColor="accent1"/>
       </w:rPr>
@@ -16474,7 +16452,7 @@
   </w:p>
   <w:p>
     <w:pPr>
-      <w:pStyle w:val="Footer"/>
+      <w:pStyle w:val="Style25"/>
       <w:rPr/>
     </w:pPr>
     <w:r>
@@ -16521,7 +16499,7 @@
         </w:tcPr>
         <w:p>
           <w:pPr>
-            <w:pStyle w:val="Footer"/>
+            <w:pStyle w:val="Style25"/>
             <w:widowControl w:val="false"/>
             <w:suppressAutoHyphens w:val="true"/>
             <w:spacing w:before="0" w:after="0"/>
@@ -16558,7 +16536,7 @@
         </w:tcPr>
         <w:p>
           <w:pPr>
-            <w:pStyle w:val="Footer"/>
+            <w:pStyle w:val="Style25"/>
             <w:widowControl w:val="false"/>
             <w:suppressAutoHyphens w:val="true"/>
             <w:spacing w:before="0" w:after="0"/>
@@ -16596,7 +16574,7 @@
         </w:tcPr>
         <w:p>
           <w:pPr>
-            <w:pStyle w:val="Footer"/>
+            <w:pStyle w:val="Style25"/>
             <w:widowControl w:val="false"/>
             <w:suppressAutoHyphens w:val="true"/>
             <w:spacing w:before="0" w:after="0"/>
@@ -16729,7 +16707,7 @@
         </w:tcPr>
         <w:p>
           <w:pPr>
-            <w:pStyle w:val="Footer"/>
+            <w:pStyle w:val="Style25"/>
             <w:widowControl w:val="false"/>
             <w:suppressAutoHyphens w:val="true"/>
             <w:spacing w:before="0" w:after="0"/>
@@ -16890,7 +16868,7 @@
   </w:tbl>
   <w:p>
     <w:pPr>
-      <w:pStyle w:val="Footer"/>
+      <w:pStyle w:val="Style25"/>
       <w:rPr>
         <w:color w:val="5B9BD5" w:themeColor="accent1"/>
       </w:rPr>
@@ -16905,7 +16883,7 @@
   </w:p>
   <w:p>
     <w:pPr>
-      <w:pStyle w:val="Footer"/>
+      <w:pStyle w:val="Style25"/>
       <w:rPr/>
     </w:pPr>
     <w:r>
@@ -16919,7 +16897,7 @@
 <w:hdr xmlns:o="urn:schemas-microsoft-com:office:office" xmlns:r="http://schemas.openxmlformats.org/officeDocument/2006/relationships" xmlns:v="urn:schemas-microsoft-com:vml" xmlns:w="http://schemas.openxmlformats.org/wordprocessingml/2006/main" xmlns:w10="urn:schemas-microsoft-com:office:word" xmlns:wp="http://schemas.openxmlformats.org/drawingml/2006/wordprocessingDrawing" xmlns:wps="http://schemas.microsoft.com/office/word/2010/wordprocessingShape" xmlns:wpg="http://schemas.microsoft.com/office/word/2010/wordprocessingGroup" xmlns:mc="http://schemas.openxmlformats.org/markup-compatibility/2006" xmlns:wp14="http://schemas.microsoft.com/office/word/2010/wordprocessingDrawing" xmlns:w14="http://schemas.microsoft.com/office/word/2010/wordml" xmlns:w15="http://schemas.microsoft.com/office/word/2012/wordml" mc:Ignorable="w14 wp14 w15">
   <w:p>
     <w:pPr>
-      <w:pStyle w:val="Header"/>
+      <w:pStyle w:val="Style24"/>
       <w:rPr/>
     </w:pPr>
     <w:r>
@@ -16965,7 +16943,7 @@
         </w:tcPr>
         <w:p>
           <w:pPr>
-            <w:pStyle w:val="Header"/>
+            <w:pStyle w:val="Style24"/>
             <w:widowControl w:val="false"/>
             <w:tabs>
               <w:tab w:val="clear" w:pos="8306"/>
@@ -17020,7 +16998,7 @@
         </w:tcPr>
         <w:p>
           <w:pPr>
-            <w:pStyle w:val="Header"/>
+            <w:pStyle w:val="Style24"/>
             <w:widowControl w:val="false"/>
             <w:tabs>
               <w:tab w:val="clear" w:pos="8306"/>
@@ -17170,7 +17148,7 @@
   </w:tbl>
   <w:p>
     <w:pPr>
-      <w:pStyle w:val="Header"/>
+      <w:pStyle w:val="Style24"/>
       <w:widowControl/>
       <w:tabs>
         <w:tab w:val="clear" w:pos="8306"/>
@@ -17245,7 +17223,7 @@
         </w:tcPr>
         <w:p>
           <w:pPr>
-            <w:pStyle w:val="Header"/>
+            <w:pStyle w:val="Style24"/>
             <w:widowControl w:val="false"/>
             <w:tabs>
               <w:tab w:val="clear" w:pos="8306"/>
@@ -17300,7 +17278,7 @@
         </w:tcPr>
         <w:p>
           <w:pPr>
-            <w:pStyle w:val="Header"/>
+            <w:pStyle w:val="Style24"/>
             <w:widowControl w:val="false"/>
             <w:tabs>
               <w:tab w:val="clear" w:pos="8306"/>
@@ -17450,7 +17428,7 @@
   </w:tbl>
   <w:p>
     <w:pPr>
-      <w:pStyle w:val="Header"/>
+      <w:pStyle w:val="Style24"/>
       <w:widowControl/>
       <w:tabs>
         <w:tab w:val="clear" w:pos="8306"/>
@@ -17928,7 +17906,6 @@
   <w:style w:type="character" w:styleId="Char1" w:customStyle="1">
     <w:name w:val="Κεφαλίδα Char"/>
     <w:basedOn w:val="DefaultParagraphFont"/>
-    <w:link w:val="Header"/>
     <w:uiPriority w:val="99"/>
     <w:qFormat/>
     <w:rsid w:val="002b5881"/>
@@ -17937,7 +17914,6 @@
   <w:style w:type="character" w:styleId="Char2" w:customStyle="1">
     <w:name w:val="Υποσέλιδο Char"/>
     <w:basedOn w:val="DefaultParagraphFont"/>
-    <w:link w:val="Footer"/>
     <w:uiPriority w:val="99"/>
     <w:qFormat/>
     <w:rsid w:val="002b5881"/>
@@ -17964,29 +17940,29 @@
     <w:qFormat/>
     <w:rPr/>
   </w:style>
-  <w:style w:type="character" w:styleId="InternetLink">
-    <w:name w:val="Hyperlink"/>
+  <w:style w:type="character" w:styleId="Style14">
+    <w:name w:val="Σύνδεσμος διαδικτύου"/>
     <w:rPr>
       <w:color w:val="000080"/>
       <w:u w:val="single"/>
     </w:rPr>
   </w:style>
-  <w:style w:type="character" w:styleId="VisitedInternetLink">
-    <w:name w:val="FollowedHyperlink"/>
+  <w:style w:type="character" w:styleId="Style15">
+    <w:name w:val="Αναγνωσμένος δεσμός διαδικτύου"/>
     <w:rPr>
       <w:color w:val="800000"/>
       <w:u w:val="single"/>
     </w:rPr>
   </w:style>
-  <w:style w:type="character" w:styleId="SourceText">
-    <w:name w:val="Source Text"/>
+  <w:style w:type="character" w:styleId="Style16">
+    <w:name w:val="Κείμενο πηγής"/>
     <w:qFormat/>
     <w:rPr>
       <w:rFonts w:ascii="Liberation Mono" w:hAnsi="Liberation Mono" w:eastAsia="Liberation Mono" w:cs="Liberation Mono"/>
     </w:rPr>
   </w:style>
-  <w:style w:type="character" w:styleId="NumberingSymbols">
-    <w:name w:val="Numbering Symbols"/>
+  <w:style w:type="character" w:styleId="Style17">
+    <w:name w:val="Χαρακτήρες αρίθμησης"/>
     <w:qFormat/>
     <w:rPr>
       <w:rFonts w:ascii="DejaVu Sans Mono" w:hAnsi="DejaVu Sans Mono"/>
@@ -17994,10 +17970,10 @@
       <w:szCs w:val="18"/>
     </w:rPr>
   </w:style>
-  <w:style w:type="paragraph" w:styleId="Heading">
-    <w:name w:val="Heading"/>
+  <w:style w:type="paragraph" w:styleId="Style18">
+    <w:name w:val="Επικεφαλίδα"/>
     <w:basedOn w:val="Normal"/>
-    <w:next w:val="TextBody"/>
+    <w:next w:val="Style19"/>
     <w:qFormat/>
     <w:pPr>
       <w:keepNext w:val="true"/>
@@ -18009,7 +17985,7 @@
       <w:szCs w:val="28"/>
     </w:rPr>
   </w:style>
-  <w:style w:type="paragraph" w:styleId="TextBody">
+  <w:style w:type="paragraph" w:styleId="Style19">
     <w:name w:val="Body Text"/>
     <w:basedOn w:val="Normal"/>
     <w:pPr>
@@ -18017,15 +17993,15 @@
     </w:pPr>
     <w:rPr/>
   </w:style>
-  <w:style w:type="paragraph" w:styleId="List">
+  <w:style w:type="paragraph" w:styleId="Style20">
     <w:name w:val="List"/>
-    <w:basedOn w:val="TextBody"/>
+    <w:basedOn w:val="Style19"/>
     <w:pPr/>
     <w:rPr>
       <w:rFonts w:cs="Lohit Devanagari"/>
     </w:rPr>
   </w:style>
-  <w:style w:type="paragraph" w:styleId="Caption">
+  <w:style w:type="paragraph" w:styleId="Style21">
     <w:name w:val="Caption"/>
     <w:basedOn w:val="Normal"/>
     <w:qFormat/>
@@ -18041,8 +18017,8 @@
       <w:szCs w:val="24"/>
     </w:rPr>
   </w:style>
-  <w:style w:type="paragraph" w:styleId="Index">
-    <w:name w:val="Index"/>
+  <w:style w:type="paragraph" w:styleId="Style22">
+    <w:name w:val="Ευρετήριο"/>
     <w:basedOn w:val="Normal"/>
     <w:qFormat/>
     <w:pPr>
@@ -18083,14 +18059,14 @@
       <w:szCs w:val="18"/>
     </w:rPr>
   </w:style>
-  <w:style w:type="paragraph" w:styleId="HeaderandFooter">
-    <w:name w:val="Header and Footer"/>
+  <w:style w:type="paragraph" w:styleId="Style23">
+    <w:name w:val="Κεφαλίδα και υποσέλιδο"/>
     <w:basedOn w:val="Normal"/>
     <w:qFormat/>
     <w:pPr/>
     <w:rPr/>
   </w:style>
-  <w:style w:type="paragraph" w:styleId="Header">
+  <w:style w:type="paragraph" w:styleId="Style24">
     <w:name w:val="Header"/>
     <w:basedOn w:val="Normal"/>
     <w:link w:val="Char1"/>
@@ -18107,7 +18083,7 @@
     </w:pPr>
     <w:rPr/>
   </w:style>
-  <w:style w:type="paragraph" w:styleId="Footer">
+  <w:style w:type="paragraph" w:styleId="Style25">
     <w:name w:val="Footer"/>
     <w:basedOn w:val="Normal"/>
     <w:link w:val="Char2"/>
@@ -18124,8 +18100,8 @@
     </w:pPr>
     <w:rPr/>
   </w:style>
-  <w:style w:type="paragraph" w:styleId="TableContents">
-    <w:name w:val="Table Contents"/>
+  <w:style w:type="paragraph" w:styleId="Style26">
+    <w:name w:val="Περιεχόμενα πίνακα"/>
     <w:basedOn w:val="Normal"/>
     <w:qFormat/>
     <w:pPr>
@@ -18134,9 +18110,9 @@
     </w:pPr>
     <w:rPr/>
   </w:style>
-  <w:style w:type="paragraph" w:styleId="TableHeading">
-    <w:name w:val="Table Heading"/>
-    <w:basedOn w:val="TableContents"/>
+  <w:style w:type="paragraph" w:styleId="Style27">
+    <w:name w:val="Επικεφαλίδα πίνακα"/>
+    <w:basedOn w:val="Style26"/>
     <w:qFormat/>
     <w:pPr>
       <w:suppressLineNumbers/>
@@ -18147,8 +18123,8 @@
       <w:bCs/>
     </w:rPr>
   </w:style>
-  <w:style w:type="paragraph" w:styleId="ListContents">
-    <w:name w:val="List Contents"/>
+  <w:style w:type="paragraph" w:styleId="Style28">
+    <w:name w:val="Περιεχόμενα λίστας"/>
     <w:basedOn w:val="Normal"/>
     <w:qFormat/>
     <w:pPr>
@@ -18163,8 +18139,8 @@
     <w:pPr/>
     <w:rPr/>
   </w:style>
-  <w:style w:type="paragraph" w:styleId="PreformattedText">
-    <w:name w:val="Preformatted Text"/>
+  <w:style w:type="paragraph" w:styleId="Style29">
+    <w:name w:val="Προμορφοποιημένο κείμενο"/>
     <w:basedOn w:val="Normal"/>
     <w:qFormat/>
     <w:pPr>

</xml_diff>

<commit_message>
🚀 Deploy prod build - 1.0.63 (Phase 1)
</commit_message>
<xml_diff>
--- a/public/templates/ΑΡΧΙΚΗ ΣΥΜΒΑΣΗ ΕΡΓΑΖΟΜΕΝΩΝ.docx
+++ b/public/templates/ΑΡΧΙΚΗ ΣΥΜΒΑΣΗ ΕΡΓΑΖΟΜΕΝΩΝ.docx
@@ -10758,17 +10758,37 @@
           <w:sz w:val="18"/>
           <w:szCs w:val="18"/>
         </w:rPr>
-        <w:t xml:space="preserve">{_HOTEL_1021} {_ERGODOTHS_CAPITAL_A} </w:t>
-      </w:r>
-      <w:r>
-        <w:rPr>
-          <w:rFonts w:cs="DejaVu Sans Condensed" w:ascii="DejaVu Sans Condensed" w:hAnsi="DejaVu Sans Condensed"/>
-          <w:b/>
-          <w:bCs/>
-          <w:sz w:val="18"/>
-          <w:szCs w:val="18"/>
-        </w:rPr>
-        <w:t>{_HOTEL_1022}</w:t>
+        <w:t xml:space="preserve">{_HOTEL_1021} </w:t>
+      </w:r>
+      <w:r>
+        <w:rPr>
+          <w:rFonts w:cs="DejaVu Sans Condensed" w:ascii="DejaVu Sans Condensed" w:hAnsi="DejaVu Sans Condensed"/>
+          <w:b/>
+          <w:bCs/>
+          <w:sz w:val="18"/>
+          <w:szCs w:val="18"/>
+        </w:rPr>
+        <w:t xml:space="preserve">{_HOTEL_1022} </w:t>
+      </w:r>
+      <w:r>
+        <w:rPr>
+          <w:rFonts w:cs="DejaVu Sans Condensed" w:ascii="DejaVu Sans Condensed" w:hAnsi="DejaVu Sans Condensed"/>
+          <w:b w:val="false"/>
+          <w:bCs w:val="false"/>
+          <w:sz w:val="18"/>
+          <w:szCs w:val="18"/>
+        </w:rPr>
+        <w:t>{_GENIKOI_OROI_1021}</w:t>
+      </w:r>
+      <w:r>
+        <w:rPr>
+          <w:rFonts w:cs="DejaVu Sans Condensed" w:ascii="DejaVu Sans Condensed" w:hAnsi="DejaVu Sans Condensed"/>
+          <w:b/>
+          <w:bCs/>
+          <w:sz w:val="18"/>
+          <w:szCs w:val="18"/>
+        </w:rPr>
+        <w:t>{_GENIKOI_OROI_1022}</w:t>
       </w:r>
     </w:p>
     <w:p>
@@ -10854,23 +10874,7 @@
           <w:sz w:val="18"/>
           <w:szCs w:val="18"/>
         </w:rPr>
-        <w:t>{_HOTEL_</w:t>
-      </w:r>
-      <w:r>
-        <w:rPr>
-          <w:rFonts w:cs="DejaVu Sans Condensed" w:ascii="DejaVu Sans Condensed" w:hAnsi="DejaVu Sans Condensed"/>
-          <w:sz w:val="18"/>
-          <w:szCs w:val="18"/>
-        </w:rPr>
-        <w:t>1100</w:t>
-      </w:r>
-      <w:r>
-        <w:rPr>
-          <w:rFonts w:cs="DejaVu Sans Condensed" w:ascii="DejaVu Sans Condensed" w:hAnsi="DejaVu Sans Condensed"/>
-          <w:sz w:val="18"/>
-          <w:szCs w:val="18"/>
-        </w:rPr>
-        <w:t>}{_GENIKOI_OROI_0011}</w:t>
+        <w:t>{_HOTEL_1100}{_GENIKOI_OROI_0011}</w:t>
       </w:r>
     </w:p>
     <w:p>

</xml_diff>

<commit_message>
🚀 Deploy prod build - 1.0.65 (Phase 1)
</commit_message>
<xml_diff>
--- a/public/templates/ΑΡΧΙΚΗ ΣΥΜΒΑΣΗ ΕΡΓΑΖΟΜΕΝΩΝ.docx
+++ b/public/templates/ΑΡΧΙΚΗ ΣΥΜΒΑΣΗ ΕΡΓΑΖΟΜΕΝΩΝ.docx
@@ -1051,7 +1051,23 @@
           <w:sz w:val="18"/>
           <w:szCs w:val="18"/>
         </w:rPr>
-        <w:t xml:space="preserve">}, του </w:t>
+        <w:t xml:space="preserve">}, </w:t>
+      </w:r>
+      <w:r>
+        <w:rPr>
+          <w:rFonts w:cs="DejaVu Sans Condensed" w:ascii="DejaVu Sans Condensed" w:hAnsi="DejaVu Sans Condensed"/>
+          <w:sz w:val="18"/>
+          <w:szCs w:val="18"/>
+        </w:rPr>
+        <w:t xml:space="preserve">τ{_GENIKH_PM} </w:t>
+      </w:r>
+      <w:r>
+        <w:rPr>
+          <w:rFonts w:cs="DejaVu Sans Condensed" w:ascii="DejaVu Sans Condensed" w:hAnsi="DejaVu Sans Condensed"/>
+          <w:sz w:val="18"/>
+          <w:szCs w:val="18"/>
+        </w:rPr>
+        <w:t xml:space="preserve"> </w:t>
       </w:r>
       <w:r>
         <w:rPr>
@@ -10874,23 +10890,7 @@
           <w:sz w:val="18"/>
           <w:szCs w:val="18"/>
         </w:rPr>
-        <w:t>{_HOTEL_1100}{_GENIKOI_OROI_11</w:t>
-      </w:r>
-      <w:r>
-        <w:rPr>
-          <w:rFonts w:cs="DejaVu Sans Condensed" w:ascii="DejaVu Sans Condensed" w:hAnsi="DejaVu Sans Condensed"/>
-          <w:sz w:val="18"/>
-          <w:szCs w:val="18"/>
-        </w:rPr>
-        <w:t>00</w:t>
-      </w:r>
-      <w:r>
-        <w:rPr>
-          <w:rFonts w:cs="DejaVu Sans Condensed" w:ascii="DejaVu Sans Condensed" w:hAnsi="DejaVu Sans Condensed"/>
-          <w:sz w:val="18"/>
-          <w:szCs w:val="18"/>
-        </w:rPr>
-        <w:t>}</w:t>
+        <w:t>{_HOTEL_1100}{_GENIKOI_OROI_1100}</w:t>
       </w:r>
     </w:p>
     <w:p>

</xml_diff>

<commit_message>
🚀 Deploy prod build - 1.0.66 (Phase 1)
</commit_message>
<xml_diff>
--- a/public/templates/ΑΡΧΙΚΗ ΣΥΜΒΑΣΗ ΕΡΓΑΖΟΜΕΝΩΝ.docx
+++ b/public/templates/ΑΡΧΙΚΗ ΣΥΜΒΑΣΗ ΕΡΓΑΖΟΜΕΝΩΝ.docx
@@ -1051,23 +1051,7 @@
           <w:sz w:val="18"/>
           <w:szCs w:val="18"/>
         </w:rPr>
-        <w:t xml:space="preserve">}, </w:t>
-      </w:r>
-      <w:r>
-        <w:rPr>
-          <w:rFonts w:cs="DejaVu Sans Condensed" w:ascii="DejaVu Sans Condensed" w:hAnsi="DejaVu Sans Condensed"/>
-          <w:sz w:val="18"/>
-          <w:szCs w:val="18"/>
-        </w:rPr>
-        <w:t xml:space="preserve">τ{_GENIKH_PM} </w:t>
-      </w:r>
-      <w:r>
-        <w:rPr>
-          <w:rFonts w:cs="DejaVu Sans Condensed" w:ascii="DejaVu Sans Condensed" w:hAnsi="DejaVu Sans Condensed"/>
-          <w:sz w:val="18"/>
-          <w:szCs w:val="18"/>
-        </w:rPr>
-        <w:t xml:space="preserve"> </w:t>
+        <w:t xml:space="preserve">}, τ{_GENIKH_PM}  </w:t>
       </w:r>
       <w:r>
         <w:rPr>
@@ -2318,6 +2302,16 @@
       <w:r>
         <w:rPr>
           <w:rFonts w:cs="DejaVu Sans Condensed" w:ascii="DejaVu Sans Condensed" w:hAnsi="DejaVu Sans Condensed"/>
+          <w:i w:val="false"/>
+          <w:iCs w:val="false"/>
+          <w:sz w:val="18"/>
+          <w:szCs w:val="18"/>
+        </w:rPr>
+        <w:t>{_HOTEL_EGSSE_0001}</w:t>
+      </w:r>
+      <w:r>
+        <w:rPr>
+          <w:rFonts w:cs="DejaVu Sans Condensed" w:ascii="DejaVu Sans Condensed" w:hAnsi="DejaVu Sans Condensed"/>
           <w:i/>
           <w:iCs/>
           <w:sz w:val="18"/>
@@ -2657,6 +2651,16 @@
           <w:rFonts w:cs="DejaVu Sans Condensed" w:ascii="DejaVu Sans Condensed" w:hAnsi="DejaVu Sans Condensed"/>
           <w:i/>
           <w:iCs/>
+          <w:sz w:val="16"/>
+          <w:szCs w:val="16"/>
+        </w:rPr>
+        <w:t>{_HOTEL_EGSSE_0002}</w:t>
+      </w:r>
+      <w:r>
+        <w:rPr>
+          <w:rFonts w:cs="DejaVu Sans Condensed" w:ascii="DejaVu Sans Condensed" w:hAnsi="DejaVu Sans Condensed"/>
+          <w:i/>
+          <w:iCs/>
           <w:sz w:val="18"/>
           <w:szCs w:val="18"/>
         </w:rPr>
@@ -2852,7 +2856,23 @@
           <w:sz w:val="18"/>
           <w:szCs w:val="18"/>
         </w:rPr>
-        <w:t xml:space="preserve"> {_HOTEL_0003}{_GENIKOI_OROI_0025}</w:t>
+        <w:t xml:space="preserve"> {_HOTEL_0003}</w:t>
+      </w:r>
+      <w:r>
+        <w:rPr>
+          <w:rFonts w:cs="DejaVu Sans Condensed" w:ascii="DejaVu Sans Condensed" w:hAnsi="DejaVu Sans Condensed"/>
+          <w:sz w:val="18"/>
+          <w:szCs w:val="18"/>
+        </w:rPr>
+        <w:t>{_HOTEL_EGSSE_0003}</w:t>
+      </w:r>
+      <w:r>
+        <w:rPr>
+          <w:rFonts w:cs="DejaVu Sans Condensed" w:ascii="DejaVu Sans Condensed" w:hAnsi="DejaVu Sans Condensed"/>
+          <w:sz w:val="18"/>
+          <w:szCs w:val="18"/>
+        </w:rPr>
+        <w:t>{_GENIKOI_OROI_0025}</w:t>
       </w:r>
     </w:p>
     <w:p>
@@ -3476,7 +3496,37 @@
           <w:sz w:val="16"/>
           <w:szCs w:val="16"/>
         </w:rPr>
-        <w:t>{_HOTEL_0005}{_HOTEL_0006}</w:t>
+        <w:t>{_HOTEL_0005}</w:t>
+      </w:r>
+      <w:r>
+        <w:rPr>
+          <w:rFonts w:cs="DejaVu Sans Condensed" w:ascii="DejaVu Sans Condensed" w:hAnsi="DejaVu Sans Condensed"/>
+          <w:i/>
+          <w:iCs/>
+          <w:sz w:val="16"/>
+          <w:szCs w:val="16"/>
+        </w:rPr>
+        <w:t>{_HOTEL_EGSSE_0005}</w:t>
+      </w:r>
+      <w:r>
+        <w:rPr>
+          <w:rFonts w:cs="DejaVu Sans Condensed" w:ascii="DejaVu Sans Condensed" w:hAnsi="DejaVu Sans Condensed"/>
+          <w:i/>
+          <w:iCs/>
+          <w:sz w:val="16"/>
+          <w:szCs w:val="16"/>
+        </w:rPr>
+        <w:t>{_HOTEL_0006}</w:t>
+      </w:r>
+      <w:r>
+        <w:rPr>
+          <w:rFonts w:cs="DejaVu Sans Condensed" w:ascii="DejaVu Sans Condensed" w:hAnsi="DejaVu Sans Condensed"/>
+          <w:i/>
+          <w:iCs/>
+          <w:sz w:val="16"/>
+          <w:szCs w:val="16"/>
+        </w:rPr>
+        <w:t>{_HOTEL_EGSSE_0006}</w:t>
       </w:r>
     </w:p>
     <w:p>
@@ -3812,6 +3862,14 @@
           <w:szCs w:val="18"/>
         </w:rPr>
         <w:t>}  διατηρεί ή θα διατηρεί στο μέλλον εγκαταστάσεις. {_HOTEL_0007}</w:t>
+      </w:r>
+      <w:r>
+        <w:rPr>
+          <w:rFonts w:cs="DejaVu Sans Condensed" w:ascii="DejaVu Sans Condensed" w:hAnsi="DejaVu Sans Condensed"/>
+          <w:sz w:val="18"/>
+          <w:szCs w:val="18"/>
+        </w:rPr>
+        <w:t>{_HOTEL_EGSSE_0007}</w:t>
       </w:r>
     </w:p>
     <w:p>
@@ -3843,6 +3901,22 @@
         </w:rPr>
         <w:t>{_HOTEL_0004_TABLE}</w:t>
       </w:r>
+      <w:r>
+        <w:rPr>
+          <w:rStyle w:val="Style16"/>
+          <w:rFonts w:ascii="DejaVu Sans Mono" w:hAnsi="DejaVu Sans Mono"/>
+          <w:b w:val="false"/>
+          <w:i w:val="false"/>
+          <w:caps w:val="false"/>
+          <w:smallCaps w:val="false"/>
+          <w:color w:val="1F2328"/>
+          <w:spacing w:val="0"/>
+          <w:sz w:val="16"/>
+          <w:szCs w:val="16"/>
+          <w:u w:val="none"/>
+        </w:rPr>
+        <w:t>{_HOTEL_EGSSE_0004}</w:t>
+      </w:r>
     </w:p>
     <w:p>
       <w:pPr>
@@ -6406,7 +6480,23 @@
           <w:sz w:val="18"/>
           <w:szCs w:val="18"/>
         </w:rPr>
-        <w:t>ιδίως με καταγγελία της, από κάθε συμβαλλόμενο μέρος, διεπόμενη από τις εκάστοτε ισχύουσες διατάξεις της εργατικής νομοθεσίας, {_HOTEL_0081} {</w:t>
+        <w:t xml:space="preserve">ιδίως με καταγγελία της, από κάθε συμβαλλόμενο μέρος, διεπόμενη από τις εκάστοτε ισχύουσες διατάξεις της εργατικής νομοθεσίας, {_HOTEL_0081} </w:t>
+      </w:r>
+      <w:r>
+        <w:rPr>
+          <w:rFonts w:cs="DejaVu Sans Condensed" w:ascii="DejaVu Sans Condensed" w:hAnsi="DejaVu Sans Condensed"/>
+          <w:sz w:val="18"/>
+          <w:szCs w:val="18"/>
+        </w:rPr>
+        <w:t>{_HOTEL_EGSSE_0081}</w:t>
+      </w:r>
+      <w:r>
+        <w:rPr>
+          <w:rFonts w:cs="DejaVu Sans Condensed" w:ascii="DejaVu Sans Condensed" w:hAnsi="DejaVu Sans Condensed"/>
+          <w:sz w:val="18"/>
+          <w:szCs w:val="18"/>
+        </w:rPr>
+        <w:t>{</w:t>
       </w:r>
       <w:r>
         <w:rPr>
@@ -6418,6 +6508,32 @@
           <w:u w:val="single"/>
         </w:rPr>
         <w:t>_HOTEL_0082</w:t>
+      </w:r>
+      <w:r>
+        <w:rPr>
+          <w:rFonts w:cs="DejaVu Sans Condensed" w:ascii="DejaVu Sans Condensed" w:hAnsi="DejaVu Sans Condensed"/>
+          <w:sz w:val="18"/>
+          <w:szCs w:val="18"/>
+        </w:rPr>
+        <w:t>}</w:t>
+      </w:r>
+      <w:r>
+        <w:rPr>
+          <w:rFonts w:cs="DejaVu Sans Condensed" w:ascii="DejaVu Sans Condensed" w:hAnsi="DejaVu Sans Condensed"/>
+          <w:sz w:val="18"/>
+          <w:szCs w:val="18"/>
+        </w:rPr>
+        <w:t>{</w:t>
+      </w:r>
+      <w:r>
+        <w:rPr>
+          <w:rFonts w:cs="DejaVu Sans Condensed" w:ascii="DejaVu Sans Condensed" w:hAnsi="DejaVu Sans Condensed"/>
+          <w:i/>
+          <w:iCs/>
+          <w:sz w:val="18"/>
+          <w:szCs w:val="18"/>
+        </w:rPr>
+        <w:t>_HOTEL_EGSSE_0082</w:t>
       </w:r>
       <w:r>
         <w:rPr>
@@ -10774,17 +10890,53 @@
           <w:sz w:val="18"/>
           <w:szCs w:val="18"/>
         </w:rPr>
-        <w:t xml:space="preserve">{_HOTEL_1021} </w:t>
-      </w:r>
-      <w:r>
-        <w:rPr>
-          <w:rFonts w:cs="DejaVu Sans Condensed" w:ascii="DejaVu Sans Condensed" w:hAnsi="DejaVu Sans Condensed"/>
-          <w:b/>
-          <w:bCs/>
-          <w:sz w:val="18"/>
-          <w:szCs w:val="18"/>
-        </w:rPr>
-        <w:t xml:space="preserve">{_HOTEL_1022} </w:t>
+        <w:t>{_HOTEL_1021}</w:t>
+      </w:r>
+      <w:r>
+        <w:rPr>
+          <w:rFonts w:cs="DejaVu Sans Condensed" w:ascii="DejaVu Sans Condensed" w:hAnsi="DejaVu Sans Condensed"/>
+          <w:sz w:val="18"/>
+          <w:szCs w:val="18"/>
+        </w:rPr>
+        <w:t>{_HOTEL_EGSSE_1021}</w:t>
+      </w:r>
+      <w:r>
+        <w:rPr>
+          <w:rFonts w:cs="DejaVu Sans Condensed" w:ascii="DejaVu Sans Condensed" w:hAnsi="DejaVu Sans Condensed"/>
+          <w:sz w:val="18"/>
+          <w:szCs w:val="18"/>
+        </w:rPr>
+        <w:t xml:space="preserve"> </w:t>
+      </w:r>
+      <w:r>
+        <w:rPr>
+          <w:rFonts w:cs="DejaVu Sans Condensed" w:ascii="DejaVu Sans Condensed" w:hAnsi="DejaVu Sans Condensed"/>
+          <w:b/>
+          <w:bCs/>
+          <w:sz w:val="18"/>
+          <w:szCs w:val="18"/>
+        </w:rPr>
+        <w:t>{_HOTEL_1022}</w:t>
+      </w:r>
+      <w:r>
+        <w:rPr>
+          <w:rFonts w:cs="DejaVu Sans Condensed" w:ascii="DejaVu Sans Condensed" w:hAnsi="DejaVu Sans Condensed"/>
+          <w:b/>
+          <w:bCs/>
+          <w:sz w:val="18"/>
+          <w:szCs w:val="18"/>
+        </w:rPr>
+        <w:t>{_HOTEL_EGSSE_1022}</w:t>
+      </w:r>
+      <w:r>
+        <w:rPr>
+          <w:rFonts w:cs="DejaVu Sans Condensed" w:ascii="DejaVu Sans Condensed" w:hAnsi="DejaVu Sans Condensed"/>
+          <w:b/>
+          <w:bCs/>
+          <w:sz w:val="18"/>
+          <w:szCs w:val="18"/>
+        </w:rPr>
+        <w:t xml:space="preserve"> </w:t>
       </w:r>
       <w:r>
         <w:rPr>
@@ -10890,7 +11042,23 @@
           <w:sz w:val="18"/>
           <w:szCs w:val="18"/>
         </w:rPr>
-        <w:t>{_HOTEL_1100}{_GENIKOI_OROI_1100}</w:t>
+        <w:t>{_HOTEL_1100}</w:t>
+      </w:r>
+      <w:r>
+        <w:rPr>
+          <w:rFonts w:cs="DejaVu Sans Condensed" w:ascii="DejaVu Sans Condensed" w:hAnsi="DejaVu Sans Condensed"/>
+          <w:sz w:val="18"/>
+          <w:szCs w:val="18"/>
+        </w:rPr>
+        <w:t>{_HOTEL_EGSSE_1100}</w:t>
+      </w:r>
+      <w:r>
+        <w:rPr>
+          <w:rFonts w:cs="DejaVu Sans Condensed" w:ascii="DejaVu Sans Condensed" w:hAnsi="DejaVu Sans Condensed"/>
+          <w:sz w:val="18"/>
+          <w:szCs w:val="18"/>
+        </w:rPr>
+        <w:t>{_GENIKOI_OROI_1100}</w:t>
       </w:r>
     </w:p>
     <w:p>

</xml_diff>

<commit_message>
🚀 Deploy prod build - 1.0.100 (Phase 1)
</commit_message>
<xml_diff>
--- a/public/templates/ΑΡΧΙΚΗ ΣΥΜΒΑΣΗ ΕΡΓΑΖΟΜΕΝΩΝ.docx
+++ b/public/templates/ΑΡΧΙΚΗ ΣΥΜΒΑΣΗ ΕΡΓΑΖΟΜΕΝΩΝ.docx
@@ -2276,17 +2276,7 @@
           <w:sz w:val="18"/>
           <w:szCs w:val="18"/>
         </w:rPr>
-        <w:t>{_</w:t>
-      </w:r>
-      <w:r>
-        <w:rPr>
-          <w:rFonts w:cs="DejaVu Sans Condensed" w:ascii="DejaVu Sans Condensed" w:hAnsi="DejaVu Sans Condensed"/>
-          <w:i w:val="false"/>
-          <w:iCs w:val="false"/>
-          <w:sz w:val="18"/>
-          <w:szCs w:val="18"/>
-        </w:rPr>
-        <w:t>FIELD</w:t>
+        <w:t>{_FIELD</w:t>
       </w:r>
       <w:r>
         <w:rPr>
@@ -2634,27 +2624,7 @@
           <w:sz w:val="16"/>
           <w:szCs w:val="16"/>
         </w:rPr>
-        <w:t>{_</w:t>
-      </w:r>
-      <w:r>
-        <w:rPr>
-          <w:rFonts w:cs="DejaVu Sans Condensed" w:ascii="DejaVu Sans Condensed" w:hAnsi="DejaVu Sans Condensed"/>
-          <w:i/>
-          <w:iCs/>
-          <w:sz w:val="16"/>
-          <w:szCs w:val="16"/>
-        </w:rPr>
-        <w:t>FIELD</w:t>
-      </w:r>
-      <w:r>
-        <w:rPr>
-          <w:rFonts w:cs="DejaVu Sans Condensed" w:ascii="DejaVu Sans Condensed" w:hAnsi="DejaVu Sans Condensed"/>
-          <w:i/>
-          <w:iCs/>
-          <w:sz w:val="16"/>
-          <w:szCs w:val="16"/>
-        </w:rPr>
-        <w:t>_0002}</w:t>
+        <w:t>{_FIELD_0002}</w:t>
       </w:r>
       <w:r>
         <w:rPr>
@@ -2856,23 +2826,7 @@
           <w:sz w:val="18"/>
           <w:szCs w:val="18"/>
         </w:rPr>
-        <w:t xml:space="preserve"> {_</w:t>
-      </w:r>
-      <w:r>
-        <w:rPr>
-          <w:rFonts w:cs="DejaVu Sans Condensed" w:ascii="DejaVu Sans Condensed" w:hAnsi="DejaVu Sans Condensed"/>
-          <w:sz w:val="18"/>
-          <w:szCs w:val="18"/>
-        </w:rPr>
-        <w:t>FIELD</w:t>
-      </w:r>
-      <w:r>
-        <w:rPr>
-          <w:rFonts w:cs="DejaVu Sans Condensed" w:ascii="DejaVu Sans Condensed" w:hAnsi="DejaVu Sans Condensed"/>
-          <w:sz w:val="18"/>
-          <w:szCs w:val="18"/>
-        </w:rPr>
-        <w:t>_0003}</w:t>
+        <w:t xml:space="preserve"> {_FIELD_0003}</w:t>
       </w:r>
     </w:p>
     <w:p>
@@ -3496,27 +3450,7 @@
           <w:sz w:val="16"/>
           <w:szCs w:val="16"/>
         </w:rPr>
-        <w:t>{_</w:t>
-      </w:r>
-      <w:r>
-        <w:rPr>
-          <w:rFonts w:cs="DejaVu Sans Condensed" w:ascii="DejaVu Sans Condensed" w:hAnsi="DejaVu Sans Condensed"/>
-          <w:i/>
-          <w:iCs/>
-          <w:sz w:val="16"/>
-          <w:szCs w:val="16"/>
-        </w:rPr>
-        <w:t>FIELD</w:t>
-      </w:r>
-      <w:r>
-        <w:rPr>
-          <w:rFonts w:cs="DejaVu Sans Condensed" w:ascii="DejaVu Sans Condensed" w:hAnsi="DejaVu Sans Condensed"/>
-          <w:i/>
-          <w:iCs/>
-          <w:sz w:val="16"/>
-          <w:szCs w:val="16"/>
-        </w:rPr>
-        <w:t>_0005}{_FIELD_0006}</w:t>
+        <w:t>{_FIELD_0005}{_FIELD_0006}</w:t>
       </w:r>
     </w:p>
     <w:p>
@@ -3851,23 +3785,7 @@
           <w:sz w:val="18"/>
           <w:szCs w:val="18"/>
         </w:rPr>
-        <w:t>}  διατηρεί ή θα διατηρεί στο μέλλον εγκαταστάσεις. {_</w:t>
-      </w:r>
-      <w:r>
-        <w:rPr>
-          <w:rFonts w:cs="DejaVu Sans Condensed" w:ascii="DejaVu Sans Condensed" w:hAnsi="DejaVu Sans Condensed"/>
-          <w:sz w:val="18"/>
-          <w:szCs w:val="18"/>
-        </w:rPr>
-        <w:t>FIELD</w:t>
-      </w:r>
-      <w:r>
-        <w:rPr>
-          <w:rFonts w:cs="DejaVu Sans Condensed" w:ascii="DejaVu Sans Condensed" w:hAnsi="DejaVu Sans Condensed"/>
-          <w:sz w:val="18"/>
-          <w:szCs w:val="18"/>
-        </w:rPr>
-        <w:t>_0007}</w:t>
+        <w:t>}  διατηρεί ή θα διατηρεί στο μέλλον εγκαταστάσεις. {_FIELD_0007}</w:t>
       </w:r>
     </w:p>
     <w:p>
@@ -3897,39 +3815,7 @@
           <w:szCs w:val="16"/>
           <w:u w:val="none"/>
         </w:rPr>
-        <w:t>{_</w:t>
-      </w:r>
-      <w:r>
-        <w:rPr>
-          <w:rStyle w:val="Style16"/>
-          <w:rFonts w:ascii="DejaVu Sans Mono" w:hAnsi="DejaVu Sans Mono"/>
-          <w:b w:val="false"/>
-          <w:i w:val="false"/>
-          <w:caps w:val="false"/>
-          <w:smallCaps w:val="false"/>
-          <w:color w:val="1F2328"/>
-          <w:spacing w:val="0"/>
-          <w:sz w:val="16"/>
-          <w:szCs w:val="16"/>
-          <w:u w:val="none"/>
-        </w:rPr>
-        <w:t>FIELD</w:t>
-      </w:r>
-      <w:r>
-        <w:rPr>
-          <w:rStyle w:val="Style16"/>
-          <w:rFonts w:ascii="DejaVu Sans Mono" w:hAnsi="DejaVu Sans Mono"/>
-          <w:b w:val="false"/>
-          <w:i w:val="false"/>
-          <w:caps w:val="false"/>
-          <w:smallCaps w:val="false"/>
-          <w:color w:val="1F2328"/>
-          <w:spacing w:val="0"/>
-          <w:sz w:val="16"/>
-          <w:szCs w:val="16"/>
-          <w:u w:val="none"/>
-        </w:rPr>
-        <w:t>_0004_TABLE}</w:t>
+        <w:t>{_FIELD_0004_TABLE}</w:t>
       </w:r>
     </w:p>
     <w:p>
@@ -4128,7 +4014,34 @@
           <w:sz w:val="18"/>
           <w:szCs w:val="18"/>
         </w:rPr>
-        <w:t>} και χωρίς η μετάθεση αυτή να θεωρείται ως βλαπτική μεταβολή των όρων εργασίας τ{_GENIKH_A}.</w:t>
+        <w:t xml:space="preserve">} και χωρίς η μετάθεση αυτή να θεωρείται ως βλαπτική μεταβολή των όρων εργασίας τ{_GENIKH_A} </w:t>
+      </w:r>
+      <w:r>
+        <w:rPr>
+          <w:rFonts w:cs="DejaVu Sans Condensed" w:ascii="DejaVu Sans Condensed" w:hAnsi="DejaVu Sans Condensed"/>
+          <w:sz w:val="18"/>
+          <w:szCs w:val="18"/>
+        </w:rPr>
+        <w:t>με την σ</w:t>
+      </w:r>
+      <w:r>
+        <w:rPr>
+          <w:rFonts w:eastAsia="Calibri" w:cs="DejaVu Sans Condensed" w:ascii="DejaVu Sans Condensed" w:hAnsi="DejaVu Sans Condensed" w:eastAsiaTheme="minorHAnsi"/>
+          <w:color w:val="auto"/>
+          <w:kern w:val="0"/>
+          <w:sz w:val="18"/>
+          <w:szCs w:val="18"/>
+          <w:lang w:val="el-GR" w:eastAsia="en-US" w:bidi="ar-SA"/>
+        </w:rPr>
+        <w:t>ύμφωνη γνώμη τ{_GENIKH_A} εργαζόμεν{_GENIKH_A}</w:t>
+      </w:r>
+      <w:r>
+        <w:rPr>
+          <w:rFonts w:cs="DejaVu Sans Condensed" w:ascii="DejaVu Sans Condensed" w:hAnsi="DejaVu Sans Condensed"/>
+          <w:sz w:val="18"/>
+          <w:szCs w:val="18"/>
+        </w:rPr>
+        <w:t>.</w:t>
       </w:r>
     </w:p>
     <w:p>
@@ -5402,25 +5315,7 @@
           <w:sz w:val="18"/>
           <w:szCs w:val="18"/>
         </w:rPr>
-        <w:t xml:space="preserve">Επιμίσθιο ορίζεται η  διαφορά μεταξύ νομίμων και καταβαλλομένων αποδοχών σε περίπτωση που οι συμφωνημένες και καταβαλλόμενες αποδοχές (6.1) </w:t>
-      </w:r>
-      <w:r>
-        <w:rPr>
-          <w:rFonts w:cs="DejaVu Sans Condensed" w:ascii="DejaVu Sans Condensed" w:hAnsi="DejaVu Sans Condensed"/>
-          <w:i w:val="false"/>
-          <w:iCs w:val="false"/>
-          <w:sz w:val="18"/>
-          <w:szCs w:val="18"/>
-        </w:rPr>
-        <w:t>είναι υπέρτερες (ανώτερες) των νομίμων.</w:t>
-      </w:r>
-      <w:r>
-        <w:rPr>
-          <w:rFonts w:cs="DejaVu Sans Condensed" w:ascii="DejaVu Sans Condensed" w:hAnsi="DejaVu Sans Condensed"/>
-          <w:sz w:val="18"/>
-          <w:szCs w:val="18"/>
-        </w:rPr>
-        <w:t xml:space="preserve"> </w:t>
+        <w:t>{_FIELD_0061}{_FIELD_0062}</w:t>
       </w:r>
     </w:p>
     <w:p>
@@ -5437,10 +5332,21 @@
       <w:r>
         <w:rPr>
           <w:rFonts w:cs="DejaVu Sans Condensed" w:ascii="DejaVu Sans Condensed" w:hAnsi="DejaVu Sans Condensed"/>
-          <w:sz w:val="18"/>
-          <w:szCs w:val="18"/>
-        </w:rPr>
-        <w:t>Συμφωνείται ότι θα καταλογίζονται (συμψηφίζονται) όλα τα επιδόματα που τυχόν δικαιούται {_ONOMASTIKH_A}  {_</w:t>
+          <w:b/>
+          <w:bCs/>
+          <w:sz w:val="18"/>
+          <w:szCs w:val="18"/>
+        </w:rPr>
+        <w:t>6.3.</w:t>
+      </w:r>
+      <w:r>
+        <w:rPr>
+          <w:rFonts w:cs="DejaVu Sans Condensed" w:ascii="DejaVu Sans Condensed" w:hAnsi="DejaVu Sans Condensed"/>
+          <w:sz w:val="18"/>
+          <w:szCs w:val="18"/>
+        </w:rPr>
+        <w:tab/>
+        <w:t>Οι μικτές αποδοχές τ{_GENIKH_A} {_</w:t>
       </w:r>
       <w:r>
         <w:rPr>
@@ -5474,41 +5380,24 @@
           <w:sz w:val="18"/>
           <w:szCs w:val="18"/>
         </w:rPr>
-        <w:t>} (ενδεικτικά τα επιδόματα γάμου και τριετιών), καθώς και τα ποσά επιδομάτων που ενδέχεται να θεσπιστούν μελλοντικώς ή τα ποσά επιδομάτων, που {_ONOMASTIKH_A}  {_</w:t>
-      </w:r>
-      <w:r>
-        <w:rPr>
-          <w:rFonts w:cs="DejaVu Sans Condensed" w:ascii="DejaVu Sans Condensed" w:hAnsi="DejaVu Sans Condensed"/>
-          <w:sz w:val="18"/>
-          <w:szCs w:val="18"/>
-          <w:lang w:val="en-US"/>
-        </w:rPr>
-        <w:t>TYPOS</w:t>
-      </w:r>
-      <w:r>
-        <w:rPr>
-          <w:rFonts w:cs="DejaVu Sans Condensed" w:ascii="DejaVu Sans Condensed" w:hAnsi="DejaVu Sans Condensed"/>
-          <w:sz w:val="18"/>
-          <w:szCs w:val="18"/>
-        </w:rPr>
-        <w:t>_</w:t>
-      </w:r>
-      <w:r>
-        <w:rPr>
-          <w:rFonts w:cs="DejaVu Sans Condensed" w:ascii="DejaVu Sans Condensed" w:hAnsi="DejaVu Sans Condensed"/>
-          <w:sz w:val="18"/>
-          <w:szCs w:val="18"/>
-          <w:lang w:val="en-US"/>
-        </w:rPr>
-        <w:t>ERG</w:t>
-      </w:r>
-      <w:r>
-        <w:rPr>
-          <w:rFonts w:cs="DejaVu Sans Condensed" w:ascii="DejaVu Sans Condensed" w:hAnsi="DejaVu Sans Condensed"/>
-          <w:sz w:val="18"/>
-          <w:szCs w:val="18"/>
-        </w:rPr>
-        <w:t>}, τυχόν θα δικαιούται στο μέλλον (συμπεριλαμβανομένων ενδεικτικά των επιδομάτων γάμου και τέκνων), που προβλέπονται ή θα προβλεφθούν από υποχρεωτικές διατάξεις ΣΣΕ, Δ.Α., διατάξεις νόμων, υπουργικών αποφάσεων κλπ.</w:t>
+        <w:t>_</w:t>
+      </w:r>
+      <w:r>
+        <w:rPr>
+          <w:rFonts w:cs="DejaVu Sans Condensed" w:ascii="DejaVu Sans Condensed" w:hAnsi="DejaVu Sans Condensed"/>
+          <w:sz w:val="18"/>
+          <w:szCs w:val="18"/>
+          <w:lang w:val="en-US"/>
+        </w:rPr>
+        <w:t>GENIKH</w:t>
+      </w:r>
+      <w:r>
+        <w:rPr>
+          <w:rFonts w:cs="DejaVu Sans Condensed" w:ascii="DejaVu Sans Condensed" w:hAnsi="DejaVu Sans Condensed"/>
+          <w:sz w:val="18"/>
+          <w:szCs w:val="18"/>
+        </w:rPr>
+        <w:t>} (υπό 6.1) θα υπόκεινται στις εκάστοτε ισχύουσες νόμιμες κρατήσεις.</w:t>
       </w:r>
     </w:p>
     <w:p>
@@ -5530,67 +5419,17 @@
           <w:sz w:val="18"/>
           <w:szCs w:val="18"/>
         </w:rPr>
-        <w:t>6.3.</w:t>
-      </w:r>
-      <w:r>
-        <w:rPr>
-          <w:rFonts w:cs="DejaVu Sans Condensed" w:ascii="DejaVu Sans Condensed" w:hAnsi="DejaVu Sans Condensed"/>
-          <w:sz w:val="18"/>
-          <w:szCs w:val="18"/>
-        </w:rPr>
+        <w:t>6.4.</w:t>
+      </w:r>
+      <w:r>
+        <w:rPr>
+          <w:rFonts w:cs="DejaVu Sans Condensed" w:ascii="DejaVu Sans Condensed" w:hAnsi="DejaVu Sans Condensed"/>
+          <w:sz w:val="18"/>
+          <w:szCs w:val="18"/>
+        </w:rPr>
+        <w:t xml:space="preserve"> </w:t>
         <w:tab/>
-        <w:t>Οι μικτές αποδοχές τ{_GENIKH_A} {_</w:t>
-      </w:r>
-      <w:r>
-        <w:rPr>
-          <w:rFonts w:cs="DejaVu Sans Condensed" w:ascii="DejaVu Sans Condensed" w:hAnsi="DejaVu Sans Condensed"/>
-          <w:sz w:val="18"/>
-          <w:szCs w:val="18"/>
-          <w:lang w:val="en-US"/>
-        </w:rPr>
-        <w:t>TYPOS</w:t>
-      </w:r>
-      <w:r>
-        <w:rPr>
-          <w:rFonts w:cs="DejaVu Sans Condensed" w:ascii="DejaVu Sans Condensed" w:hAnsi="DejaVu Sans Condensed"/>
-          <w:sz w:val="18"/>
-          <w:szCs w:val="18"/>
-        </w:rPr>
-        <w:t>_</w:t>
-      </w:r>
-      <w:r>
-        <w:rPr>
-          <w:rFonts w:cs="DejaVu Sans Condensed" w:ascii="DejaVu Sans Condensed" w:hAnsi="DejaVu Sans Condensed"/>
-          <w:sz w:val="18"/>
-          <w:szCs w:val="18"/>
-          <w:lang w:val="en-US"/>
-        </w:rPr>
-        <w:t>ERG</w:t>
-      </w:r>
-      <w:r>
-        <w:rPr>
-          <w:rFonts w:cs="DejaVu Sans Condensed" w:ascii="DejaVu Sans Condensed" w:hAnsi="DejaVu Sans Condensed"/>
-          <w:sz w:val="18"/>
-          <w:szCs w:val="18"/>
-        </w:rPr>
-        <w:t>_</w:t>
-      </w:r>
-      <w:r>
-        <w:rPr>
-          <w:rFonts w:cs="DejaVu Sans Condensed" w:ascii="DejaVu Sans Condensed" w:hAnsi="DejaVu Sans Condensed"/>
-          <w:sz w:val="18"/>
-          <w:szCs w:val="18"/>
-          <w:lang w:val="en-US"/>
-        </w:rPr>
-        <w:t>GENIKH</w:t>
-      </w:r>
-      <w:r>
-        <w:rPr>
-          <w:rFonts w:cs="DejaVu Sans Condensed" w:ascii="DejaVu Sans Condensed" w:hAnsi="DejaVu Sans Condensed"/>
-          <w:sz w:val="18"/>
-          <w:szCs w:val="18"/>
-        </w:rPr>
-        <w:t>} (υπό 6.1) θα υπόκεινται στις εκάστοτε ισχύουσες νόμιμες κρατήσεις.</w:t>
+        <w:t>Οι προσαυξήσεις για εργασία κατά τις Κυριακές, τις εξαιρέσιμες αργίες και κατά τη νύχτα καθορίζονται από το Β.Δ.748/1966, το Ν.3755/1977, το Ν.Δ.147/1973, ΠΔ 80/2022 άρθρο 209 και την υπ’ αριθ. 25825/1951 απόφαση των Υπουργείων Οικονομικών και Εργασίας και την σε ισχύ κλαδική εθνική ή/και τοπική ΣΣΕ.</w:t>
       </w:r>
     </w:p>
     <w:p>
@@ -5612,7 +5451,7 @@
           <w:sz w:val="18"/>
           <w:szCs w:val="18"/>
         </w:rPr>
-        <w:t>6.4.</w:t>
+        <w:t>6.5.</w:t>
       </w:r>
       <w:r>
         <w:rPr>
@@ -5622,7 +5461,25 @@
         </w:rPr>
         <w:t xml:space="preserve"> </w:t>
         <w:tab/>
-        <w:t>Οι προσαυξήσεις για εργασία κατά τις Κυριακές, τις εξαιρέσιμες αργίες και κατά τη νύχτα καθορίζονται από το Β.Δ.748/1966, το Ν.3755/1977, το Ν.Δ.147/1973, ΠΔ 80/2022 άρθρο 209 και την υπ’ αριθ. 25825/1951 απόφαση των Υπουργείων Οικονομικών και Εργασίας και την σε ισχύ κλαδική εθνική ή/και τοπική ΣΣΕ.</w:t>
+        <w:t xml:space="preserve">Η υπερεργασιακή απασχόληση λαμβάνει χώρα ανάλογα με τις ανάγκες της επιχείρησης και αμείβεται κατά τα οριζόμενα στο άρθρο 74, του Ν.3863/2010, </w:t>
+      </w:r>
+      <w:bookmarkStart w:id="4" w:name="_Hlk161042483"/>
+      <w:r>
+        <w:rPr>
+          <w:rFonts w:cs="DejaVu Sans Condensed" w:ascii="DejaVu Sans Condensed" w:hAnsi="DejaVu Sans Condensed"/>
+          <w:sz w:val="18"/>
+          <w:szCs w:val="18"/>
+        </w:rPr>
+        <w:t xml:space="preserve">άρθρο 184 ΠΔ 80/2022 </w:t>
+      </w:r>
+      <w:bookmarkEnd w:id="4"/>
+      <w:r>
+        <w:rPr>
+          <w:rFonts w:cs="DejaVu Sans Condensed" w:ascii="DejaVu Sans Condensed" w:hAnsi="DejaVu Sans Condensed"/>
+          <w:sz w:val="18"/>
+          <w:szCs w:val="18"/>
+        </w:rPr>
+        <w:t>και δύναται να γίνει καταλογισμός (συμψηφισμός) με το επιμίσθιο της 6.2.</w:t>
       </w:r>
     </w:p>
     <w:p>
@@ -5644,7 +5501,7 @@
           <w:sz w:val="18"/>
           <w:szCs w:val="18"/>
         </w:rPr>
-        <w:t>6.5.</w:t>
+        <w:t>6.6.</w:t>
       </w:r>
       <w:r>
         <w:rPr>
@@ -5654,25 +5511,7 @@
         </w:rPr>
         <w:t xml:space="preserve"> </w:t>
         <w:tab/>
-        <w:t xml:space="preserve">Η υπερεργασιακή απασχόληση λαμβάνει χώρα ανάλογα με τις ανάγκες της επιχείρησης και αμείβεται κατά τα οριζόμενα στο άρθρο 74, του Ν.3863/2010, </w:t>
-      </w:r>
-      <w:bookmarkStart w:id="4" w:name="_Hlk161042483"/>
-      <w:r>
-        <w:rPr>
-          <w:rFonts w:cs="DejaVu Sans Condensed" w:ascii="DejaVu Sans Condensed" w:hAnsi="DejaVu Sans Condensed"/>
-          <w:sz w:val="18"/>
-          <w:szCs w:val="18"/>
-        </w:rPr>
-        <w:t xml:space="preserve">άρθρο 184 ΠΔ 80/2022 </w:t>
-      </w:r>
-      <w:bookmarkEnd w:id="4"/>
-      <w:r>
-        <w:rPr>
-          <w:rFonts w:cs="DejaVu Sans Condensed" w:ascii="DejaVu Sans Condensed" w:hAnsi="DejaVu Sans Condensed"/>
-          <w:sz w:val="18"/>
-          <w:szCs w:val="18"/>
-        </w:rPr>
-        <w:t>και δύναται να γίνει καταλογισμός (συμψηφισμός) με το επιμίσθιο της 6.2.</w:t>
+        <w:t>Η υπερωριακή απασχόληση λαμβάνει χώρα ανάλογα με τις ανάγκες της επιχείρησης και αμείβεται κατά τα οριζόμενα στο άρθρο 74, του Ν.3863/2010 και άρθρο 184 ΠΔ 80/2022.</w:t>
       </w:r>
     </w:p>
     <w:p>
@@ -5694,7 +5533,7 @@
           <w:sz w:val="18"/>
           <w:szCs w:val="18"/>
         </w:rPr>
-        <w:t>6.6.</w:t>
+        <w:t>6.7.</w:t>
       </w:r>
       <w:r>
         <w:rPr>
@@ -5704,7 +5543,58 @@
         </w:rPr>
         <w:t xml:space="preserve"> </w:t>
         <w:tab/>
-        <w:t>Η υπερωριακή απασχόληση λαμβάνει χώρα ανάλογα με τις ανάγκες της επιχείρησης και αμείβεται κατά τα οριζόμενα στο άρθρο 74, του Ν.3863/2010 και άρθρο 184 ΠΔ 80/2022.</w:t>
+        <w:t>Κάθε εργασία παρεμφερής με την άνω κύρια απασχόληση τ{_GENIKH_A} {_</w:t>
+      </w:r>
+      <w:r>
+        <w:rPr>
+          <w:rFonts w:cs="DejaVu Sans Condensed" w:ascii="DejaVu Sans Condensed" w:hAnsi="DejaVu Sans Condensed"/>
+          <w:sz w:val="18"/>
+          <w:szCs w:val="18"/>
+          <w:lang w:val="en-US"/>
+        </w:rPr>
+        <w:t>TYPOS</w:t>
+      </w:r>
+      <w:r>
+        <w:rPr>
+          <w:rFonts w:cs="DejaVu Sans Condensed" w:ascii="DejaVu Sans Condensed" w:hAnsi="DejaVu Sans Condensed"/>
+          <w:sz w:val="18"/>
+          <w:szCs w:val="18"/>
+        </w:rPr>
+        <w:t>_</w:t>
+      </w:r>
+      <w:r>
+        <w:rPr>
+          <w:rFonts w:cs="DejaVu Sans Condensed" w:ascii="DejaVu Sans Condensed" w:hAnsi="DejaVu Sans Condensed"/>
+          <w:sz w:val="18"/>
+          <w:szCs w:val="18"/>
+          <w:lang w:val="en-US"/>
+        </w:rPr>
+        <w:t>ERG</w:t>
+      </w:r>
+      <w:r>
+        <w:rPr>
+          <w:rFonts w:cs="DejaVu Sans Condensed" w:ascii="DejaVu Sans Condensed" w:hAnsi="DejaVu Sans Condensed"/>
+          <w:sz w:val="18"/>
+          <w:szCs w:val="18"/>
+        </w:rPr>
+        <w:t>_</w:t>
+      </w:r>
+      <w:r>
+        <w:rPr>
+          <w:rFonts w:cs="DejaVu Sans Condensed" w:ascii="DejaVu Sans Condensed" w:hAnsi="DejaVu Sans Condensed"/>
+          <w:sz w:val="18"/>
+          <w:szCs w:val="18"/>
+          <w:lang w:val="en-US"/>
+        </w:rPr>
+        <w:t>GENIKH</w:t>
+      </w:r>
+      <w:r>
+        <w:rPr>
+          <w:rFonts w:cs="DejaVu Sans Condensed" w:ascii="DejaVu Sans Condensed" w:hAnsi="DejaVu Sans Condensed"/>
+          <w:sz w:val="18"/>
+          <w:szCs w:val="18"/>
+        </w:rPr>
+        <w:t>} ή και εν γένει κάθε απασχόλησή τ{_GENIKH_A} σε εργασία εντός του συμφωνηθέντος ωραρίου απασχόλησης τ{_GENIKH_A} που κατατείνει στην ομαλή λειτουργία {_ERGODOTHS_GENIKH} στο πλαίσιο των αναγκών αυτής, όπως αυτή εξειδικεύεται εκάστοτε από τους εντεταλμένους {_ERGODOTHS_GENIKH}, δεν θεωρείται πρόσθετη εργασία και ρητά συμφωνείται ότι δεν θα οφείλεται γι’ αυτήν περαιτέρω αμοιβή για πρόσθετη εργασία, αλλά η αμοιβή τ{_GENIKH_A} για την εργασία αυτή περιλαμβάνεται στον συμφωνηθέντα στην παρούσα μισθό τ{_GENIKH_A} (τακτικές αποδοχές).</w:t>
       </w:r>
     </w:p>
     <w:p>
@@ -5726,17 +5616,16 @@
           <w:sz w:val="18"/>
           <w:szCs w:val="18"/>
         </w:rPr>
-        <w:t>6.7.</w:t>
-      </w:r>
-      <w:r>
-        <w:rPr>
-          <w:rFonts w:cs="DejaVu Sans Condensed" w:ascii="DejaVu Sans Condensed" w:hAnsi="DejaVu Sans Condensed"/>
-          <w:sz w:val="18"/>
-          <w:szCs w:val="18"/>
-        </w:rPr>
-        <w:t xml:space="preserve"> </w:t>
+        <w:t>6.8.</w:t>
+      </w:r>
+      <w:r>
+        <w:rPr>
+          <w:rFonts w:cs="DejaVu Sans Condensed" w:ascii="DejaVu Sans Condensed" w:hAnsi="DejaVu Sans Condensed"/>
+          <w:sz w:val="18"/>
+          <w:szCs w:val="18"/>
+        </w:rPr>
         <w:tab/>
-        <w:t>Κάθε εργασία παρεμφερής με την άνω κύρια απασχόληση τ{_GENIKH_A} {_</w:t>
+        <w:t>Οι μηνιαίες αποδοχές τ{_GENIKH_A} {_</w:t>
       </w:r>
       <w:r>
         <w:rPr>
@@ -5787,7 +5676,45 @@
           <w:sz w:val="18"/>
           <w:szCs w:val="18"/>
         </w:rPr>
-        <w:t>} ή και εν γένει κάθε απασχόλησή τ{_GENIKH_A} σε εργασία εντός του συμφωνηθέντος ωραρίου απασχόλησης τ{_GENIKH_A} που κατατείνει στην ομαλή λειτουργία {_ERGODOTHS_GENIKH} στο πλαίσιο των αναγκών αυτής, όπως αυτή εξειδικεύεται εκάστοτε από τους εντεταλμένους {_ERGODOTHS_GENIKH}, δεν θεωρείται πρόσθετη εργασία και ρητά συμφωνείται ότι δεν θα οφείλεται γι’ αυτήν περαιτέρω αμοιβή για πρόσθετη εργασία, αλλά η αμοιβή τ{_GENIKH_A} για την εργασία αυτή περιλαμβάνεται στον συμφωνηθέντα στην παρούσα μισθό τ{_GENIKH_A} (τακτικές αποδοχές).</w:t>
+        <w:t>} θα καταβάλλονται εντ</w:t>
+      </w:r>
+      <w:r>
+        <w:rPr>
+          <w:rFonts w:eastAsia="Calibri" w:cs="DejaVu Sans Condensed" w:ascii="DejaVu Sans Condensed" w:hAnsi="DejaVu Sans Condensed" w:eastAsiaTheme="minorHAnsi"/>
+          <w:color w:val="auto"/>
+          <w:kern w:val="0"/>
+          <w:sz w:val="18"/>
+          <w:szCs w:val="18"/>
+          <w:lang w:val="el-GR" w:eastAsia="en-US" w:bidi="ar-SA"/>
+        </w:rPr>
+        <w:t>ός {_XRONOS_KATABOLHS_APODOXON}</w:t>
+      </w:r>
+      <w:r>
+        <w:rPr>
+          <w:rFonts w:cs="DejaVu Sans Condensed" w:ascii="DejaVu Sans Condensed" w:hAnsi="DejaVu Sans Condensed"/>
+          <w:sz w:val="18"/>
+          <w:szCs w:val="18"/>
+        </w:rPr>
+        <w:t xml:space="preserve"> απ</w:t>
+      </w:r>
+      <w:r>
+        <w:rPr>
+          <w:rFonts w:eastAsia="Calibri" w:cs="DejaVu Sans Condensed" w:ascii="DejaVu Sans Condensed" w:hAnsi="DejaVu Sans Condensed" w:eastAsiaTheme="minorHAnsi"/>
+          <w:color w:val="auto"/>
+          <w:kern w:val="0"/>
+          <w:sz w:val="18"/>
+          <w:szCs w:val="18"/>
+          <w:lang w:val="el-GR" w:eastAsia="en-US" w:bidi="ar-SA"/>
+        </w:rPr>
+        <w:t xml:space="preserve">ό το πέρας </w:t>
+      </w:r>
+      <w:r>
+        <w:rPr>
+          <w:rFonts w:cs="DejaVu Sans Condensed" w:ascii="DejaVu Sans Condensed" w:hAnsi="DejaVu Sans Condensed"/>
+          <w:sz w:val="18"/>
+          <w:szCs w:val="18"/>
+        </w:rPr>
+        <w:t>εκάστου ημερολογιακού μηνός. Σε περίπτωση που αυτή η ημέρα είναι αργία, οι μηνιαίες αποδοχές θα καταβάλλονται την αμέσως επόμενη εργάσιμη ημέρα.</w:t>
       </w:r>
     </w:p>
     <w:p>
@@ -5804,110 +5731,9 @@
       <w:r>
         <w:rPr>
           <w:rFonts w:cs="DejaVu Sans Condensed" w:ascii="DejaVu Sans Condensed" w:hAnsi="DejaVu Sans Condensed"/>
-          <w:b/>
-          <w:bCs/>
-          <w:sz w:val="18"/>
-          <w:szCs w:val="18"/>
-        </w:rPr>
-        <w:t>6.8.</w:t>
-      </w:r>
-      <w:r>
-        <w:rPr>
-          <w:rFonts w:cs="DejaVu Sans Condensed" w:ascii="DejaVu Sans Condensed" w:hAnsi="DejaVu Sans Condensed"/>
-          <w:sz w:val="18"/>
-          <w:szCs w:val="18"/>
-        </w:rPr>
-        <w:tab/>
-        <w:t>Οι μηνιαίες αποδοχές τ{_GENIKH_A} {_</w:t>
-      </w:r>
-      <w:r>
-        <w:rPr>
-          <w:rFonts w:cs="DejaVu Sans Condensed" w:ascii="DejaVu Sans Condensed" w:hAnsi="DejaVu Sans Condensed"/>
-          <w:sz w:val="18"/>
-          <w:szCs w:val="18"/>
-          <w:lang w:val="en-US"/>
-        </w:rPr>
-        <w:t>TYPOS</w:t>
-      </w:r>
-      <w:r>
-        <w:rPr>
-          <w:rFonts w:cs="DejaVu Sans Condensed" w:ascii="DejaVu Sans Condensed" w:hAnsi="DejaVu Sans Condensed"/>
-          <w:sz w:val="18"/>
-          <w:szCs w:val="18"/>
-        </w:rPr>
-        <w:t>_</w:t>
-      </w:r>
-      <w:r>
-        <w:rPr>
-          <w:rFonts w:cs="DejaVu Sans Condensed" w:ascii="DejaVu Sans Condensed" w:hAnsi="DejaVu Sans Condensed"/>
-          <w:sz w:val="18"/>
-          <w:szCs w:val="18"/>
-          <w:lang w:val="en-US"/>
-        </w:rPr>
-        <w:t>ERG</w:t>
-      </w:r>
-      <w:r>
-        <w:rPr>
-          <w:rFonts w:cs="DejaVu Sans Condensed" w:ascii="DejaVu Sans Condensed" w:hAnsi="DejaVu Sans Condensed"/>
-          <w:sz w:val="18"/>
-          <w:szCs w:val="18"/>
-        </w:rPr>
-        <w:t>_</w:t>
-      </w:r>
-      <w:r>
-        <w:rPr>
-          <w:rFonts w:cs="DejaVu Sans Condensed" w:ascii="DejaVu Sans Condensed" w:hAnsi="DejaVu Sans Condensed"/>
-          <w:sz w:val="18"/>
-          <w:szCs w:val="18"/>
-          <w:lang w:val="en-US"/>
-        </w:rPr>
-        <w:t>GENIKH</w:t>
-      </w:r>
-      <w:r>
-        <w:rPr>
-          <w:rFonts w:cs="DejaVu Sans Condensed" w:ascii="DejaVu Sans Condensed" w:hAnsi="DejaVu Sans Condensed"/>
-          <w:sz w:val="18"/>
-          <w:szCs w:val="18"/>
-        </w:rPr>
-        <w:t>} θα καταβάλλονται εντ</w:t>
-      </w:r>
-      <w:r>
-        <w:rPr>
-          <w:rFonts w:eastAsia="Calibri" w:cs="DejaVu Sans Condensed" w:ascii="DejaVu Sans Condensed" w:hAnsi="DejaVu Sans Condensed" w:eastAsiaTheme="minorHAnsi"/>
-          <w:color w:val="auto"/>
-          <w:kern w:val="0"/>
-          <w:sz w:val="18"/>
-          <w:szCs w:val="18"/>
-          <w:lang w:val="el-GR" w:eastAsia="en-US" w:bidi="ar-SA"/>
-        </w:rPr>
-        <w:t>ός {_XRONOS_KATABOLHS_APODOXON}</w:t>
-      </w:r>
-      <w:r>
-        <w:rPr>
-          <w:rFonts w:cs="DejaVu Sans Condensed" w:ascii="DejaVu Sans Condensed" w:hAnsi="DejaVu Sans Condensed"/>
-          <w:sz w:val="18"/>
-          <w:szCs w:val="18"/>
-        </w:rPr>
-        <w:t xml:space="preserve"> απ</w:t>
-      </w:r>
-      <w:r>
-        <w:rPr>
-          <w:rFonts w:eastAsia="Calibri" w:cs="DejaVu Sans Condensed" w:ascii="DejaVu Sans Condensed" w:hAnsi="DejaVu Sans Condensed" w:eastAsiaTheme="minorHAnsi"/>
-          <w:color w:val="auto"/>
-          <w:kern w:val="0"/>
-          <w:sz w:val="18"/>
-          <w:szCs w:val="18"/>
-          <w:lang w:val="el-GR" w:eastAsia="en-US" w:bidi="ar-SA"/>
-        </w:rPr>
-        <w:t xml:space="preserve">ό το πέρας </w:t>
-      </w:r>
-      <w:r>
-        <w:rPr>
-          <w:rFonts w:cs="DejaVu Sans Condensed" w:ascii="DejaVu Sans Condensed" w:hAnsi="DejaVu Sans Condensed"/>
-          <w:sz w:val="18"/>
-          <w:szCs w:val="18"/>
-        </w:rPr>
-        <w:t>εκάστου ημερολογιακού μηνός. Σε περίπτωση που αυτή η ημέρα είναι αργία, οι μηνιαίες αποδοχές θα καταβάλλονται την αμέσως επόμενη εργάσιμη ημέρα.</w:t>
+          <w:sz w:val="18"/>
+          <w:szCs w:val="18"/>
+        </w:rPr>
       </w:r>
     </w:p>
     <w:p>
@@ -5917,6 +5743,8 @@
         <w:jc w:val="both"/>
         <w:rPr>
           <w:rFonts w:ascii="DejaVu Sans Condensed" w:hAnsi="DejaVu Sans Condensed" w:cs="DejaVu Sans Condensed"/>
+          <w:b/>
+          <w:b/>
           <w:sz w:val="18"/>
           <w:szCs w:val="18"/>
         </w:rPr>
@@ -5924,9 +5752,22 @@
       <w:r>
         <w:rPr>
           <w:rFonts w:cs="DejaVu Sans Condensed" w:ascii="DejaVu Sans Condensed" w:hAnsi="DejaVu Sans Condensed"/>
-          <w:sz w:val="18"/>
-          <w:szCs w:val="18"/>
-        </w:rPr>
+          <w:b/>
+          <w:sz w:val="18"/>
+          <w:szCs w:val="18"/>
+        </w:rPr>
+        <w:t>7.</w:t>
+        <w:tab/>
+      </w:r>
+      <w:r>
+        <w:rPr>
+          <w:rFonts w:cs="DejaVu Sans Condensed" w:ascii="DejaVu Sans Condensed" w:hAnsi="DejaVu Sans Condensed"/>
+          <w:b/>
+          <w:sz w:val="18"/>
+          <w:szCs w:val="18"/>
+          <w:u w:val="thick"/>
+        </w:rPr>
+        <w:t>ΠΑΡΟΧΕΣ ΑΠΟ ΕΛΕΥΘΕΡΙΟΤΗΤΑ</w:t>
       </w:r>
     </w:p>
     <w:p>
@@ -5936,8 +5777,6 @@
         <w:jc w:val="both"/>
         <w:rPr>
           <w:rFonts w:ascii="DejaVu Sans Condensed" w:hAnsi="DejaVu Sans Condensed" w:cs="DejaVu Sans Condensed"/>
-          <w:b/>
-          <w:b/>
           <w:sz w:val="18"/>
           <w:szCs w:val="18"/>
         </w:rPr>
@@ -5946,21 +5785,105 @@
         <w:rPr>
           <w:rFonts w:cs="DejaVu Sans Condensed" w:ascii="DejaVu Sans Condensed" w:hAnsi="DejaVu Sans Condensed"/>
           <w:b/>
-          <w:sz w:val="18"/>
-          <w:szCs w:val="18"/>
-        </w:rPr>
-        <w:t>7.</w:t>
+          <w:bCs/>
+          <w:sz w:val="18"/>
+          <w:szCs w:val="18"/>
+        </w:rPr>
+        <w:t>7.1.</w:t>
+      </w:r>
+      <w:r>
+        <w:rPr>
+          <w:rFonts w:cs="DejaVu Sans Condensed" w:ascii="DejaVu Sans Condensed" w:hAnsi="DejaVu Sans Condensed"/>
+          <w:sz w:val="18"/>
+          <w:szCs w:val="18"/>
+        </w:rPr>
         <w:tab/>
-      </w:r>
-      <w:r>
-        <w:rPr>
-          <w:rFonts w:cs="DejaVu Sans Condensed" w:ascii="DejaVu Sans Condensed" w:hAnsi="DejaVu Sans Condensed"/>
-          <w:b/>
-          <w:sz w:val="18"/>
-          <w:szCs w:val="18"/>
-          <w:u w:val="thick"/>
-        </w:rPr>
-        <w:t>ΠΑΡΟΧΕΣ ΑΠΟ ΕΛΕΥΘΕΡΙΟΤΗΤΑ</w:t>
+        <w:t>Στ{_</w:t>
+      </w:r>
+      <w:r>
+        <w:rPr>
+          <w:rFonts w:cs="DejaVu Sans Condensed" w:ascii="DejaVu Sans Condensed" w:hAnsi="DejaVu Sans Condensed"/>
+          <w:sz w:val="18"/>
+          <w:szCs w:val="18"/>
+          <w:lang w:val="en-US"/>
+        </w:rPr>
+        <w:t>AITIATIKH</w:t>
+      </w:r>
+      <w:r>
+        <w:rPr>
+          <w:rFonts w:cs="DejaVu Sans Condensed" w:ascii="DejaVu Sans Condensed" w:hAnsi="DejaVu Sans Condensed"/>
+          <w:sz w:val="18"/>
+          <w:szCs w:val="18"/>
+        </w:rPr>
+        <w:t>_</w:t>
+      </w:r>
+      <w:r>
+        <w:rPr>
+          <w:rFonts w:cs="DejaVu Sans Condensed" w:ascii="DejaVu Sans Condensed" w:hAnsi="DejaVu Sans Condensed"/>
+          <w:sz w:val="18"/>
+          <w:szCs w:val="18"/>
+          <w:lang w:val="en-US"/>
+        </w:rPr>
+        <w:t>A</w:t>
+      </w:r>
+      <w:r>
+        <w:rPr>
+          <w:rFonts w:cs="DejaVu Sans Condensed" w:ascii="DejaVu Sans Condensed" w:hAnsi="DejaVu Sans Condensed"/>
+          <w:sz w:val="18"/>
+          <w:szCs w:val="18"/>
+        </w:rPr>
+        <w:t>} {_</w:t>
+      </w:r>
+      <w:r>
+        <w:rPr>
+          <w:rFonts w:cs="DejaVu Sans Condensed" w:ascii="DejaVu Sans Condensed" w:hAnsi="DejaVu Sans Condensed"/>
+          <w:sz w:val="18"/>
+          <w:szCs w:val="18"/>
+          <w:lang w:val="en-US"/>
+        </w:rPr>
+        <w:t>TYPOS</w:t>
+      </w:r>
+      <w:r>
+        <w:rPr>
+          <w:rFonts w:cs="DejaVu Sans Condensed" w:ascii="DejaVu Sans Condensed" w:hAnsi="DejaVu Sans Condensed"/>
+          <w:sz w:val="18"/>
+          <w:szCs w:val="18"/>
+        </w:rPr>
+        <w:t>_</w:t>
+      </w:r>
+      <w:r>
+        <w:rPr>
+          <w:rFonts w:cs="DejaVu Sans Condensed" w:ascii="DejaVu Sans Condensed" w:hAnsi="DejaVu Sans Condensed"/>
+          <w:sz w:val="18"/>
+          <w:szCs w:val="18"/>
+          <w:lang w:val="en-US"/>
+        </w:rPr>
+        <w:t>ERG</w:t>
+      </w:r>
+      <w:r>
+        <w:rPr>
+          <w:rFonts w:cs="DejaVu Sans Condensed" w:ascii="DejaVu Sans Condensed" w:hAnsi="DejaVu Sans Condensed"/>
+          <w:sz w:val="18"/>
+          <w:szCs w:val="18"/>
+        </w:rPr>
+        <w:t>_</w:t>
+      </w:r>
+      <w:r>
+        <w:rPr>
+          <w:rFonts w:cs="DejaVu Sans Condensed" w:ascii="DejaVu Sans Condensed" w:hAnsi="DejaVu Sans Condensed"/>
+          <w:sz w:val="18"/>
+          <w:szCs w:val="18"/>
+          <w:lang w:val="en-US"/>
+        </w:rPr>
+        <w:t>AITIATIKH</w:t>
+      </w:r>
+      <w:r>
+        <w:rPr>
+          <w:rFonts w:cs="DejaVu Sans Condensed" w:ascii="DejaVu Sans Condensed" w:hAnsi="DejaVu Sans Condensed"/>
+          <w:sz w:val="18"/>
+          <w:szCs w:val="18"/>
+        </w:rPr>
+        <w:t xml:space="preserve">} είναι δυνατόν να χορηγούνται, εις χρήμα ή/και εις είδος, παροχές πέραν των ανωτέρω (υπό 6) καθοριζομένων αποδοχών τ{_GENIKH_A} (όπως π.χ. κάρτα σίτισης, διαμονή, ακτοπλοϊκά εισιτήρια, μπόνους, επίδομα παραγωγικότητας, συμμετοχή σε πρόγραμμα ιατροφαρμακευτικής περίθαλψης, κ.α), σύμφωνα με την εκάστοτε ισχύουσα σχετική πολιτική {_ERGODOTHS_GENIKH}. </w:t>
       </w:r>
     </w:p>
     <w:p>
@@ -5977,21 +5900,129 @@
       <w:r>
         <w:rPr>
           <w:rFonts w:cs="DejaVu Sans Condensed" w:ascii="DejaVu Sans Condensed" w:hAnsi="DejaVu Sans Condensed"/>
-          <w:b/>
-          <w:bCs/>
-          <w:sz w:val="18"/>
-          <w:szCs w:val="18"/>
-        </w:rPr>
-        <w:t>7.1.</w:t>
-      </w:r>
-      <w:r>
-        <w:rPr>
-          <w:rFonts w:cs="DejaVu Sans Condensed" w:ascii="DejaVu Sans Condensed" w:hAnsi="DejaVu Sans Condensed"/>
-          <w:sz w:val="18"/>
-          <w:szCs w:val="18"/>
-        </w:rPr>
-        <w:tab/>
-        <w:t>Στ{_</w:t>
+          <w:sz w:val="18"/>
+          <w:szCs w:val="18"/>
+        </w:rPr>
+        <w:t>Ακόμα η τυχόν παροχή της χρήσης κινητών τηλεφώνων καθώς και της χρήσης αυτοκινήτων εκ μέρους του προσωπικού {_ERGODOTHS_GENIKH} γίνεται αποκλειστικά και μόνο για την κάλυψη λειτουργικών αναγκών {_ERGODOTHS_GENIKH} και δεν αποτελεί αντάλλαγμα εξαρτημένης εργασίας. {_</w:t>
+      </w:r>
+      <w:r>
+        <w:rPr>
+          <w:rFonts w:cs="DejaVu Sans Condensed" w:ascii="DejaVu Sans Condensed" w:hAnsi="DejaVu Sans Condensed"/>
+          <w:sz w:val="18"/>
+          <w:szCs w:val="18"/>
+          <w:lang w:val="en-US"/>
+        </w:rPr>
+        <w:t>CAPITAL</w:t>
+      </w:r>
+      <w:r>
+        <w:rPr>
+          <w:rFonts w:cs="DejaVu Sans Condensed" w:ascii="DejaVu Sans Condensed" w:hAnsi="DejaVu Sans Condensed"/>
+          <w:sz w:val="18"/>
+          <w:szCs w:val="18"/>
+        </w:rPr>
+        <w:t>_</w:t>
+      </w:r>
+      <w:r>
+        <w:rPr>
+          <w:rFonts w:cs="DejaVu Sans Condensed" w:ascii="DejaVu Sans Condensed" w:hAnsi="DejaVu Sans Condensed"/>
+          <w:sz w:val="18"/>
+          <w:szCs w:val="18"/>
+          <w:lang w:val="en-US"/>
+        </w:rPr>
+        <w:t>ONOMASTIKH</w:t>
+      </w:r>
+      <w:r>
+        <w:rPr>
+          <w:rFonts w:cs="DejaVu Sans Condensed" w:ascii="DejaVu Sans Condensed" w:hAnsi="DejaVu Sans Condensed"/>
+          <w:sz w:val="18"/>
+          <w:szCs w:val="18"/>
+        </w:rPr>
+        <w:t>_</w:t>
+      </w:r>
+      <w:r>
+        <w:rPr>
+          <w:rFonts w:cs="DejaVu Sans Condensed" w:ascii="DejaVu Sans Condensed" w:hAnsi="DejaVu Sans Condensed"/>
+          <w:sz w:val="18"/>
+          <w:szCs w:val="18"/>
+          <w:lang w:val="en-US"/>
+        </w:rPr>
+        <w:t>A</w:t>
+      </w:r>
+      <w:r>
+        <w:rPr>
+          <w:rFonts w:cs="DejaVu Sans Condensed" w:ascii="DejaVu Sans Condensed" w:hAnsi="DejaVu Sans Condensed"/>
+          <w:sz w:val="18"/>
+          <w:szCs w:val="18"/>
+        </w:rPr>
+        <w:t>} {_</w:t>
+      </w:r>
+      <w:r>
+        <w:rPr>
+          <w:rFonts w:cs="DejaVu Sans Condensed" w:ascii="DejaVu Sans Condensed" w:hAnsi="DejaVu Sans Condensed"/>
+          <w:sz w:val="18"/>
+          <w:szCs w:val="18"/>
+          <w:lang w:val="en-US"/>
+        </w:rPr>
+        <w:t>TYPOS</w:t>
+      </w:r>
+      <w:r>
+        <w:rPr>
+          <w:rFonts w:cs="DejaVu Sans Condensed" w:ascii="DejaVu Sans Condensed" w:hAnsi="DejaVu Sans Condensed"/>
+          <w:sz w:val="18"/>
+          <w:szCs w:val="18"/>
+        </w:rPr>
+        <w:t>_</w:t>
+      </w:r>
+      <w:r>
+        <w:rPr>
+          <w:rFonts w:cs="DejaVu Sans Condensed" w:ascii="DejaVu Sans Condensed" w:hAnsi="DejaVu Sans Condensed"/>
+          <w:sz w:val="18"/>
+          <w:szCs w:val="18"/>
+          <w:lang w:val="en-US"/>
+        </w:rPr>
+        <w:t>ERGAZOMENOY</w:t>
+      </w:r>
+      <w:r>
+        <w:rPr>
+          <w:rFonts w:cs="DejaVu Sans Condensed" w:ascii="DejaVu Sans Condensed" w:hAnsi="DejaVu Sans Condensed"/>
+          <w:sz w:val="18"/>
+          <w:szCs w:val="18"/>
+        </w:rPr>
+        <w:t>}, θα είναι υπεύθυν{_</w:t>
+      </w:r>
+      <w:r>
+        <w:rPr>
+          <w:rFonts w:cs="DejaVu Sans Condensed" w:ascii="DejaVu Sans Condensed" w:hAnsi="DejaVu Sans Condensed"/>
+          <w:sz w:val="18"/>
+          <w:szCs w:val="18"/>
+          <w:lang w:val="en-US"/>
+        </w:rPr>
+        <w:t>ONOMASTIKH</w:t>
+      </w:r>
+      <w:r>
+        <w:rPr>
+          <w:rFonts w:cs="DejaVu Sans Condensed" w:ascii="DejaVu Sans Condensed" w:hAnsi="DejaVu Sans Condensed"/>
+          <w:sz w:val="18"/>
+          <w:szCs w:val="18"/>
+        </w:rPr>
+        <w:t>_</w:t>
+      </w:r>
+      <w:r>
+        <w:rPr>
+          <w:rFonts w:cs="DejaVu Sans Condensed" w:ascii="DejaVu Sans Condensed" w:hAnsi="DejaVu Sans Condensed"/>
+          <w:sz w:val="18"/>
+          <w:szCs w:val="18"/>
+          <w:lang w:val="en-US"/>
+        </w:rPr>
+        <w:t>K</w:t>
+      </w:r>
+      <w:r>
+        <w:rPr>
+          <w:rFonts w:cs="DejaVu Sans Condensed" w:ascii="DejaVu Sans Condensed" w:hAnsi="DejaVu Sans Condensed"/>
+          <w:sz w:val="18"/>
+          <w:szCs w:val="18"/>
+        </w:rPr>
+        <w:t>} για όλα τα είδη που ανήκουν σ{_ERGODOTHS_</w:t>
       </w:r>
       <w:r>
         <w:rPr>
@@ -6008,75 +6039,7 @@
           <w:sz w:val="18"/>
           <w:szCs w:val="18"/>
         </w:rPr>
-        <w:t>_</w:t>
-      </w:r>
-      <w:r>
-        <w:rPr>
-          <w:rFonts w:cs="DejaVu Sans Condensed" w:ascii="DejaVu Sans Condensed" w:hAnsi="DejaVu Sans Condensed"/>
-          <w:sz w:val="18"/>
-          <w:szCs w:val="18"/>
-          <w:lang w:val="en-US"/>
-        </w:rPr>
-        <w:t>A</w:t>
-      </w:r>
-      <w:r>
-        <w:rPr>
-          <w:rFonts w:cs="DejaVu Sans Condensed" w:ascii="DejaVu Sans Condensed" w:hAnsi="DejaVu Sans Condensed"/>
-          <w:sz w:val="18"/>
-          <w:szCs w:val="18"/>
-        </w:rPr>
-        <w:t>} {_</w:t>
-      </w:r>
-      <w:r>
-        <w:rPr>
-          <w:rFonts w:cs="DejaVu Sans Condensed" w:ascii="DejaVu Sans Condensed" w:hAnsi="DejaVu Sans Condensed"/>
-          <w:sz w:val="18"/>
-          <w:szCs w:val="18"/>
-          <w:lang w:val="en-US"/>
-        </w:rPr>
-        <w:t>TYPOS</w:t>
-      </w:r>
-      <w:r>
-        <w:rPr>
-          <w:rFonts w:cs="DejaVu Sans Condensed" w:ascii="DejaVu Sans Condensed" w:hAnsi="DejaVu Sans Condensed"/>
-          <w:sz w:val="18"/>
-          <w:szCs w:val="18"/>
-        </w:rPr>
-        <w:t>_</w:t>
-      </w:r>
-      <w:r>
-        <w:rPr>
-          <w:rFonts w:cs="DejaVu Sans Condensed" w:ascii="DejaVu Sans Condensed" w:hAnsi="DejaVu Sans Condensed"/>
-          <w:sz w:val="18"/>
-          <w:szCs w:val="18"/>
-          <w:lang w:val="en-US"/>
-        </w:rPr>
-        <w:t>ERG</w:t>
-      </w:r>
-      <w:r>
-        <w:rPr>
-          <w:rFonts w:cs="DejaVu Sans Condensed" w:ascii="DejaVu Sans Condensed" w:hAnsi="DejaVu Sans Condensed"/>
-          <w:sz w:val="18"/>
-          <w:szCs w:val="18"/>
-        </w:rPr>
-        <w:t>_</w:t>
-      </w:r>
-      <w:r>
-        <w:rPr>
-          <w:rFonts w:cs="DejaVu Sans Condensed" w:ascii="DejaVu Sans Condensed" w:hAnsi="DejaVu Sans Condensed"/>
-          <w:sz w:val="18"/>
-          <w:szCs w:val="18"/>
-          <w:lang w:val="en-US"/>
-        </w:rPr>
-        <w:t>AITIATIKH</w:t>
-      </w:r>
-      <w:r>
-        <w:rPr>
-          <w:rFonts w:cs="DejaVu Sans Condensed" w:ascii="DejaVu Sans Condensed" w:hAnsi="DejaVu Sans Condensed"/>
-          <w:sz w:val="18"/>
-          <w:szCs w:val="18"/>
-        </w:rPr>
-        <w:t xml:space="preserve">} είναι δυνατόν να χορηγούνται, εις χρήμα ή/και εις είδος, παροχές πέραν των ανωτέρω (υπό 6) καθοριζομένων αποδοχών τ{_GENIKH_A} (όπως π.χ. κάρτα σίτισης, διαμονή, ακτοπλοϊκά εισιτήρια, μπόνους, επίδομα παραγωγικότητας, συμμετοχή σε πρόγραμμα ιατροφαρμακευτικής περίθαλψης, κ.α), σύμφωνα με την εκάστοτε ισχύουσα σχετική πολιτική {_ERGODOTHS_GENIKH}. </w:t>
+        <w:t>} και τα οποία χρησιμοποιεί κατά την εργασία τ{_GENIKH_A} και αναλαμβάνει την υποχρέωση να τα επιστρέψει κατά τη διακοπή της εργασίας τ{_GENIKH_A} για οποιοδήποτε λόγο.</w:t>
       </w:r>
     </w:p>
     <w:p>
@@ -6093,146 +6056,21 @@
       <w:r>
         <w:rPr>
           <w:rFonts w:cs="DejaVu Sans Condensed" w:ascii="DejaVu Sans Condensed" w:hAnsi="DejaVu Sans Condensed"/>
-          <w:sz w:val="18"/>
-          <w:szCs w:val="18"/>
-        </w:rPr>
-        <w:t>Ακόμα η τυχόν παροχή της χρήσης κινητών τηλεφώνων καθώς και της χρήσης αυτοκινήτων εκ μέρους του προσωπικού {_ERGODOTHS_GENIKH} γίνεται αποκλειστικά και μόνο για την κάλυψη λειτουργικών αναγκών {_ERGODOTHS_GENIKH} και δεν αποτελεί αντάλλαγμα εξαρτημένης εργασίας. {_</w:t>
-      </w:r>
-      <w:r>
-        <w:rPr>
-          <w:rFonts w:cs="DejaVu Sans Condensed" w:ascii="DejaVu Sans Condensed" w:hAnsi="DejaVu Sans Condensed"/>
-          <w:sz w:val="18"/>
-          <w:szCs w:val="18"/>
-          <w:lang w:val="en-US"/>
-        </w:rPr>
-        <w:t>CAPITAL</w:t>
-      </w:r>
-      <w:r>
-        <w:rPr>
-          <w:rFonts w:cs="DejaVu Sans Condensed" w:ascii="DejaVu Sans Condensed" w:hAnsi="DejaVu Sans Condensed"/>
-          <w:sz w:val="18"/>
-          <w:szCs w:val="18"/>
-        </w:rPr>
-        <w:t>_</w:t>
-      </w:r>
-      <w:r>
-        <w:rPr>
-          <w:rFonts w:cs="DejaVu Sans Condensed" w:ascii="DejaVu Sans Condensed" w:hAnsi="DejaVu Sans Condensed"/>
-          <w:sz w:val="18"/>
-          <w:szCs w:val="18"/>
-          <w:lang w:val="en-US"/>
-        </w:rPr>
-        <w:t>ONOMASTIKH</w:t>
-      </w:r>
-      <w:r>
-        <w:rPr>
-          <w:rFonts w:cs="DejaVu Sans Condensed" w:ascii="DejaVu Sans Condensed" w:hAnsi="DejaVu Sans Condensed"/>
-          <w:sz w:val="18"/>
-          <w:szCs w:val="18"/>
-        </w:rPr>
-        <w:t>_</w:t>
-      </w:r>
-      <w:r>
-        <w:rPr>
-          <w:rFonts w:cs="DejaVu Sans Condensed" w:ascii="DejaVu Sans Condensed" w:hAnsi="DejaVu Sans Condensed"/>
-          <w:sz w:val="18"/>
-          <w:szCs w:val="18"/>
-          <w:lang w:val="en-US"/>
-        </w:rPr>
-        <w:t>A</w:t>
-      </w:r>
-      <w:r>
-        <w:rPr>
-          <w:rFonts w:cs="DejaVu Sans Condensed" w:ascii="DejaVu Sans Condensed" w:hAnsi="DejaVu Sans Condensed"/>
-          <w:sz w:val="18"/>
-          <w:szCs w:val="18"/>
-        </w:rPr>
-        <w:t>} {_</w:t>
-      </w:r>
-      <w:r>
-        <w:rPr>
-          <w:rFonts w:cs="DejaVu Sans Condensed" w:ascii="DejaVu Sans Condensed" w:hAnsi="DejaVu Sans Condensed"/>
-          <w:sz w:val="18"/>
-          <w:szCs w:val="18"/>
-          <w:lang w:val="en-US"/>
-        </w:rPr>
-        <w:t>TYPOS</w:t>
-      </w:r>
-      <w:r>
-        <w:rPr>
-          <w:rFonts w:cs="DejaVu Sans Condensed" w:ascii="DejaVu Sans Condensed" w:hAnsi="DejaVu Sans Condensed"/>
-          <w:sz w:val="18"/>
-          <w:szCs w:val="18"/>
-        </w:rPr>
-        <w:t>_</w:t>
-      </w:r>
-      <w:r>
-        <w:rPr>
-          <w:rFonts w:cs="DejaVu Sans Condensed" w:ascii="DejaVu Sans Condensed" w:hAnsi="DejaVu Sans Condensed"/>
-          <w:sz w:val="18"/>
-          <w:szCs w:val="18"/>
-          <w:lang w:val="en-US"/>
-        </w:rPr>
-        <w:t>ERGAZOMENOY</w:t>
-      </w:r>
-      <w:r>
-        <w:rPr>
-          <w:rFonts w:cs="DejaVu Sans Condensed" w:ascii="DejaVu Sans Condensed" w:hAnsi="DejaVu Sans Condensed"/>
-          <w:sz w:val="18"/>
-          <w:szCs w:val="18"/>
-        </w:rPr>
-        <w:t>}, θα είναι υπεύθυν{_</w:t>
-      </w:r>
-      <w:r>
-        <w:rPr>
-          <w:rFonts w:cs="DejaVu Sans Condensed" w:ascii="DejaVu Sans Condensed" w:hAnsi="DejaVu Sans Condensed"/>
-          <w:sz w:val="18"/>
-          <w:szCs w:val="18"/>
-          <w:lang w:val="en-US"/>
-        </w:rPr>
-        <w:t>ONOMASTIKH</w:t>
-      </w:r>
-      <w:r>
-        <w:rPr>
-          <w:rFonts w:cs="DejaVu Sans Condensed" w:ascii="DejaVu Sans Condensed" w:hAnsi="DejaVu Sans Condensed"/>
-          <w:sz w:val="18"/>
-          <w:szCs w:val="18"/>
-        </w:rPr>
-        <w:t>_</w:t>
-      </w:r>
-      <w:r>
-        <w:rPr>
-          <w:rFonts w:cs="DejaVu Sans Condensed" w:ascii="DejaVu Sans Condensed" w:hAnsi="DejaVu Sans Condensed"/>
-          <w:sz w:val="18"/>
-          <w:szCs w:val="18"/>
-          <w:lang w:val="en-US"/>
-        </w:rPr>
-        <w:t>K</w:t>
-      </w:r>
-      <w:r>
-        <w:rPr>
-          <w:rFonts w:cs="DejaVu Sans Condensed" w:ascii="DejaVu Sans Condensed" w:hAnsi="DejaVu Sans Condensed"/>
-          <w:sz w:val="18"/>
-          <w:szCs w:val="18"/>
-        </w:rPr>
-        <w:t>} για όλα τα είδη που ανήκουν σ{_ERGODOTHS_</w:t>
-      </w:r>
-      <w:r>
-        <w:rPr>
-          <w:rFonts w:cs="DejaVu Sans Condensed" w:ascii="DejaVu Sans Condensed" w:hAnsi="DejaVu Sans Condensed"/>
-          <w:sz w:val="18"/>
-          <w:szCs w:val="18"/>
-          <w:lang w:val="en-US"/>
-        </w:rPr>
-        <w:t>AITIATIKH</w:t>
-      </w:r>
-      <w:r>
-        <w:rPr>
-          <w:rFonts w:cs="DejaVu Sans Condensed" w:ascii="DejaVu Sans Condensed" w:hAnsi="DejaVu Sans Condensed"/>
-          <w:sz w:val="18"/>
-          <w:szCs w:val="18"/>
-        </w:rPr>
-        <w:t>} και τα οποία χρησιμοποιεί κατά την εργασία τ{_GENIKH_A} και αναλαμβάνει την υποχρέωση να τα επιστρέψει κατά τη διακοπή της εργασίας τ{_GENIKH_A} για οποιοδήποτε λόγο.</w:t>
+          <w:b/>
+          <w:bCs/>
+          <w:sz w:val="18"/>
+          <w:szCs w:val="18"/>
+        </w:rPr>
+        <w:t>7.2.</w:t>
+        <w:tab/>
+      </w:r>
+      <w:r>
+        <w:rPr>
+          <w:rFonts w:cs="DejaVu Sans Condensed" w:ascii="DejaVu Sans Condensed" w:hAnsi="DejaVu Sans Condensed"/>
+          <w:sz w:val="18"/>
+          <w:szCs w:val="18"/>
+        </w:rPr>
+        <w:t xml:space="preserve">{_ERGODOTHS_CAPITAL_A} επιφυλάσσεται ρητώς τού δικαιώματος μονομερούς ανάκλησης των παροχών αυτών, σε χρήμα ή είδος ή επιδόματος που έχουν χορηγηθεί υπό την αίρεση της άρσης χορήγησης του κατά την κρίση {_ERGODOTHS_GENIKH}. </w:t>
       </w:r>
     </w:p>
     <w:p>
@@ -6249,21 +6087,10 @@
       <w:r>
         <w:rPr>
           <w:rFonts w:cs="DejaVu Sans Condensed" w:ascii="DejaVu Sans Condensed" w:hAnsi="DejaVu Sans Condensed"/>
-          <w:b/>
-          <w:bCs/>
-          <w:sz w:val="18"/>
-          <w:szCs w:val="18"/>
-        </w:rPr>
-        <w:t>7.2.</w:t>
-        <w:tab/>
-      </w:r>
-      <w:r>
-        <w:rPr>
-          <w:rFonts w:cs="DejaVu Sans Condensed" w:ascii="DejaVu Sans Condensed" w:hAnsi="DejaVu Sans Condensed"/>
-          <w:sz w:val="18"/>
-          <w:szCs w:val="18"/>
-        </w:rPr>
-        <w:t xml:space="preserve">{_ERGODOTHS_CAPITAL_A} επιφυλάσσεται ρητώς τού δικαιώματος μονομερούς ανάκλησης των παροχών αυτών, σε χρήμα ή είδος ή επιδόματος που έχουν χορηγηθεί υπό την αίρεση της άρσης χορήγησης του κατά την κρίση {_ERGODOTHS_GENIKH}. </w:t>
+          <w:sz w:val="18"/>
+          <w:szCs w:val="18"/>
+        </w:rPr>
+        <w:t xml:space="preserve">Ειδικότερα επιφυλάσσεται τού δικαιώματος να περικόπτει μερικώς ή ολικώς τις παροχές αυτές καθώς και να τροποποιεί τον τρόπο και τις προϋποθέσεις χορηγήσεώς τους. </w:t>
       </w:r>
     </w:p>
     <w:p>
@@ -6283,7 +6110,92 @@
           <w:sz w:val="18"/>
           <w:szCs w:val="18"/>
         </w:rPr>
-        <w:t xml:space="preserve">Ειδικότερα επιφυλάσσεται τού δικαιώματος να περικόπτει μερικώς ή ολικώς τις παροχές αυτές καθώς και να τροποποιεί τον τρόπο και τις προϋποθέσεις χορηγήσεώς τους. </w:t>
+        <w:t>Ως εκ τούτου, οι εν λόγω παροχές δεν έχουν μισθολογικό χαρακτήρα (δεν θεωρούνται μισθός) και η περικοπή τους δεν συνιστά μονομερή βλαπτική μεταβολή των όρων εργασίας τ{_</w:t>
+      </w:r>
+      <w:r>
+        <w:rPr>
+          <w:rFonts w:cs="DejaVu Sans Condensed" w:ascii="DejaVu Sans Condensed" w:hAnsi="DejaVu Sans Condensed"/>
+          <w:sz w:val="18"/>
+          <w:szCs w:val="18"/>
+          <w:lang w:val="en-US"/>
+        </w:rPr>
+        <w:t>GENIKH</w:t>
+      </w:r>
+      <w:r>
+        <w:rPr>
+          <w:rFonts w:cs="DejaVu Sans Condensed" w:ascii="DejaVu Sans Condensed" w:hAnsi="DejaVu Sans Condensed"/>
+          <w:sz w:val="18"/>
+          <w:szCs w:val="18"/>
+        </w:rPr>
+        <w:t>_</w:t>
+      </w:r>
+      <w:r>
+        <w:rPr>
+          <w:rFonts w:cs="DejaVu Sans Condensed" w:ascii="DejaVu Sans Condensed" w:hAnsi="DejaVu Sans Condensed"/>
+          <w:sz w:val="18"/>
+          <w:szCs w:val="18"/>
+          <w:lang w:val="en-US"/>
+        </w:rPr>
+        <w:t>A</w:t>
+      </w:r>
+      <w:r>
+        <w:rPr>
+          <w:rFonts w:cs="DejaVu Sans Condensed" w:ascii="DejaVu Sans Condensed" w:hAnsi="DejaVu Sans Condensed"/>
+          <w:sz w:val="18"/>
+          <w:szCs w:val="18"/>
+        </w:rPr>
+        <w:t>} {_</w:t>
+      </w:r>
+      <w:r>
+        <w:rPr>
+          <w:rFonts w:cs="DejaVu Sans Condensed" w:ascii="DejaVu Sans Condensed" w:hAnsi="DejaVu Sans Condensed"/>
+          <w:sz w:val="18"/>
+          <w:szCs w:val="18"/>
+          <w:lang w:val="en-US"/>
+        </w:rPr>
+        <w:t>TYPOS</w:t>
+      </w:r>
+      <w:r>
+        <w:rPr>
+          <w:rFonts w:cs="DejaVu Sans Condensed" w:ascii="DejaVu Sans Condensed" w:hAnsi="DejaVu Sans Condensed"/>
+          <w:sz w:val="18"/>
+          <w:szCs w:val="18"/>
+        </w:rPr>
+        <w:t>_</w:t>
+      </w:r>
+      <w:r>
+        <w:rPr>
+          <w:rFonts w:cs="DejaVu Sans Condensed" w:ascii="DejaVu Sans Condensed" w:hAnsi="DejaVu Sans Condensed"/>
+          <w:sz w:val="18"/>
+          <w:szCs w:val="18"/>
+          <w:lang w:val="en-US"/>
+        </w:rPr>
+        <w:t>ERG</w:t>
+      </w:r>
+      <w:r>
+        <w:rPr>
+          <w:rFonts w:cs="DejaVu Sans Condensed" w:ascii="DejaVu Sans Condensed" w:hAnsi="DejaVu Sans Condensed"/>
+          <w:sz w:val="18"/>
+          <w:szCs w:val="18"/>
+        </w:rPr>
+        <w:t>_</w:t>
+      </w:r>
+      <w:r>
+        <w:rPr>
+          <w:rFonts w:cs="DejaVu Sans Condensed" w:ascii="DejaVu Sans Condensed" w:hAnsi="DejaVu Sans Condensed"/>
+          <w:sz w:val="18"/>
+          <w:szCs w:val="18"/>
+          <w:lang w:val="en-US"/>
+        </w:rPr>
+        <w:t>GENIKH</w:t>
+      </w:r>
+      <w:r>
+        <w:rPr>
+          <w:rFonts w:cs="DejaVu Sans Condensed" w:ascii="DejaVu Sans Condensed" w:hAnsi="DejaVu Sans Condensed"/>
+          <w:sz w:val="18"/>
+          <w:szCs w:val="18"/>
+        </w:rPr>
+        <w:t xml:space="preserve">}. Τυχόν δε συνυπολογισμός τους, άπαξ ή κατ’ επανάληψη, σε δώρα Χριστουγέννων ή Πάσχα ή στο επίδομα αδείας δεν αναιρεί αυτόν τους τον χαρακτήρα. </w:t>
       </w:r>
     </w:p>
     <w:p>
@@ -6303,92 +6215,6 @@
           <w:sz w:val="18"/>
           <w:szCs w:val="18"/>
         </w:rPr>
-        <w:t>Ως εκ τούτου, οι εν λόγω παροχές δεν έχουν μισθολογικό χαρακτήρα (δεν θεωρούνται μισθός) και η περικοπή τους δεν συνιστά μονομερή βλαπτική μεταβολή των όρων εργασίας τ{_</w:t>
-      </w:r>
-      <w:r>
-        <w:rPr>
-          <w:rFonts w:cs="DejaVu Sans Condensed" w:ascii="DejaVu Sans Condensed" w:hAnsi="DejaVu Sans Condensed"/>
-          <w:sz w:val="18"/>
-          <w:szCs w:val="18"/>
-          <w:lang w:val="en-US"/>
-        </w:rPr>
-        <w:t>GENIKH</w:t>
-      </w:r>
-      <w:r>
-        <w:rPr>
-          <w:rFonts w:cs="DejaVu Sans Condensed" w:ascii="DejaVu Sans Condensed" w:hAnsi="DejaVu Sans Condensed"/>
-          <w:sz w:val="18"/>
-          <w:szCs w:val="18"/>
-        </w:rPr>
-        <w:t>_</w:t>
-      </w:r>
-      <w:r>
-        <w:rPr>
-          <w:rFonts w:cs="DejaVu Sans Condensed" w:ascii="DejaVu Sans Condensed" w:hAnsi="DejaVu Sans Condensed"/>
-          <w:sz w:val="18"/>
-          <w:szCs w:val="18"/>
-          <w:lang w:val="en-US"/>
-        </w:rPr>
-        <w:t>A</w:t>
-      </w:r>
-      <w:r>
-        <w:rPr>
-          <w:rFonts w:cs="DejaVu Sans Condensed" w:ascii="DejaVu Sans Condensed" w:hAnsi="DejaVu Sans Condensed"/>
-          <w:sz w:val="18"/>
-          <w:szCs w:val="18"/>
-        </w:rPr>
-        <w:t>} {_</w:t>
-      </w:r>
-      <w:r>
-        <w:rPr>
-          <w:rFonts w:cs="DejaVu Sans Condensed" w:ascii="DejaVu Sans Condensed" w:hAnsi="DejaVu Sans Condensed"/>
-          <w:sz w:val="18"/>
-          <w:szCs w:val="18"/>
-          <w:lang w:val="en-US"/>
-        </w:rPr>
-        <w:t>TYPOS</w:t>
-      </w:r>
-      <w:r>
-        <w:rPr>
-          <w:rFonts w:cs="DejaVu Sans Condensed" w:ascii="DejaVu Sans Condensed" w:hAnsi="DejaVu Sans Condensed"/>
-          <w:sz w:val="18"/>
-          <w:szCs w:val="18"/>
-        </w:rPr>
-        <w:t>_</w:t>
-      </w:r>
-      <w:r>
-        <w:rPr>
-          <w:rFonts w:cs="DejaVu Sans Condensed" w:ascii="DejaVu Sans Condensed" w:hAnsi="DejaVu Sans Condensed"/>
-          <w:sz w:val="18"/>
-          <w:szCs w:val="18"/>
-          <w:lang w:val="en-US"/>
-        </w:rPr>
-        <w:t>ERG</w:t>
-      </w:r>
-      <w:r>
-        <w:rPr>
-          <w:rFonts w:cs="DejaVu Sans Condensed" w:ascii="DejaVu Sans Condensed" w:hAnsi="DejaVu Sans Condensed"/>
-          <w:sz w:val="18"/>
-          <w:szCs w:val="18"/>
-        </w:rPr>
-        <w:t>_</w:t>
-      </w:r>
-      <w:r>
-        <w:rPr>
-          <w:rFonts w:cs="DejaVu Sans Condensed" w:ascii="DejaVu Sans Condensed" w:hAnsi="DejaVu Sans Condensed"/>
-          <w:sz w:val="18"/>
-          <w:szCs w:val="18"/>
-          <w:lang w:val="en-US"/>
-        </w:rPr>
-        <w:t>GENIKH</w:t>
-      </w:r>
-      <w:r>
-        <w:rPr>
-          <w:rFonts w:cs="DejaVu Sans Condensed" w:ascii="DejaVu Sans Condensed" w:hAnsi="DejaVu Sans Condensed"/>
-          <w:sz w:val="18"/>
-          <w:szCs w:val="18"/>
-        </w:rPr>
-        <w:t xml:space="preserve">}. Τυχόν δε συνυπολογισμός τους, άπαξ ή κατ’ επανάληψη, σε δώρα Χριστουγέννων ή Πάσχα ή στο επίδομα αδείας δεν αναιρεί αυτόν τους τον χαρακτήρα. </w:t>
       </w:r>
     </w:p>
     <w:p>
@@ -6398,6 +6224,9 @@
         <w:jc w:val="both"/>
         <w:rPr>
           <w:rFonts w:ascii="DejaVu Sans Condensed" w:hAnsi="DejaVu Sans Condensed" w:cs="DejaVu Sans Condensed"/>
+          <w:b/>
+          <w:b/>
+          <w:bCs/>
           <w:sz w:val="18"/>
           <w:szCs w:val="18"/>
         </w:rPr>
@@ -6405,9 +6234,24 @@
       <w:r>
         <w:rPr>
           <w:rFonts w:cs="DejaVu Sans Condensed" w:ascii="DejaVu Sans Condensed" w:hAnsi="DejaVu Sans Condensed"/>
-          <w:sz w:val="18"/>
-          <w:szCs w:val="18"/>
-        </w:rPr>
+          <w:b/>
+          <w:bCs/>
+          <w:sz w:val="18"/>
+          <w:szCs w:val="18"/>
+        </w:rPr>
+        <w:t xml:space="preserve">8. </w:t>
+        <w:tab/>
+      </w:r>
+      <w:r>
+        <w:rPr>
+          <w:rFonts w:cs="DejaVu Sans Condensed" w:ascii="DejaVu Sans Condensed" w:hAnsi="DejaVu Sans Condensed"/>
+          <w:b/>
+          <w:bCs/>
+          <w:sz w:val="18"/>
+          <w:szCs w:val="18"/>
+          <w:u w:val="thick"/>
+        </w:rPr>
+        <w:t>ΔΙΑΔΙΚΑΣΙΑ ΛΥΣΗΣ ΤΗΣ ΣΥΜΒΑΣΗΣ ή ΣΧΕΣΗΣ ΕΡΓΑΣΙΑΣ – ΑΠΟΖΗΜΙΩΣΗ ΑΠΟΛΥΣΗΣ</w:t>
       </w:r>
     </w:p>
     <w:p>
@@ -6417,43 +6261,6 @@
         <w:jc w:val="both"/>
         <w:rPr>
           <w:rFonts w:ascii="DejaVu Sans Condensed" w:hAnsi="DejaVu Sans Condensed" w:cs="DejaVu Sans Condensed"/>
-          <w:b/>
-          <w:b/>
-          <w:bCs/>
-          <w:sz w:val="18"/>
-          <w:szCs w:val="18"/>
-        </w:rPr>
-      </w:pPr>
-      <w:r>
-        <w:rPr>
-          <w:rFonts w:cs="DejaVu Sans Condensed" w:ascii="DejaVu Sans Condensed" w:hAnsi="DejaVu Sans Condensed"/>
-          <w:b/>
-          <w:bCs/>
-          <w:sz w:val="18"/>
-          <w:szCs w:val="18"/>
-        </w:rPr>
-        <w:t xml:space="preserve">8. </w:t>
-        <w:tab/>
-      </w:r>
-      <w:r>
-        <w:rPr>
-          <w:rFonts w:cs="DejaVu Sans Condensed" w:ascii="DejaVu Sans Condensed" w:hAnsi="DejaVu Sans Condensed"/>
-          <w:b/>
-          <w:bCs/>
-          <w:sz w:val="18"/>
-          <w:szCs w:val="18"/>
-          <w:u w:val="thick"/>
-        </w:rPr>
-        <w:t>ΔΙΑΔΙΚΑΣΙΑ ΛΥΣΗΣ ΤΗΣ ΣΥΜΒΑΣΗΣ ή ΣΧΕΣΗΣ ΕΡΓΑΣΙΑΣ – ΑΠΟΖΗΜΙΩΣΗ ΑΠΟΛΥΣΗΣ</w:t>
-      </w:r>
-    </w:p>
-    <w:p>
-      <w:pPr>
-        <w:pStyle w:val="Normal"/>
-        <w:ind w:left="-709" w:right="-1186" w:hanging="0"/>
-        <w:jc w:val="both"/>
-        <w:rPr>
-          <w:rFonts w:ascii="DejaVu Sans Condensed" w:hAnsi="DejaVu Sans Condensed" w:cs="DejaVu Sans Condensed"/>
           <w:sz w:val="18"/>
           <w:szCs w:val="18"/>
         </w:rPr>
@@ -6494,39 +6301,7 @@
           <w:sz w:val="18"/>
           <w:szCs w:val="18"/>
         </w:rPr>
-        <w:t>ιδίως με καταγγελία της, από κάθε συμβαλλόμενο μέρος, διεπόμενη από τις εκάστοτε ισχύουσες διατάξεις της εργατικής νομοθεσίας. {_</w:t>
-      </w:r>
-      <w:r>
-        <w:rPr>
-          <w:rFonts w:cs="DejaVu Sans Condensed" w:ascii="DejaVu Sans Condensed" w:hAnsi="DejaVu Sans Condensed"/>
-          <w:sz w:val="18"/>
-          <w:szCs w:val="18"/>
-        </w:rPr>
-        <w:t>FIELD</w:t>
-      </w:r>
-      <w:r>
-        <w:rPr>
-          <w:rFonts w:cs="DejaVu Sans Condensed" w:ascii="DejaVu Sans Condensed" w:hAnsi="DejaVu Sans Condensed"/>
-          <w:sz w:val="18"/>
-          <w:szCs w:val="18"/>
-        </w:rPr>
-        <w:t>_00</w:t>
-      </w:r>
-      <w:r>
-        <w:rPr>
-          <w:rFonts w:cs="DejaVu Sans Condensed" w:ascii="DejaVu Sans Condensed" w:hAnsi="DejaVu Sans Condensed"/>
-          <w:sz w:val="18"/>
-          <w:szCs w:val="18"/>
-        </w:rPr>
-        <w:t>08</w:t>
-      </w:r>
-      <w:r>
-        <w:rPr>
-          <w:rFonts w:cs="DejaVu Sans Condensed" w:ascii="DejaVu Sans Condensed" w:hAnsi="DejaVu Sans Condensed"/>
-          <w:sz w:val="18"/>
-          <w:szCs w:val="18"/>
-        </w:rPr>
-        <w:t>}{</w:t>
+        <w:t>ιδίως με καταγγελία της, από κάθε συμβαλλόμενο μέρος, διεπόμενη από τις εκάστοτε ισχύουσες διατάξεις της εργατικής νομοθεσίας. {_FIELD_0008}{</w:t>
       </w:r>
       <w:r>
         <w:rPr>
@@ -6537,40 +6312,7 @@
           <w:szCs w:val="18"/>
           <w:u w:val="single"/>
         </w:rPr>
-        <w:t>_</w:t>
-      </w:r>
-      <w:r>
-        <w:rPr>
-          <w:rFonts w:cs="DejaVu Sans Condensed" w:ascii="DejaVu Sans Condensed" w:hAnsi="DejaVu Sans Condensed"/>
-          <w:i/>
-          <w:iCs/>
-          <w:sz w:val="18"/>
-          <w:szCs w:val="18"/>
-          <w:u w:val="single"/>
-        </w:rPr>
-        <w:t>FIELD</w:t>
-      </w:r>
-      <w:r>
-        <w:rPr>
-          <w:rFonts w:cs="DejaVu Sans Condensed" w:ascii="DejaVu Sans Condensed" w:hAnsi="DejaVu Sans Condensed"/>
-          <w:i/>
-          <w:iCs/>
-          <w:sz w:val="18"/>
-          <w:szCs w:val="18"/>
-          <w:u w:val="single"/>
-        </w:rPr>
-        <w:t>_00</w:t>
-      </w:r>
-      <w:r>
-        <w:rPr>
-          <w:rFonts w:cs="DejaVu Sans Condensed" w:ascii="DejaVu Sans Condensed" w:hAnsi="DejaVu Sans Condensed"/>
-          <w:i/>
-          <w:iCs/>
-          <w:sz w:val="18"/>
-          <w:szCs w:val="18"/>
-          <w:u w:val="single"/>
-        </w:rPr>
-        <w:t>09</w:t>
+        <w:t>_FIELD_0009</w:t>
       </w:r>
       <w:r>
         <w:rPr>
@@ -7381,6 +7123,32 @@
         </w:rPr>
         <w:t xml:space="preserve">α) </w:t>
         <w:tab/>
+      </w:r>
+      <w:r>
+        <w:rPr>
+          <w:rFonts w:cs="DejaVu Sans Condensed" w:ascii="DejaVu Sans Condensed" w:hAnsi="DejaVu Sans Condensed"/>
+          <w:sz w:val="18"/>
+          <w:szCs w:val="18"/>
+        </w:rPr>
+        <w:t>συχν</w:t>
+      </w:r>
+      <w:r>
+        <w:rPr>
+          <w:rFonts w:eastAsia="Calibri" w:cs="DejaVu Sans Condensed" w:ascii="DejaVu Sans Condensed" w:hAnsi="DejaVu Sans Condensed" w:eastAsiaTheme="minorHAnsi"/>
+          <w:color w:val="auto"/>
+          <w:kern w:val="0"/>
+          <w:sz w:val="18"/>
+          <w:szCs w:val="18"/>
+          <w:lang w:val="el-GR" w:eastAsia="en-US" w:bidi="ar-SA"/>
+        </w:rPr>
+        <w:t xml:space="preserve">ή </w:t>
+      </w:r>
+      <w:r>
+        <w:rPr>
+          <w:rFonts w:cs="DejaVu Sans Condensed" w:ascii="DejaVu Sans Condensed" w:hAnsi="DejaVu Sans Condensed"/>
+          <w:sz w:val="18"/>
+          <w:szCs w:val="18"/>
+        </w:rPr>
         <w:t>καθυστέρηση προσέλευσης τ{_</w:t>
       </w:r>
       <w:r>
@@ -7517,7 +7285,34 @@
           <w:sz w:val="18"/>
           <w:szCs w:val="18"/>
         </w:rPr>
-        <w:t>} ή απουσία τ{_</w:t>
+        <w:t xml:space="preserve">} ή </w:t>
+      </w:r>
+      <w:r>
+        <w:rPr>
+          <w:rFonts w:cs="DejaVu Sans Condensed" w:ascii="DejaVu Sans Condensed" w:hAnsi="DejaVu Sans Condensed"/>
+          <w:sz w:val="18"/>
+          <w:szCs w:val="18"/>
+        </w:rPr>
+        <w:t>αδικαιολ</w:t>
+      </w:r>
+      <w:r>
+        <w:rPr>
+          <w:rFonts w:eastAsia="Calibri" w:cs="DejaVu Sans Condensed" w:ascii="DejaVu Sans Condensed" w:hAnsi="DejaVu Sans Condensed" w:eastAsiaTheme="minorHAnsi"/>
+          <w:color w:val="auto"/>
+          <w:kern w:val="0"/>
+          <w:sz w:val="18"/>
+          <w:szCs w:val="18"/>
+          <w:lang w:val="el-GR" w:eastAsia="en-US" w:bidi="ar-SA"/>
+        </w:rPr>
+        <w:t xml:space="preserve">όγητη </w:t>
+      </w:r>
+      <w:r>
+        <w:rPr>
+          <w:rFonts w:cs="DejaVu Sans Condensed" w:ascii="DejaVu Sans Condensed" w:hAnsi="DejaVu Sans Condensed"/>
+          <w:sz w:val="18"/>
+          <w:szCs w:val="18"/>
+        </w:rPr>
+        <w:t>απουσία τ{_</w:t>
       </w:r>
       <w:r>
         <w:rPr>
@@ -7585,7 +7380,7 @@
           <w:sz w:val="18"/>
           <w:szCs w:val="18"/>
         </w:rPr>
-        <w:t>} σύμφωνα με τα όσα ορίζονται στον όρο 2 της παρούσης</w:t>
+        <w:t>} σύμφωνα με τα όσα ορίζονται στον όρο 2 της παρούσης.</w:t>
       </w:r>
     </w:p>
     <w:p>
@@ -7605,9 +7400,144 @@
           <w:sz w:val="18"/>
           <w:szCs w:val="18"/>
         </w:rPr>
-        <w:t xml:space="preserve">β) </w:t>
+        <w:t>β</w:t>
+      </w:r>
+      <w:r>
+        <w:rPr>
+          <w:rFonts w:cs="DejaVu Sans Condensed" w:ascii="DejaVu Sans Condensed" w:hAnsi="DejaVu Sans Condensed"/>
+          <w:sz w:val="18"/>
+          <w:szCs w:val="18"/>
+        </w:rPr>
+        <w:t xml:space="preserve">) </w:t>
         <w:tab/>
-        <w:t>αναστολή ή διακοπή της λειτουργίας {_ERGODOTHS_GENIKH} για οποιονδήποτε λόγο</w:t>
+        <w:t>προφανής ανεπάρκεια τ{_</w:t>
+      </w:r>
+      <w:r>
+        <w:rPr>
+          <w:rFonts w:cs="DejaVu Sans Condensed" w:ascii="DejaVu Sans Condensed" w:hAnsi="DejaVu Sans Condensed"/>
+          <w:sz w:val="18"/>
+          <w:szCs w:val="18"/>
+          <w:lang w:val="en-US"/>
+        </w:rPr>
+        <w:t>GENIKH</w:t>
+      </w:r>
+      <w:r>
+        <w:rPr>
+          <w:rFonts w:cs="DejaVu Sans Condensed" w:ascii="DejaVu Sans Condensed" w:hAnsi="DejaVu Sans Condensed"/>
+          <w:sz w:val="18"/>
+          <w:szCs w:val="18"/>
+        </w:rPr>
+        <w:t>_</w:t>
+      </w:r>
+      <w:r>
+        <w:rPr>
+          <w:rFonts w:cs="DejaVu Sans Condensed" w:ascii="DejaVu Sans Condensed" w:hAnsi="DejaVu Sans Condensed"/>
+          <w:sz w:val="18"/>
+          <w:szCs w:val="18"/>
+          <w:lang w:val="en-US"/>
+        </w:rPr>
+        <w:t>A</w:t>
+      </w:r>
+      <w:r>
+        <w:rPr>
+          <w:rFonts w:cs="DejaVu Sans Condensed" w:ascii="DejaVu Sans Condensed" w:hAnsi="DejaVu Sans Condensed"/>
+          <w:sz w:val="18"/>
+          <w:szCs w:val="18"/>
+        </w:rPr>
+        <w:t>} {_</w:t>
+      </w:r>
+      <w:r>
+        <w:rPr>
+          <w:rFonts w:cs="DejaVu Sans Condensed" w:ascii="DejaVu Sans Condensed" w:hAnsi="DejaVu Sans Condensed"/>
+          <w:sz w:val="18"/>
+          <w:szCs w:val="18"/>
+          <w:lang w:val="en-US"/>
+        </w:rPr>
+        <w:t>TYPOS</w:t>
+      </w:r>
+      <w:r>
+        <w:rPr>
+          <w:rFonts w:cs="DejaVu Sans Condensed" w:ascii="DejaVu Sans Condensed" w:hAnsi="DejaVu Sans Condensed"/>
+          <w:sz w:val="18"/>
+          <w:szCs w:val="18"/>
+        </w:rPr>
+        <w:t>_</w:t>
+      </w:r>
+      <w:r>
+        <w:rPr>
+          <w:rFonts w:cs="DejaVu Sans Condensed" w:ascii="DejaVu Sans Condensed" w:hAnsi="DejaVu Sans Condensed"/>
+          <w:sz w:val="18"/>
+          <w:szCs w:val="18"/>
+          <w:lang w:val="en-US"/>
+        </w:rPr>
+        <w:t>ERG</w:t>
+      </w:r>
+      <w:r>
+        <w:rPr>
+          <w:rFonts w:cs="DejaVu Sans Condensed" w:ascii="DejaVu Sans Condensed" w:hAnsi="DejaVu Sans Condensed"/>
+          <w:sz w:val="18"/>
+          <w:szCs w:val="18"/>
+        </w:rPr>
+        <w:t>_</w:t>
+      </w:r>
+      <w:r>
+        <w:rPr>
+          <w:rFonts w:cs="DejaVu Sans Condensed" w:ascii="DejaVu Sans Condensed" w:hAnsi="DejaVu Sans Condensed"/>
+          <w:sz w:val="18"/>
+          <w:szCs w:val="18"/>
+          <w:lang w:val="en-US"/>
+        </w:rPr>
+        <w:t>GENIKH</w:t>
+      </w:r>
+      <w:r>
+        <w:rPr>
+          <w:rFonts w:cs="DejaVu Sans Condensed" w:ascii="DejaVu Sans Condensed" w:hAnsi="DejaVu Sans Condensed"/>
+          <w:sz w:val="18"/>
+          <w:szCs w:val="18"/>
+        </w:rPr>
+        <w:t>} στην εκπλήρωση των καθηκόντων τ{_</w:t>
+      </w:r>
+      <w:r>
+        <w:rPr>
+          <w:rFonts w:cs="DejaVu Sans Condensed" w:ascii="DejaVu Sans Condensed" w:hAnsi="DejaVu Sans Condensed"/>
+          <w:sz w:val="18"/>
+          <w:szCs w:val="18"/>
+          <w:lang w:val="en-US"/>
+        </w:rPr>
+        <w:t>GENIKH</w:t>
+      </w:r>
+      <w:r>
+        <w:rPr>
+          <w:rFonts w:cs="DejaVu Sans Condensed" w:ascii="DejaVu Sans Condensed" w:hAnsi="DejaVu Sans Condensed"/>
+          <w:sz w:val="18"/>
+          <w:szCs w:val="18"/>
+        </w:rPr>
+        <w:t>_</w:t>
+      </w:r>
+      <w:r>
+        <w:rPr>
+          <w:rFonts w:cs="DejaVu Sans Condensed" w:ascii="DejaVu Sans Condensed" w:hAnsi="DejaVu Sans Condensed"/>
+          <w:sz w:val="18"/>
+          <w:szCs w:val="18"/>
+          <w:lang w:val="en-US"/>
+        </w:rPr>
+        <w:t>A</w:t>
+      </w:r>
+      <w:r>
+        <w:rPr>
+          <w:rFonts w:cs="DejaVu Sans Condensed" w:ascii="DejaVu Sans Condensed" w:hAnsi="DejaVu Sans Condensed"/>
+          <w:sz w:val="18"/>
+          <w:szCs w:val="18"/>
+        </w:rPr>
+        <w:t xml:space="preserve">} </w:t>
+      </w:r>
+      <w:r>
+        <w:rPr>
+          <w:rFonts w:cs="DejaVu Sans Condensed" w:ascii="DejaVu Sans Condensed" w:hAnsi="DejaVu Sans Condensed"/>
+          <w:sz w:val="18"/>
+          <w:szCs w:val="18"/>
+        </w:rPr>
+        <w:t>{_FIELD_0082}</w:t>
       </w:r>
     </w:p>
     <w:p>
@@ -7627,128 +7557,17 @@
           <w:sz w:val="18"/>
           <w:szCs w:val="18"/>
         </w:rPr>
-        <w:t xml:space="preserve">γ) </w:t>
+        <w:t>γ</w:t>
+      </w:r>
+      <w:r>
+        <w:rPr>
+          <w:rFonts w:cs="DejaVu Sans Condensed" w:ascii="DejaVu Sans Condensed" w:hAnsi="DejaVu Sans Condensed"/>
+          <w:sz w:val="18"/>
+          <w:szCs w:val="18"/>
+        </w:rPr>
+        <w:t xml:space="preserve">) </w:t>
         <w:tab/>
-        <w:t>προφανής ανεπάρκεια τ{_</w:t>
-      </w:r>
-      <w:r>
-        <w:rPr>
-          <w:rFonts w:cs="DejaVu Sans Condensed" w:ascii="DejaVu Sans Condensed" w:hAnsi="DejaVu Sans Condensed"/>
-          <w:sz w:val="18"/>
-          <w:szCs w:val="18"/>
-          <w:lang w:val="en-US"/>
-        </w:rPr>
-        <w:t>GENIKH</w:t>
-      </w:r>
-      <w:r>
-        <w:rPr>
-          <w:rFonts w:cs="DejaVu Sans Condensed" w:ascii="DejaVu Sans Condensed" w:hAnsi="DejaVu Sans Condensed"/>
-          <w:sz w:val="18"/>
-          <w:szCs w:val="18"/>
-        </w:rPr>
-        <w:t>_</w:t>
-      </w:r>
-      <w:r>
-        <w:rPr>
-          <w:rFonts w:cs="DejaVu Sans Condensed" w:ascii="DejaVu Sans Condensed" w:hAnsi="DejaVu Sans Condensed"/>
-          <w:sz w:val="18"/>
-          <w:szCs w:val="18"/>
-          <w:lang w:val="en-US"/>
-        </w:rPr>
-        <w:t>A</w:t>
-      </w:r>
-      <w:r>
-        <w:rPr>
-          <w:rFonts w:cs="DejaVu Sans Condensed" w:ascii="DejaVu Sans Condensed" w:hAnsi="DejaVu Sans Condensed"/>
-          <w:sz w:val="18"/>
-          <w:szCs w:val="18"/>
-        </w:rPr>
-        <w:t>} {_</w:t>
-      </w:r>
-      <w:r>
-        <w:rPr>
-          <w:rFonts w:cs="DejaVu Sans Condensed" w:ascii="DejaVu Sans Condensed" w:hAnsi="DejaVu Sans Condensed"/>
-          <w:sz w:val="18"/>
-          <w:szCs w:val="18"/>
-          <w:lang w:val="en-US"/>
-        </w:rPr>
-        <w:t>TYPOS</w:t>
-      </w:r>
-      <w:r>
-        <w:rPr>
-          <w:rFonts w:cs="DejaVu Sans Condensed" w:ascii="DejaVu Sans Condensed" w:hAnsi="DejaVu Sans Condensed"/>
-          <w:sz w:val="18"/>
-          <w:szCs w:val="18"/>
-        </w:rPr>
-        <w:t>_</w:t>
-      </w:r>
-      <w:r>
-        <w:rPr>
-          <w:rFonts w:cs="DejaVu Sans Condensed" w:ascii="DejaVu Sans Condensed" w:hAnsi="DejaVu Sans Condensed"/>
-          <w:sz w:val="18"/>
-          <w:szCs w:val="18"/>
-          <w:lang w:val="en-US"/>
-        </w:rPr>
-        <w:t>ERG</w:t>
-      </w:r>
-      <w:r>
-        <w:rPr>
-          <w:rFonts w:cs="DejaVu Sans Condensed" w:ascii="DejaVu Sans Condensed" w:hAnsi="DejaVu Sans Condensed"/>
-          <w:sz w:val="18"/>
-          <w:szCs w:val="18"/>
-        </w:rPr>
-        <w:t>_</w:t>
-      </w:r>
-      <w:r>
-        <w:rPr>
-          <w:rFonts w:cs="DejaVu Sans Condensed" w:ascii="DejaVu Sans Condensed" w:hAnsi="DejaVu Sans Condensed"/>
-          <w:sz w:val="18"/>
-          <w:szCs w:val="18"/>
-          <w:lang w:val="en-US"/>
-        </w:rPr>
-        <w:t>GENIKH</w:t>
-      </w:r>
-      <w:r>
-        <w:rPr>
-          <w:rFonts w:cs="DejaVu Sans Condensed" w:ascii="DejaVu Sans Condensed" w:hAnsi="DejaVu Sans Condensed"/>
-          <w:sz w:val="18"/>
-          <w:szCs w:val="18"/>
-        </w:rPr>
-        <w:t>} στην εκπλήρωση των καθηκόντων τ{_</w:t>
-      </w:r>
-      <w:r>
-        <w:rPr>
-          <w:rFonts w:cs="DejaVu Sans Condensed" w:ascii="DejaVu Sans Condensed" w:hAnsi="DejaVu Sans Condensed"/>
-          <w:sz w:val="18"/>
-          <w:szCs w:val="18"/>
-          <w:lang w:val="en-US"/>
-        </w:rPr>
-        <w:t>GENIKH</w:t>
-      </w:r>
-      <w:r>
-        <w:rPr>
-          <w:rFonts w:cs="DejaVu Sans Condensed" w:ascii="DejaVu Sans Condensed" w:hAnsi="DejaVu Sans Condensed"/>
-          <w:sz w:val="18"/>
-          <w:szCs w:val="18"/>
-        </w:rPr>
-        <w:t>_</w:t>
-      </w:r>
-      <w:r>
-        <w:rPr>
-          <w:rFonts w:cs="DejaVu Sans Condensed" w:ascii="DejaVu Sans Condensed" w:hAnsi="DejaVu Sans Condensed"/>
-          <w:sz w:val="18"/>
-          <w:szCs w:val="18"/>
-          <w:lang w:val="en-US"/>
-        </w:rPr>
-        <w:t>A</w:t>
-      </w:r>
-      <w:r>
-        <w:rPr>
-          <w:rFonts w:cs="DejaVu Sans Condensed" w:ascii="DejaVu Sans Condensed" w:hAnsi="DejaVu Sans Condensed"/>
-          <w:sz w:val="18"/>
-          <w:szCs w:val="18"/>
-        </w:rPr>
-        <w:t>}</w:t>
+        <w:t>απρεπής και υβριστική συμπεριφορά προς την διεύθυνση και το λοιπό προσωπικό ή τους πελάτες {_ERGODOTHS_GENIKH}.</w:t>
       </w:r>
     </w:p>
     <w:p>
@@ -7768,9 +7587,155 @@
           <w:sz w:val="18"/>
           <w:szCs w:val="18"/>
         </w:rPr>
-        <w:t xml:space="preserve">δ) </w:t>
+        <w:t>δ</w:t>
+      </w:r>
+      <w:r>
+        <w:rPr>
+          <w:rFonts w:cs="DejaVu Sans Condensed" w:ascii="DejaVu Sans Condensed" w:hAnsi="DejaVu Sans Condensed"/>
+          <w:sz w:val="18"/>
+          <w:szCs w:val="18"/>
+        </w:rPr>
+        <w:t xml:space="preserve">) </w:t>
         <w:tab/>
-        <w:t>απρεπής και υβριστική συμπεριφορά προς την διεύθυνση και το λοιπό προσωπικό ή τους πελάτες {_ERGODOTHS_GENIKH}.</w:t>
+        <w:t>αντισυμβατική δ</w:t>
+      </w:r>
+      <w:r>
+        <w:rPr>
+          <w:rFonts w:eastAsia="Calibri" w:cs="DejaVu Sans Condensed" w:ascii="DejaVu Sans Condensed" w:hAnsi="DejaVu Sans Condensed" w:eastAsiaTheme="minorHAnsi"/>
+          <w:color w:val="auto"/>
+          <w:kern w:val="0"/>
+          <w:sz w:val="18"/>
+          <w:szCs w:val="18"/>
+          <w:lang w:val="el-GR" w:eastAsia="en-US" w:bidi="ar-SA"/>
+        </w:rPr>
+        <w:t>ό</w:t>
+      </w:r>
+      <w:r>
+        <w:rPr>
+          <w:rFonts w:cs="DejaVu Sans Condensed" w:ascii="DejaVu Sans Condensed" w:hAnsi="DejaVu Sans Condensed"/>
+          <w:sz w:val="18"/>
+          <w:szCs w:val="18"/>
+        </w:rPr>
+        <w:t>λια συμπεριφορά τ{_</w:t>
+      </w:r>
+      <w:r>
+        <w:rPr>
+          <w:rFonts w:cs="DejaVu Sans Condensed" w:ascii="DejaVu Sans Condensed" w:hAnsi="DejaVu Sans Condensed"/>
+          <w:sz w:val="18"/>
+          <w:szCs w:val="18"/>
+          <w:lang w:val="en-US"/>
+        </w:rPr>
+        <w:t>GENIKH</w:t>
+      </w:r>
+      <w:r>
+        <w:rPr>
+          <w:rFonts w:cs="DejaVu Sans Condensed" w:ascii="DejaVu Sans Condensed" w:hAnsi="DejaVu Sans Condensed"/>
+          <w:sz w:val="18"/>
+          <w:szCs w:val="18"/>
+        </w:rPr>
+        <w:t>_</w:t>
+      </w:r>
+      <w:r>
+        <w:rPr>
+          <w:rFonts w:cs="DejaVu Sans Condensed" w:ascii="DejaVu Sans Condensed" w:hAnsi="DejaVu Sans Condensed"/>
+          <w:sz w:val="18"/>
+          <w:szCs w:val="18"/>
+          <w:lang w:val="en-US"/>
+        </w:rPr>
+        <w:t>A</w:t>
+      </w:r>
+      <w:r>
+        <w:rPr>
+          <w:rFonts w:cs="DejaVu Sans Condensed" w:ascii="DejaVu Sans Condensed" w:hAnsi="DejaVu Sans Condensed"/>
+          <w:sz w:val="18"/>
+          <w:szCs w:val="18"/>
+        </w:rPr>
+        <w:t>} {_</w:t>
+      </w:r>
+      <w:r>
+        <w:rPr>
+          <w:rFonts w:cs="DejaVu Sans Condensed" w:ascii="DejaVu Sans Condensed" w:hAnsi="DejaVu Sans Condensed"/>
+          <w:sz w:val="18"/>
+          <w:szCs w:val="18"/>
+          <w:lang w:val="en-US"/>
+        </w:rPr>
+        <w:t>TYPOS</w:t>
+      </w:r>
+      <w:r>
+        <w:rPr>
+          <w:rFonts w:cs="DejaVu Sans Condensed" w:ascii="DejaVu Sans Condensed" w:hAnsi="DejaVu Sans Condensed"/>
+          <w:sz w:val="18"/>
+          <w:szCs w:val="18"/>
+        </w:rPr>
+        <w:t>_</w:t>
+      </w:r>
+      <w:r>
+        <w:rPr>
+          <w:rFonts w:cs="DejaVu Sans Condensed" w:ascii="DejaVu Sans Condensed" w:hAnsi="DejaVu Sans Condensed"/>
+          <w:sz w:val="18"/>
+          <w:szCs w:val="18"/>
+          <w:lang w:val="en-US"/>
+        </w:rPr>
+        <w:t>ERG</w:t>
+      </w:r>
+      <w:r>
+        <w:rPr>
+          <w:rFonts w:cs="DejaVu Sans Condensed" w:ascii="DejaVu Sans Condensed" w:hAnsi="DejaVu Sans Condensed"/>
+          <w:sz w:val="18"/>
+          <w:szCs w:val="18"/>
+        </w:rPr>
+        <w:t>_</w:t>
+      </w:r>
+      <w:r>
+        <w:rPr>
+          <w:rFonts w:cs="DejaVu Sans Condensed" w:ascii="DejaVu Sans Condensed" w:hAnsi="DejaVu Sans Condensed"/>
+          <w:sz w:val="18"/>
+          <w:szCs w:val="18"/>
+          <w:lang w:val="en-US"/>
+        </w:rPr>
+        <w:t>GENIKH</w:t>
+      </w:r>
+      <w:r>
+        <w:rPr>
+          <w:rFonts w:cs="DejaVu Sans Condensed" w:ascii="DejaVu Sans Condensed" w:hAnsi="DejaVu Sans Condensed"/>
+          <w:sz w:val="18"/>
+          <w:szCs w:val="18"/>
+        </w:rPr>
+        <w:t>}, πρόκληση ζημίας σ{_ERGODOTHS_AITIATIKH} ή παράβαση μιας εκ των υποχρεώσεών τ{_</w:t>
+      </w:r>
+      <w:r>
+        <w:rPr>
+          <w:rFonts w:cs="DejaVu Sans Condensed" w:ascii="DejaVu Sans Condensed" w:hAnsi="DejaVu Sans Condensed"/>
+          <w:sz w:val="18"/>
+          <w:szCs w:val="18"/>
+          <w:lang w:val="en-US"/>
+        </w:rPr>
+        <w:t>GENIKH</w:t>
+      </w:r>
+      <w:r>
+        <w:rPr>
+          <w:rFonts w:cs="DejaVu Sans Condensed" w:ascii="DejaVu Sans Condensed" w:hAnsi="DejaVu Sans Condensed"/>
+          <w:sz w:val="18"/>
+          <w:szCs w:val="18"/>
+        </w:rPr>
+        <w:t>_</w:t>
+      </w:r>
+      <w:r>
+        <w:rPr>
+          <w:rFonts w:cs="DejaVu Sans Condensed" w:ascii="DejaVu Sans Condensed" w:hAnsi="DejaVu Sans Condensed"/>
+          <w:sz w:val="18"/>
+          <w:szCs w:val="18"/>
+          <w:lang w:val="en-US"/>
+        </w:rPr>
+        <w:t>A</w:t>
+      </w:r>
+      <w:r>
+        <w:rPr>
+          <w:rFonts w:cs="DejaVu Sans Condensed" w:ascii="DejaVu Sans Condensed" w:hAnsi="DejaVu Sans Condensed"/>
+          <w:sz w:val="18"/>
+          <w:szCs w:val="18"/>
+        </w:rPr>
+        <w:t>} που αναφέρονται στους όρους  της παρούσας συμβάσεως.</w:t>
       </w:r>
     </w:p>
     <w:p>
@@ -7790,189 +7755,15 @@
           <w:sz w:val="18"/>
           <w:szCs w:val="18"/>
         </w:rPr>
-        <w:t xml:space="preserve">ε) </w:t>
-        <w:tab/>
-        <w:t>απειλούμενη οικονομική καταστροφή {_ERGODOTHS_GENIKH}.</w:t>
-      </w:r>
-    </w:p>
-    <w:p>
-      <w:pPr>
-        <w:pStyle w:val="Normal"/>
-        <w:ind w:left="-709" w:right="-1186" w:hanging="0"/>
-        <w:jc w:val="both"/>
-        <w:rPr>
-          <w:rFonts w:ascii="DejaVu Sans Condensed" w:hAnsi="DejaVu Sans Condensed" w:cs="DejaVu Sans Condensed"/>
-          <w:sz w:val="18"/>
-          <w:szCs w:val="18"/>
-        </w:rPr>
-      </w:pPr>
-      <w:r>
-        <w:rPr>
-          <w:rFonts w:cs="DejaVu Sans Condensed" w:ascii="DejaVu Sans Condensed" w:hAnsi="DejaVu Sans Condensed"/>
-          <w:sz w:val="18"/>
-          <w:szCs w:val="18"/>
-        </w:rPr>
-        <w:t xml:space="preserve">στ) </w:t>
-        <w:tab/>
-        <w:t>αντισυμβατική δ</w:t>
-      </w:r>
-      <w:r>
-        <w:rPr>
-          <w:rFonts w:eastAsia="Calibri" w:cs="DejaVu Sans Condensed" w:ascii="DejaVu Sans Condensed" w:hAnsi="DejaVu Sans Condensed" w:eastAsiaTheme="minorHAnsi"/>
-          <w:color w:val="auto"/>
-          <w:kern w:val="0"/>
-          <w:sz w:val="18"/>
-          <w:szCs w:val="18"/>
-          <w:lang w:val="el-GR" w:eastAsia="en-US" w:bidi="ar-SA"/>
-        </w:rPr>
-        <w:t>ό</w:t>
-      </w:r>
-      <w:r>
-        <w:rPr>
-          <w:rFonts w:cs="DejaVu Sans Condensed" w:ascii="DejaVu Sans Condensed" w:hAnsi="DejaVu Sans Condensed"/>
-          <w:sz w:val="18"/>
-          <w:szCs w:val="18"/>
-        </w:rPr>
-        <w:t>λια συμπεριφορά τ{_</w:t>
-      </w:r>
-      <w:r>
-        <w:rPr>
-          <w:rFonts w:cs="DejaVu Sans Condensed" w:ascii="DejaVu Sans Condensed" w:hAnsi="DejaVu Sans Condensed"/>
-          <w:sz w:val="18"/>
-          <w:szCs w:val="18"/>
-          <w:lang w:val="en-US"/>
-        </w:rPr>
-        <w:t>GENIKH</w:t>
-      </w:r>
-      <w:r>
-        <w:rPr>
-          <w:rFonts w:cs="DejaVu Sans Condensed" w:ascii="DejaVu Sans Condensed" w:hAnsi="DejaVu Sans Condensed"/>
-          <w:sz w:val="18"/>
-          <w:szCs w:val="18"/>
-        </w:rPr>
-        <w:t>_</w:t>
-      </w:r>
-      <w:r>
-        <w:rPr>
-          <w:rFonts w:cs="DejaVu Sans Condensed" w:ascii="DejaVu Sans Condensed" w:hAnsi="DejaVu Sans Condensed"/>
-          <w:sz w:val="18"/>
-          <w:szCs w:val="18"/>
-          <w:lang w:val="en-US"/>
-        </w:rPr>
-        <w:t>A</w:t>
-      </w:r>
-      <w:r>
-        <w:rPr>
-          <w:rFonts w:cs="DejaVu Sans Condensed" w:ascii="DejaVu Sans Condensed" w:hAnsi="DejaVu Sans Condensed"/>
-          <w:sz w:val="18"/>
-          <w:szCs w:val="18"/>
-        </w:rPr>
-        <w:t>} {_</w:t>
-      </w:r>
-      <w:r>
-        <w:rPr>
-          <w:rFonts w:cs="DejaVu Sans Condensed" w:ascii="DejaVu Sans Condensed" w:hAnsi="DejaVu Sans Condensed"/>
-          <w:sz w:val="18"/>
-          <w:szCs w:val="18"/>
-          <w:lang w:val="en-US"/>
-        </w:rPr>
-        <w:t>TYPOS</w:t>
-      </w:r>
-      <w:r>
-        <w:rPr>
-          <w:rFonts w:cs="DejaVu Sans Condensed" w:ascii="DejaVu Sans Condensed" w:hAnsi="DejaVu Sans Condensed"/>
-          <w:sz w:val="18"/>
-          <w:szCs w:val="18"/>
-        </w:rPr>
-        <w:t>_</w:t>
-      </w:r>
-      <w:r>
-        <w:rPr>
-          <w:rFonts w:cs="DejaVu Sans Condensed" w:ascii="DejaVu Sans Condensed" w:hAnsi="DejaVu Sans Condensed"/>
-          <w:sz w:val="18"/>
-          <w:szCs w:val="18"/>
-          <w:lang w:val="en-US"/>
-        </w:rPr>
-        <w:t>ERG</w:t>
-      </w:r>
-      <w:r>
-        <w:rPr>
-          <w:rFonts w:cs="DejaVu Sans Condensed" w:ascii="DejaVu Sans Condensed" w:hAnsi="DejaVu Sans Condensed"/>
-          <w:sz w:val="18"/>
-          <w:szCs w:val="18"/>
-        </w:rPr>
-        <w:t>_</w:t>
-      </w:r>
-      <w:r>
-        <w:rPr>
-          <w:rFonts w:cs="DejaVu Sans Condensed" w:ascii="DejaVu Sans Condensed" w:hAnsi="DejaVu Sans Condensed"/>
-          <w:sz w:val="18"/>
-          <w:szCs w:val="18"/>
-          <w:lang w:val="en-US"/>
-        </w:rPr>
-        <w:t>GENIKH</w:t>
-      </w:r>
-      <w:r>
-        <w:rPr>
-          <w:rFonts w:cs="DejaVu Sans Condensed" w:ascii="DejaVu Sans Condensed" w:hAnsi="DejaVu Sans Condensed"/>
-          <w:sz w:val="18"/>
-          <w:szCs w:val="18"/>
-        </w:rPr>
-        <w:t>}, πρόκληση ζημίας σ{_ERGODOTHS_AITIATIKH} ή παράβαση μιας εκ των υποχρεώσεών τ{_</w:t>
-      </w:r>
-      <w:r>
-        <w:rPr>
-          <w:rFonts w:cs="DejaVu Sans Condensed" w:ascii="DejaVu Sans Condensed" w:hAnsi="DejaVu Sans Condensed"/>
-          <w:sz w:val="18"/>
-          <w:szCs w:val="18"/>
-          <w:lang w:val="en-US"/>
-        </w:rPr>
-        <w:t>GENIKH</w:t>
-      </w:r>
-      <w:r>
-        <w:rPr>
-          <w:rFonts w:cs="DejaVu Sans Condensed" w:ascii="DejaVu Sans Condensed" w:hAnsi="DejaVu Sans Condensed"/>
-          <w:sz w:val="18"/>
-          <w:szCs w:val="18"/>
-        </w:rPr>
-        <w:t>_</w:t>
-      </w:r>
-      <w:r>
-        <w:rPr>
-          <w:rFonts w:cs="DejaVu Sans Condensed" w:ascii="DejaVu Sans Condensed" w:hAnsi="DejaVu Sans Condensed"/>
-          <w:sz w:val="18"/>
-          <w:szCs w:val="18"/>
-          <w:lang w:val="en-US"/>
-        </w:rPr>
-        <w:t>A</w:t>
-      </w:r>
-      <w:r>
-        <w:rPr>
-          <w:rFonts w:cs="DejaVu Sans Condensed" w:ascii="DejaVu Sans Condensed" w:hAnsi="DejaVu Sans Condensed"/>
-          <w:sz w:val="18"/>
-          <w:szCs w:val="18"/>
-        </w:rPr>
-        <w:t>} που αναφέρονται στους όρους  της παρούσας συμβάσεως.</w:t>
-      </w:r>
-    </w:p>
-    <w:p>
-      <w:pPr>
-        <w:pStyle w:val="Normal"/>
-        <w:ind w:left="-709" w:right="-1186" w:hanging="0"/>
-        <w:jc w:val="both"/>
-        <w:rPr>
-          <w:rFonts w:ascii="DejaVu Sans Condensed" w:hAnsi="DejaVu Sans Condensed" w:cs="DejaVu Sans Condensed"/>
-          <w:sz w:val="18"/>
-          <w:szCs w:val="18"/>
-        </w:rPr>
-      </w:pPr>
-      <w:r>
-        <w:rPr>
-          <w:rFonts w:cs="DejaVu Sans Condensed" w:ascii="DejaVu Sans Condensed" w:hAnsi="DejaVu Sans Condensed"/>
-          <w:sz w:val="18"/>
-          <w:szCs w:val="18"/>
-        </w:rPr>
-        <w:t>ζ)</w:t>
+        <w:t>ε</w:t>
+      </w:r>
+      <w:r>
+        <w:rPr>
+          <w:rFonts w:cs="DejaVu Sans Condensed" w:ascii="DejaVu Sans Condensed" w:hAnsi="DejaVu Sans Condensed"/>
+          <w:sz w:val="18"/>
+          <w:szCs w:val="18"/>
+        </w:rPr>
+        <w:t>)</w:t>
         <w:tab/>
         <w:t>κατ</w:t>
       </w:r>
@@ -10927,89 +10718,17 @@
           <w:sz w:val="18"/>
           <w:szCs w:val="18"/>
         </w:rPr>
-        <w:t>{_</w:t>
-      </w:r>
-      <w:r>
-        <w:rPr>
-          <w:rFonts w:cs="DejaVu Sans Condensed" w:ascii="DejaVu Sans Condensed" w:hAnsi="DejaVu Sans Condensed"/>
-          <w:sz w:val="18"/>
-          <w:szCs w:val="18"/>
-        </w:rPr>
-        <w:t>FIELD</w:t>
-      </w:r>
-      <w:r>
-        <w:rPr>
-          <w:rFonts w:cs="DejaVu Sans Condensed" w:ascii="DejaVu Sans Condensed" w:hAnsi="DejaVu Sans Condensed"/>
-          <w:sz w:val="18"/>
-          <w:szCs w:val="18"/>
-        </w:rPr>
-        <w:t>_</w:t>
-      </w:r>
-      <w:r>
-        <w:rPr>
-          <w:rFonts w:cs="DejaVu Sans Condensed" w:ascii="DejaVu Sans Condensed" w:hAnsi="DejaVu Sans Condensed"/>
-          <w:sz w:val="18"/>
-          <w:szCs w:val="18"/>
-        </w:rPr>
-        <w:t>0010</w:t>
-      </w:r>
-      <w:r>
-        <w:rPr>
-          <w:rFonts w:cs="DejaVu Sans Condensed" w:ascii="DejaVu Sans Condensed" w:hAnsi="DejaVu Sans Condensed"/>
-          <w:sz w:val="18"/>
-          <w:szCs w:val="18"/>
-        </w:rPr>
-        <w:t>}</w:t>
-      </w:r>
-      <w:r>
-        <w:rPr>
-          <w:rFonts w:cs="DejaVu Sans Condensed" w:ascii="DejaVu Sans Condensed" w:hAnsi="DejaVu Sans Condensed"/>
-          <w:b/>
-          <w:bCs/>
-          <w:sz w:val="18"/>
-          <w:szCs w:val="18"/>
-        </w:rPr>
-        <w:t>{_</w:t>
-      </w:r>
-      <w:r>
-        <w:rPr>
-          <w:rFonts w:cs="DejaVu Sans Condensed" w:ascii="DejaVu Sans Condensed" w:hAnsi="DejaVu Sans Condensed"/>
-          <w:b/>
-          <w:bCs/>
-          <w:sz w:val="18"/>
-          <w:szCs w:val="18"/>
-        </w:rPr>
-        <w:t>FIELD</w:t>
-      </w:r>
-      <w:r>
-        <w:rPr>
-          <w:rFonts w:cs="DejaVu Sans Condensed" w:ascii="DejaVu Sans Condensed" w:hAnsi="DejaVu Sans Condensed"/>
-          <w:b/>
-          <w:bCs/>
-          <w:sz w:val="18"/>
-          <w:szCs w:val="18"/>
-        </w:rPr>
-        <w:t>_</w:t>
-      </w:r>
-      <w:r>
-        <w:rPr>
-          <w:rFonts w:cs="DejaVu Sans Condensed" w:ascii="DejaVu Sans Condensed" w:hAnsi="DejaVu Sans Condensed"/>
-          <w:b/>
-          <w:bCs/>
-          <w:sz w:val="18"/>
-          <w:szCs w:val="18"/>
-        </w:rPr>
-        <w:t>0011</w:t>
-      </w:r>
-      <w:r>
-        <w:rPr>
-          <w:rFonts w:cs="DejaVu Sans Condensed" w:ascii="DejaVu Sans Condensed" w:hAnsi="DejaVu Sans Condensed"/>
-          <w:b/>
-          <w:bCs/>
-          <w:sz w:val="18"/>
-          <w:szCs w:val="18"/>
-        </w:rPr>
-        <w:t>}</w:t>
+        <w:t>{_FIELD_0010}</w:t>
+      </w:r>
+      <w:r>
+        <w:rPr>
+          <w:rFonts w:cs="DejaVu Sans Condensed" w:ascii="DejaVu Sans Condensed" w:hAnsi="DejaVu Sans Condensed"/>
+          <w:b/>
+          <w:bCs/>
+          <w:sz w:val="18"/>
+          <w:szCs w:val="18"/>
+        </w:rPr>
+        <w:t>{_FIELD_0011}</w:t>
       </w:r>
     </w:p>
     <w:p>
@@ -11095,39 +10814,7 @@
           <w:sz w:val="18"/>
           <w:szCs w:val="18"/>
         </w:rPr>
-        <w:t>{_</w:t>
-      </w:r>
-      <w:r>
-        <w:rPr>
-          <w:rFonts w:cs="DejaVu Sans Condensed" w:ascii="DejaVu Sans Condensed" w:hAnsi="DejaVu Sans Condensed"/>
-          <w:sz w:val="18"/>
-          <w:szCs w:val="18"/>
-        </w:rPr>
-        <w:t>FIELD</w:t>
-      </w:r>
-      <w:r>
-        <w:rPr>
-          <w:rFonts w:cs="DejaVu Sans Condensed" w:ascii="DejaVu Sans Condensed" w:hAnsi="DejaVu Sans Condensed"/>
-          <w:sz w:val="18"/>
-          <w:szCs w:val="18"/>
-        </w:rPr>
-        <w:t>_00</w:t>
-      </w:r>
-      <w:r>
-        <w:rPr>
-          <w:rFonts w:cs="DejaVu Sans Condensed" w:ascii="DejaVu Sans Condensed" w:hAnsi="DejaVu Sans Condensed"/>
-          <w:sz w:val="18"/>
-          <w:szCs w:val="18"/>
-        </w:rPr>
-        <w:t>12</w:t>
-      </w:r>
-      <w:r>
-        <w:rPr>
-          <w:rFonts w:cs="DejaVu Sans Condensed" w:ascii="DejaVu Sans Condensed" w:hAnsi="DejaVu Sans Condensed"/>
-          <w:sz w:val="18"/>
-          <w:szCs w:val="18"/>
-        </w:rPr>
-        <w:t>}</w:t>
+        <w:t>{_FIELD_0012}</w:t>
       </w:r>
     </w:p>
     <w:p>
@@ -16625,7 +16312,7 @@
               <w:color w:val="808080"/>
               <w:lang w:val="el-GR" w:eastAsia="en-US" w:bidi="ar-SA"/>
             </w:rPr>
-            <w:t>10</w:t>
+            <w:t>9</w:t>
           </w:r>
           <w:r>
             <w:rPr>
@@ -16691,7 +16378,7 @@
               <w:color w:val="808080"/>
               <w:lang w:val="el-GR" w:eastAsia="en-US" w:bidi="ar-SA"/>
             </w:rPr>
-            <w:t>10</w:t>
+            <w:t>9</w:t>
           </w:r>
           <w:r>
             <w:rPr>
@@ -17056,7 +16743,7 @@
               <w:color w:val="808080"/>
               <w:lang w:val="el-GR" w:eastAsia="en-US" w:bidi="ar-SA"/>
             </w:rPr>
-            <w:t>10</w:t>
+            <w:t>9</w:t>
           </w:r>
           <w:r>
             <w:rPr>
@@ -17122,7 +16809,7 @@
               <w:color w:val="808080"/>
               <w:lang w:val="el-GR" w:eastAsia="en-US" w:bidi="ar-SA"/>
             </w:rPr>
-            <w:t>10</w:t>
+            <w:t>9</w:t>
           </w:r>
           <w:r>
             <w:rPr>

</xml_diff>